<commit_message>
Initial commit: PromiseWatch dam evidence pipeline
</commit_message>
<xml_diff>
--- a/PromiseWatch_Written_Summary.docx
+++ b/PromiseWatch_Written_Summary.docx
@@ -1,144 +1,307 @@
 
 <file path=word/document.xml><?xml version="1.0" encoding="utf-8"?>
-<w:document xmlns:wpc="http://schemas.microsoft.com/office/word/2010/wordprocessingCanvas" xmlns:cx="http://schemas.microsoft.com/office/drawing/2014/chartex" xmlns:cx1="http://schemas.microsoft.com/office/drawing/2015/9/8/chartex" xmlns:cx2="http://schemas.microsoft.com/office/drawing/2015/10/21/chartex" xmlns:cx3="http://schemas.microsoft.com/office/drawing/2016/5/9/chartex" xmlns:cx4="http://schemas.microsoft.com/office/drawing/2016/5/10/chartex" xmlns:cx5="http://schemas.microsoft.com/office/drawing/2016/5/11/chartex" xmlns:cx6="http://schemas.microsoft.com/office/drawing/2016/5/12/chartex" xmlns:cx7="http://schemas.microsoft.com/office/drawing/2016/5/13/chartex" xmlns:cx8="http://schemas.microsoft.com/office/drawing/2016/5/14/chartex" xmlns:mc="http://schemas.openxmlformats.org/markup-compatibility/2006" xmlns:aink="http://schemas.microsoft.com/office/drawing/2016/ink" xmlns:am3d="http://schemas.microsoft.com/office/drawing/2017/model3d" xmlns:o="urn:schemas-microsoft-com:office:office" xmlns:oel="http://schemas.microsoft.com/office/2019/extlst" xmlns:r="http://schemas.openxmlformats.org/officeDocument/2006/relationships" xmlns:m="http://schemas.openxmlformats.org/officeDocument/2006/math" xmlns:v="urn:schemas-microsoft-com:vml" xmlns:wp14="http://schemas.microsoft.com/office/word/2010/wordprocessingDrawing" xmlns:wp="http://schemas.openxmlformats.org/drawingml/2006/wordprocessingDrawing" xmlns:w10="urn:schemas-microsoft-com:office:word" xmlns:w="http://schemas.openxmlformats.org/wordprocessingml/2006/main" xmlns:w14="http://schemas.microsoft.com/office/word/2010/wordml" xmlns:w15="http://schemas.microsoft.com/office/word/2012/wordml" xmlns:w16cei="http://schemas.microsoft.com/office/word/2026/wordml/cei" xmlns:w16cex="http://schemas.microsoft.com/office/word/2018/wordml/cex" xmlns:w16cid="http://schemas.microsoft.com/office/word/2016/wordml/cid" xmlns:w16="http://schemas.microsoft.com/office/word/2018/wordml" xmlns:w16du="http://schemas.microsoft.com/office/word/2023/wordml/word16du" xmlns:w16sdtdh="http://schemas.microsoft.com/office/word/2020/wordml/sdtdatahash" xmlns:w16sdtfl="http://schemas.microsoft.com/office/word/2024/wordml/sdtformatlock" xmlns:w16se="http://schemas.microsoft.com/office/word/2015/wordml/symex" xmlns:wpg="http://schemas.microsoft.com/office/word/2010/wordprocessingGroup" xmlns:wpi="http://schemas.microsoft.com/office/word/2010/wordprocessingInk" xmlns:wne="http://schemas.microsoft.com/office/word/2006/wordml" xmlns:wps="http://schemas.microsoft.com/office/word/2010/wordprocessingShape" mc:Ignorable="w14 w15 w16se w16cid w16 w16cex w16sdtdh w16sdtfl w16du wp14">
+<w:document xmlns:wpc="http://schemas.microsoft.com/office/word/2010/wordprocessingCanvas" xmlns:cx="http://schemas.microsoft.com/office/drawing/2014/chartex" xmlns:cx1="http://schemas.microsoft.com/office/drawing/2015/9/8/chartex" xmlns:cx2="http://schemas.microsoft.com/office/drawing/2015/10/21/chartex" xmlns:cx3="http://schemas.microsoft.com/office/drawing/2016/5/9/chartex" xmlns:cx4="http://schemas.microsoft.com/office/drawing/2016/5/10/chartex" xmlns:cx5="http://schemas.microsoft.com/office/drawing/2016/5/11/chartex" xmlns:cx6="http://schemas.microsoft.com/office/drawing/2016/5/12/chartex" xmlns:cx7="http://schemas.microsoft.com/office/drawing/2016/5/13/chartex" xmlns:cx8="http://schemas.microsoft.com/office/drawing/2016/5/14/chartex" xmlns:mc="http://schemas.openxmlformats.org/markup-compatibility/2006" xmlns:aink="http://schemas.microsoft.com/office/drawing/2016/ink" xmlns:am3d="http://schemas.microsoft.com/office/drawing/2017/model3d" xmlns:o="urn:schemas-microsoft-com:office:office" xmlns:oel="http://schemas.microsoft.com/office/2019/extlst" xmlns:r="http://schemas.openxmlformats.org/officeDocument/2006/relationships" xmlns:m="http://schemas.openxmlformats.org/officeDocument/2006/math" xmlns:v="urn:schemas-microsoft-com:vml" xmlns:wp14="http://schemas.microsoft.com/office/word/2010/wordprocessingDrawing" xmlns:wp="http://schemas.openxmlformats.org/drawingml/2006/wordprocessingDrawing" xmlns:w10="urn:schemas-microsoft-com:office:word" xmlns:w="http://schemas.openxmlformats.org/wordprocessingml/2006/main" xmlns:w14="http://schemas.microsoft.com/office/word/2010/wordml" xmlns:w15="http://schemas.microsoft.com/office/word/2012/wordml" xmlns:w16cex="http://schemas.microsoft.com/office/word/2018/wordml/cex" xmlns:w16cid="http://schemas.microsoft.com/office/word/2016/wordml/cid" xmlns:w16="http://schemas.microsoft.com/office/word/2018/wordml" xmlns:w16du="http://schemas.microsoft.com/office/word/2023/wordml/word16du" xmlns:w16sdtdh="http://schemas.microsoft.com/office/word/2020/wordml/sdtdatahash" xmlns:w16sdtfl="http://schemas.microsoft.com/office/word/2024/wordml/sdtformatlock" xmlns:w16se="http://schemas.microsoft.com/office/word/2015/wordml/symex" xmlns:wpg="http://schemas.microsoft.com/office/word/2010/wordprocessingGroup" xmlns:wpi="http://schemas.microsoft.com/office/word/2010/wordprocessingInk" xmlns:wne="http://schemas.microsoft.com/office/word/2006/wordml" xmlns:wps="http://schemas.microsoft.com/office/word/2010/wordprocessingShape" mc:Ignorable="w14 w15 w16se w16cid w16 w16cex w16sdtdh w16sdtfl w16du wp14">
   <w:body>
     <w:p>
       <w:pPr>
-        <w:rPr>
+        <w:jc w:val="center"/>
+        <w:rPr>
+          <w:rFonts w:ascii="Calibri" w:hAnsi="Calibri" w:cs="Calibri"/>
           <w:b/>
           <w:bCs/>
+          <w:sz w:val="40"/>
+          <w:szCs w:val="40"/>
         </w:rPr>
       </w:pPr>
       <w:proofErr w:type="spellStart"/>
       <w:r>
         <w:rPr>
+          <w:rFonts w:ascii="Calibri" w:hAnsi="Calibri" w:cs="Calibri"/>
           <w:b/>
           <w:bCs/>
+          <w:sz w:val="40"/>
+          <w:szCs w:val="40"/>
         </w:rPr>
         <w:t>PromiseWatch</w:t>
       </w:r>
       <w:proofErr w:type="spellEnd"/>
       <w:r>
         <w:rPr>
+          <w:rFonts w:ascii="Calibri" w:hAnsi="Calibri" w:cs="Calibri"/>
           <w:b/>
           <w:bCs/>
-        </w:rPr>
-        <w:t xml:space="preserve"> — Written Summary</w:t>
-      </w:r>
-    </w:p>
-    <w:p>
-      <w:pPr>
-        <w:rPr>
+          <w:sz w:val="40"/>
+          <w:szCs w:val="40"/>
+        </w:rPr>
+        <w:t>-</w:t>
+      </w:r>
+      <w:r>
+        <w:rPr>
+          <w:rFonts w:ascii="Calibri" w:hAnsi="Calibri" w:cs="Calibri"/>
           <w:b/>
           <w:bCs/>
-        </w:rPr>
-      </w:pPr>
-      <w:r>
-        <w:rPr>
+          <w:sz w:val="40"/>
+          <w:szCs w:val="40"/>
+        </w:rPr>
+        <w:t>Written Summary</w:t>
+      </w:r>
+    </w:p>
+    <w:p>
+      <w:pPr>
+        <w:jc w:val="center"/>
+        <w:rPr>
+          <w:rFonts w:ascii="Calibri" w:hAnsi="Calibri" w:cs="Calibri"/>
           <w:b/>
           <w:bCs/>
-        </w:rPr>
-        <w:t>Track</w:t>
-      </w:r>
-    </w:p>
-    <w:p>
-      <w:r>
-        <w:t>Transparency &amp; Accountability</w:t>
-      </w:r>
-    </w:p>
-    <w:p>
-      <w:pPr>
-        <w:rPr>
+          <w:sz w:val="28"/>
+          <w:szCs w:val="28"/>
+        </w:rPr>
+      </w:pPr>
+      <w:r>
+        <w:rPr>
+          <w:rFonts w:ascii="Calibri" w:hAnsi="Calibri" w:cs="Calibri"/>
           <w:b/>
           <w:bCs/>
-        </w:rPr>
-      </w:pPr>
-      <w:r>
-        <w:rPr>
+          <w:sz w:val="28"/>
+          <w:szCs w:val="28"/>
+        </w:rPr>
+        <w:t xml:space="preserve">Benson M. </w:t>
+      </w:r>
+      <w:proofErr w:type="spellStart"/>
+      <w:r>
+        <w:rPr>
+          <w:rFonts w:ascii="Calibri" w:hAnsi="Calibri" w:cs="Calibri"/>
           <w:b/>
           <w:bCs/>
-        </w:rPr>
-        <w:t>The problem</w:t>
-      </w:r>
-    </w:p>
-    <w:p>
-      <w:r>
-        <w:t xml:space="preserve">Kenyan politicians routinely announce major infrastructure projects — dams, roads, stadiums — with promised completion dates. Years later, many </w:t>
-      </w:r>
-      <w:proofErr w:type="gramStart"/>
-      <w:r>
-        <w:t>have stalled</w:t>
-      </w:r>
-      <w:proofErr w:type="gramEnd"/>
-      <w:r>
-        <w:t xml:space="preserve">, been quietly cancelled, or never broken ground, while the original announcement remains the only public record most citizens can find. Verifying delivery today requires either trusting official reporting or physically visiting the site — </w:t>
-      </w:r>
-      <w:proofErr w:type="gramStart"/>
-      <w:r>
-        <w:t>neither</w:t>
-      </w:r>
-      <w:proofErr w:type="gramEnd"/>
-      <w:r>
-        <w:t xml:space="preserve"> is accessible at scale to an ordinary citizen or journalist.</w:t>
-      </w:r>
-    </w:p>
-    <w:p>
-      <w:pPr>
-        <w:rPr>
+          <w:sz w:val="28"/>
+          <w:szCs w:val="28"/>
+        </w:rPr>
+        <w:t>Gachaga</w:t>
+      </w:r>
+      <w:proofErr w:type="spellEnd"/>
+    </w:p>
+    <w:p>
+      <w:pPr>
+        <w:rPr>
+          <w:rFonts w:ascii="Calibri" w:hAnsi="Calibri" w:cs="Calibri"/>
           <w:b/>
           <w:bCs/>
         </w:rPr>
       </w:pPr>
       <w:r>
         <w:rPr>
+          <w:rFonts w:ascii="Calibri" w:hAnsi="Calibri" w:cs="Calibri"/>
           <w:b/>
           <w:bCs/>
         </w:rPr>
-        <w:t>Who it's for</w:t>
-      </w:r>
-    </w:p>
-    <w:p>
-      <w:r>
-        <w:t>Citizens, journalists, and civil society organizations who want to check a specific infrastructure promise against independent evidence, without needing GIS expertise or site access themselves.</w:t>
-      </w:r>
-    </w:p>
-    <w:p>
-      <w:pPr>
-        <w:rPr>
+        <w:t>Track</w:t>
+      </w:r>
+    </w:p>
+    <w:p>
+      <w:pPr>
+        <w:rPr>
+          <w:rFonts w:ascii="Calibri" w:hAnsi="Calibri" w:cs="Calibri"/>
+        </w:rPr>
+      </w:pPr>
+      <w:r>
+        <w:rPr>
+          <w:rFonts w:ascii="Calibri" w:hAnsi="Calibri" w:cs="Calibri"/>
+        </w:rPr>
+        <w:t>Transparency &amp; Accountability</w:t>
+      </w:r>
+    </w:p>
+    <w:p>
+      <w:pPr>
+        <w:rPr>
+          <w:rFonts w:ascii="Calibri" w:hAnsi="Calibri" w:cs="Calibri"/>
           <w:b/>
           <w:bCs/>
         </w:rPr>
       </w:pPr>
       <w:r>
         <w:rPr>
+          <w:rFonts w:ascii="Calibri" w:hAnsi="Calibri" w:cs="Calibri"/>
           <w:b/>
           <w:bCs/>
         </w:rPr>
-        <w:t>What we built</w:t>
-      </w:r>
-    </w:p>
-    <w:p>
-      <w:proofErr w:type="spellStart"/>
-      <w:r>
-        <w:t>PromiseWatch</w:t>
-      </w:r>
-      <w:proofErr w:type="spellEnd"/>
-      <w:r>
-        <w:t xml:space="preserve"> is a proof-of-concept evidence pipeline that checks claimed dam projects against free, public Sentinel-2 satellite imagery, following a four-step framework: </w:t>
-      </w:r>
-      <w:r>
-        <w:rPr>
+        <w:t>The problem</w:t>
+      </w:r>
+    </w:p>
+    <w:p>
+      <w:pPr>
+        <w:spacing w:after="0" w:line="240" w:lineRule="auto"/>
+        <w:jc w:val="both"/>
+        <w:rPr>
+          <w:rFonts w:ascii="Calibri" w:hAnsi="Calibri" w:cs="Calibri"/>
+        </w:rPr>
+      </w:pPr>
+      <w:r>
+        <w:rPr>
+          <w:rFonts w:ascii="Calibri" w:hAnsi="Calibri" w:cs="Calibri"/>
+        </w:rPr>
+        <w:t>Public officials announce major infrastructure project</w:t>
+      </w:r>
+      <w:r>
+        <w:rPr>
+          <w:rFonts w:ascii="Calibri" w:hAnsi="Calibri" w:cs="Calibri"/>
+        </w:rPr>
+        <w:t xml:space="preserve">s; </w:t>
+      </w:r>
+      <w:r>
+        <w:rPr>
+          <w:rFonts w:ascii="Calibri" w:hAnsi="Calibri" w:cs="Calibri"/>
+        </w:rPr>
+        <w:t>dams, roads and stadium</w:t>
+      </w:r>
+      <w:r>
+        <w:rPr>
+          <w:rFonts w:ascii="Calibri" w:hAnsi="Calibri" w:cs="Calibri"/>
+        </w:rPr>
+        <w:t xml:space="preserve">s, </w:t>
+      </w:r>
+      <w:r>
+        <w:rPr>
+          <w:rFonts w:ascii="Calibri" w:hAnsi="Calibri" w:cs="Calibri"/>
+        </w:rPr>
+        <w:t xml:space="preserve">with promised completion dates. Years later, some </w:t>
+      </w:r>
+      <w:proofErr w:type="gramStart"/>
+      <w:r>
+        <w:rPr>
+          <w:rFonts w:ascii="Calibri" w:hAnsi="Calibri" w:cs="Calibri"/>
+        </w:rPr>
+        <w:t>have stalled</w:t>
+      </w:r>
+      <w:proofErr w:type="gramEnd"/>
+      <w:r>
+        <w:rPr>
+          <w:rFonts w:ascii="Calibri" w:hAnsi="Calibri" w:cs="Calibri"/>
+        </w:rPr>
+        <w:t>, been cancelled, or never broken ground</w:t>
+      </w:r>
+      <w:r>
+        <w:rPr>
+          <w:rFonts w:ascii="Calibri" w:hAnsi="Calibri" w:cs="Calibri"/>
+        </w:rPr>
+        <w:t>, while the original announcement remains the only public record most citizens can find. Verifying delivery today requires either trusting official reporting or physically visiting the site</w:t>
+      </w:r>
+      <w:r>
+        <w:rPr>
+          <w:rFonts w:ascii="Calibri" w:hAnsi="Calibri" w:cs="Calibri"/>
+        </w:rPr>
+        <w:t xml:space="preserve">, </w:t>
+      </w:r>
+      <w:r>
+        <w:rPr>
+          <w:rFonts w:ascii="Calibri" w:hAnsi="Calibri" w:cs="Calibri"/>
+        </w:rPr>
+        <w:t>neither is accessible at scale to an ordinary citizen or journalist.</w:t>
+      </w:r>
+    </w:p>
+    <w:p>
+      <w:pPr>
+        <w:rPr>
+          <w:rFonts w:ascii="Calibri" w:hAnsi="Calibri" w:cs="Calibri"/>
           <w:b/>
           <w:bCs/>
         </w:rPr>
+      </w:pPr>
+      <w:r>
+        <w:rPr>
+          <w:rFonts w:ascii="Calibri" w:hAnsi="Calibri" w:cs="Calibri"/>
+          <w:b/>
+          <w:bCs/>
+        </w:rPr>
+        <w:t>Who it's for</w:t>
+      </w:r>
+    </w:p>
+    <w:p>
+      <w:pPr>
+        <w:spacing w:after="0" w:line="240" w:lineRule="auto"/>
+        <w:jc w:val="both"/>
+        <w:rPr>
+          <w:rFonts w:ascii="Calibri" w:hAnsi="Calibri" w:cs="Calibri"/>
+        </w:rPr>
+      </w:pPr>
+      <w:r>
+        <w:rPr>
+          <w:rFonts w:ascii="Calibri" w:hAnsi="Calibri" w:cs="Calibri"/>
+        </w:rPr>
+        <w:t>Citizens, journalists, and civil society organizations who want to check a specific infrastructure promise against independent evidence, without needing GIS expertise or site access themselves.</w:t>
+      </w:r>
+    </w:p>
+    <w:p>
+      <w:pPr>
+        <w:rPr>
+          <w:rFonts w:ascii="Calibri" w:hAnsi="Calibri" w:cs="Calibri"/>
+          <w:b/>
+          <w:bCs/>
+        </w:rPr>
+      </w:pPr>
+      <w:r>
+        <w:rPr>
+          <w:rFonts w:ascii="Calibri" w:hAnsi="Calibri" w:cs="Calibri"/>
+          <w:b/>
+          <w:bCs/>
+        </w:rPr>
+        <w:t>What we built</w:t>
+      </w:r>
+    </w:p>
+    <w:p>
+      <w:pPr>
+        <w:spacing w:after="0" w:line="240" w:lineRule="auto"/>
+        <w:jc w:val="both"/>
+        <w:rPr>
+          <w:rFonts w:ascii="Calibri" w:hAnsi="Calibri" w:cs="Calibri"/>
+        </w:rPr>
+      </w:pPr>
+      <w:proofErr w:type="spellStart"/>
+      <w:r>
+        <w:rPr>
+          <w:rFonts w:ascii="Calibri" w:hAnsi="Calibri" w:cs="Calibri"/>
+        </w:rPr>
+        <w:t>PromiseWatch</w:t>
+      </w:r>
+      <w:proofErr w:type="spellEnd"/>
+      <w:r>
+        <w:rPr>
+          <w:rFonts w:ascii="Calibri" w:hAnsi="Calibri" w:cs="Calibri"/>
+        </w:rPr>
+        <w:t xml:space="preserve"> is a proof-of-concept evidence pipeline that checks claimed dam projects against free, public Sentinel-2 satellite imagery, following a four-step framework: </w:t>
+      </w:r>
+    </w:p>
+    <w:p>
+      <w:pPr>
+        <w:rPr>
+          <w:rFonts w:ascii="Calibri" w:hAnsi="Calibri" w:cs="Calibri"/>
+        </w:rPr>
+      </w:pPr>
+      <w:r>
+        <w:rPr>
+          <w:rFonts w:ascii="Calibri" w:hAnsi="Calibri" w:cs="Calibri"/>
+          <w:b/>
+          <w:bCs/>
+        </w:rPr>
         <w:t>Claim → Evidence → Assurance → Action</w:t>
       </w:r>
       <w:r>
+        <w:rPr>
+          <w:rFonts w:ascii="Calibri" w:hAnsi="Calibri" w:cs="Calibri"/>
+        </w:rPr>
         <w:t>.</w:t>
       </w:r>
     </w:p>
     <w:p>
-      <w:r>
+      <w:pPr>
+        <w:spacing w:after="0" w:line="240" w:lineRule="auto"/>
+        <w:rPr>
+          <w:rFonts w:ascii="Calibri" w:hAnsi="Calibri" w:cs="Calibri"/>
+        </w:rPr>
+      </w:pPr>
+      <w:r>
+        <w:rPr>
+          <w:rFonts w:ascii="Calibri" w:hAnsi="Calibri" w:cs="Calibri"/>
+        </w:rPr>
         <w:t>For each claimed dam, the pipeline:</w:t>
       </w:r>
     </w:p>
@@ -146,10 +309,17 @@
       <w:pPr>
         <w:numPr>
           <w:ilvl w:val="0"/>
-          <w:numId w:val="1"/>
+          <w:numId w:val="15"/>
         </w:numPr>
-      </w:pPr>
-      <w:r>
+        <w:spacing w:after="0" w:line="240" w:lineRule="auto"/>
+        <w:rPr>
+          <w:rFonts w:ascii="Calibri" w:hAnsi="Calibri" w:cs="Calibri"/>
+        </w:rPr>
+      </w:pPr>
+      <w:r>
+        <w:rPr>
+          <w:rFonts w:ascii="Calibri" w:hAnsi="Calibri" w:cs="Calibri"/>
+        </w:rPr>
         <w:t>Pulls a cloud-masked satellite composite for a baseline period (before/at the claimed construction start) and a current period.</w:t>
       </w:r>
     </w:p>
@@ -157,10 +327,17 @@
       <w:pPr>
         <w:numPr>
           <w:ilvl w:val="0"/>
-          <w:numId w:val="1"/>
+          <w:numId w:val="15"/>
         </w:numPr>
-      </w:pPr>
-      <w:r>
+        <w:spacing w:after="0" w:line="240" w:lineRule="auto"/>
+        <w:rPr>
+          <w:rFonts w:ascii="Calibri" w:hAnsi="Calibri" w:cs="Calibri"/>
+        </w:rPr>
+      </w:pPr>
+      <w:r>
+        <w:rPr>
+          <w:rFonts w:ascii="Calibri" w:hAnsi="Calibri" w:cs="Calibri"/>
+        </w:rPr>
         <w:t>Computes water extent (via MNDWI, a standard water index) in both periods.</w:t>
       </w:r>
     </w:p>
@@ -168,319 +345,1544 @@
       <w:pPr>
         <w:numPr>
           <w:ilvl w:val="0"/>
-          <w:numId w:val="1"/>
+          <w:numId w:val="15"/>
         </w:numPr>
+        <w:spacing w:after="0" w:line="240" w:lineRule="auto"/>
+        <w:jc w:val="both"/>
+        <w:rPr>
+          <w:rFonts w:ascii="Calibri" w:hAnsi="Calibri" w:cs="Calibri"/>
+        </w:rPr>
       </w:pPr>
       <w:proofErr w:type="gramStart"/>
       <w:r>
+        <w:rPr>
+          <w:rFonts w:ascii="Calibri" w:hAnsi="Calibri" w:cs="Calibri"/>
+        </w:rPr>
         <w:t>Compares</w:t>
       </w:r>
       <w:proofErr w:type="gramEnd"/>
       <w:r>
-        <w:t xml:space="preserve"> the </w:t>
-      </w:r>
-      <w:r>
-        <w:rPr>
+        <w:rPr>
+          <w:rFonts w:ascii="Calibri" w:hAnsi="Calibri" w:cs="Calibri"/>
+        </w:rPr>
+        <w:t xml:space="preserve"> the delta</w:t>
+      </w:r>
+      <w:r>
+        <w:rPr>
+          <w:rFonts w:ascii="Calibri" w:hAnsi="Calibri" w:cs="Calibri"/>
+        </w:rPr>
+        <w:t xml:space="preserve">: </w:t>
+      </w:r>
+      <w:r>
+        <w:rPr>
+          <w:rFonts w:ascii="Calibri" w:hAnsi="Calibri" w:cs="Calibri"/>
+        </w:rPr>
+        <w:t>water added since baseline</w:t>
+      </w:r>
+      <w:r>
+        <w:rPr>
+          <w:rFonts w:ascii="Calibri" w:hAnsi="Calibri" w:cs="Calibri"/>
+        </w:rPr>
+        <w:t xml:space="preserve">, </w:t>
+      </w:r>
+      <w:r>
+        <w:rPr>
+          <w:rFonts w:ascii="Calibri" w:hAnsi="Calibri" w:cs="Calibri"/>
+        </w:rPr>
+        <w:t>against a guardrail threshold, rather than raw current water extent. This distinction is the core methodological contribution: many claimed sites have real, pre-existing water (rivers, wetlands, unrelated small community water pans) that a naive check would misread as evidence of the promised project.</w:t>
+      </w:r>
+    </w:p>
+    <w:p>
+      <w:pPr>
+        <w:numPr>
+          <w:ilvl w:val="0"/>
+          <w:numId w:val="15"/>
+        </w:numPr>
+        <w:spacing w:after="0" w:line="240" w:lineRule="auto"/>
+        <w:jc w:val="both"/>
+        <w:rPr>
+          <w:rFonts w:ascii="Calibri" w:hAnsi="Calibri" w:cs="Calibri"/>
+        </w:rPr>
+      </w:pPr>
+      <w:r>
+        <w:rPr>
+          <w:rFonts w:ascii="Calibri" w:hAnsi="Calibri" w:cs="Calibri"/>
+        </w:rPr>
+        <w:t>Returns a verdict</w:t>
+      </w:r>
+      <w:r>
+        <w:rPr>
+          <w:rFonts w:ascii="Calibri" w:hAnsi="Calibri" w:cs="Calibri"/>
+        </w:rPr>
+        <w:t xml:space="preserve">: </w:t>
+      </w:r>
+      <w:r>
+        <w:rPr>
+          <w:rFonts w:ascii="Calibri" w:hAnsi="Calibri" w:cs="Calibri"/>
+        </w:rPr>
+        <w:t>Supported, Not Delivered/Conflicted, or Underdetermined</w:t>
+      </w:r>
+      <w:r>
+        <w:rPr>
+          <w:rFonts w:ascii="Calibri" w:hAnsi="Calibri" w:cs="Calibri"/>
+        </w:rPr>
+        <w:t xml:space="preserve">, </w:t>
+      </w:r>
+      <w:r>
+        <w:rPr>
+          <w:rFonts w:ascii="Calibri" w:hAnsi="Calibri" w:cs="Calibri"/>
+        </w:rPr>
+        <w:t>with the reasoning stated explicitly, not just a label.</w:t>
+      </w:r>
+    </w:p>
+    <w:p>
+      <w:pPr>
+        <w:rPr>
+          <w:rFonts w:ascii="Calibri" w:hAnsi="Calibri" w:cs="Calibri"/>
           <w:b/>
           <w:bCs/>
         </w:rPr>
-        <w:t>delta</w:t>
-      </w:r>
-      <w:r>
-        <w:t xml:space="preserve"> — water added since baseline — against a guardrail threshold, rather than raw current water extent. This distinction is the core methodological contribution: many claimed sites have real, pre-existing water (rivers, wetlands, unrelated small community water pans) that a naive check would misread as evidence of the promised project.</w:t>
+      </w:pPr>
+      <w:r>
+        <w:rPr>
+          <w:rFonts w:ascii="Calibri" w:hAnsi="Calibri" w:cs="Calibri"/>
+          <w:b/>
+          <w:bCs/>
+        </w:rPr>
+        <w:t>Validated results</w:t>
+      </w:r>
+    </w:p>
+    <w:p>
+      <w:pPr>
+        <w:rPr>
+          <w:rFonts w:ascii="Calibri" w:hAnsi="Calibri" w:cs="Calibri"/>
+        </w:rPr>
+      </w:pPr>
+      <w:r>
+        <w:rPr>
+          <w:rFonts w:ascii="Calibri" w:hAnsi="Calibri" w:cs="Calibri"/>
+        </w:rPr>
+        <w:t xml:space="preserve">We ran the pipeline against three </w:t>
+      </w:r>
+      <w:proofErr w:type="gramStart"/>
+      <w:r>
+        <w:rPr>
+          <w:rFonts w:ascii="Calibri" w:hAnsi="Calibri" w:cs="Calibri"/>
+        </w:rPr>
+        <w:t>real</w:t>
+      </w:r>
+      <w:proofErr w:type="gramEnd"/>
+      <w:r>
+        <w:rPr>
+          <w:rFonts w:ascii="Calibri" w:hAnsi="Calibri" w:cs="Calibri"/>
+        </w:rPr>
+        <w:t>, sourced Kenyan dam cases and independently confirmed each verdict against the raw satellite imagery by eye:</w:t>
       </w:r>
     </w:p>
     <w:p>
       <w:pPr>
         <w:numPr>
           <w:ilvl w:val="0"/>
-          <w:numId w:val="1"/>
+          <w:numId w:val="16"/>
         </w:numPr>
-      </w:pPr>
-      <w:r>
-        <w:t>Returns a verdict — Supported, Not Delivered/Conflicted, or Underdetermined — with the reasoning stated explicitly, not just a label.</w:t>
-      </w:r>
-    </w:p>
-    <w:p>
-      <w:pPr>
-        <w:rPr>
+        <w:jc w:val="both"/>
+        <w:rPr>
+          <w:rFonts w:ascii="Calibri" w:hAnsi="Calibri" w:cs="Calibri"/>
+        </w:rPr>
+      </w:pPr>
+      <w:proofErr w:type="spellStart"/>
+      <w:r>
+        <w:rPr>
+          <w:rFonts w:ascii="Calibri" w:hAnsi="Calibri" w:cs="Calibri"/>
           <w:b/>
           <w:bCs/>
         </w:rPr>
-      </w:pPr>
-      <w:r>
-        <w:rPr>
+        <w:t>Thwake</w:t>
+      </w:r>
+      <w:proofErr w:type="spellEnd"/>
+      <w:r>
+        <w:rPr>
+          <w:rFonts w:ascii="Calibri" w:hAnsi="Calibri" w:cs="Calibri"/>
           <w:b/>
           <w:bCs/>
         </w:rPr>
-        <w:t>Validated results</w:t>
-      </w:r>
-    </w:p>
-    <w:p>
-      <w:r>
-        <w:lastRenderedPageBreak/>
-        <w:t>We ran the pipeline against three real, sourced Kenyan dam cases and independently confirmed each verdict against the raw satellite imagery by eye:</w:t>
+        <w:t xml:space="preserve"> Dam</w:t>
+      </w:r>
+      <w:r>
+        <w:rPr>
+          <w:rFonts w:ascii="Calibri" w:hAnsi="Calibri" w:cs="Calibri"/>
+        </w:rPr>
+        <w:t xml:space="preserve"> (Kitui/Makueni): Supported</w:t>
+      </w:r>
+      <w:r>
+        <w:rPr>
+          <w:rFonts w:ascii="Calibri" w:hAnsi="Calibri" w:cs="Calibri"/>
+        </w:rPr>
+        <w:t xml:space="preserve">- </w:t>
+      </w:r>
+      <w:r>
+        <w:rPr>
+          <w:rFonts w:ascii="Calibri" w:hAnsi="Calibri" w:cs="Calibri"/>
+        </w:rPr>
+        <w:t>a reservoir is visibly forming (46 ha of new water since baseline), consistent with public reporting that construction is ~94% complete but the dam gates are not yet functional.</w:t>
       </w:r>
     </w:p>
     <w:p>
       <w:pPr>
         <w:numPr>
           <w:ilvl w:val="0"/>
-          <w:numId w:val="2"/>
+          <w:numId w:val="16"/>
         </w:numPr>
+        <w:jc w:val="both"/>
+        <w:rPr>
+          <w:rFonts w:ascii="Calibri" w:hAnsi="Calibri" w:cs="Calibri"/>
+        </w:rPr>
       </w:pPr>
       <w:proofErr w:type="spellStart"/>
       <w:r>
         <w:rPr>
+          <w:rFonts w:ascii="Calibri" w:hAnsi="Calibri" w:cs="Calibri"/>
           <w:b/>
           <w:bCs/>
         </w:rPr>
-        <w:t>Thwake</w:t>
+        <w:lastRenderedPageBreak/>
+        <w:t>Arror</w:t>
       </w:r>
       <w:proofErr w:type="spellEnd"/>
       <w:r>
         <w:rPr>
+          <w:rFonts w:ascii="Calibri" w:hAnsi="Calibri" w:cs="Calibri"/>
           <w:b/>
           <w:bCs/>
         </w:rPr>
         <w:t xml:space="preserve"> Dam</w:t>
       </w:r>
       <w:r>
-        <w:t xml:space="preserve"> (Kitui/Makueni): Supported — a reservoir is visibly forming (46 ha of new water since baseline), consistent with public reporting that construction is ~94% complete but the dam gates are not yet functional.</w:t>
+        <w:rPr>
+          <w:rFonts w:ascii="Calibri" w:hAnsi="Calibri" w:cs="Calibri"/>
+        </w:rPr>
+        <w:t xml:space="preserve"> (</w:t>
+      </w:r>
+      <w:proofErr w:type="spellStart"/>
+      <w:r>
+        <w:rPr>
+          <w:rFonts w:ascii="Calibri" w:hAnsi="Calibri" w:cs="Calibri"/>
+        </w:rPr>
+        <w:t>Elgeyo</w:t>
+      </w:r>
+      <w:proofErr w:type="spellEnd"/>
+      <w:r>
+        <w:rPr>
+          <w:rFonts w:ascii="Calibri" w:hAnsi="Calibri" w:cs="Calibri"/>
+        </w:rPr>
+        <w:t xml:space="preserve"> Marakwet): Not Delivered</w:t>
+      </w:r>
+      <w:r>
+        <w:rPr>
+          <w:rFonts w:ascii="Calibri" w:hAnsi="Calibri" w:cs="Calibri"/>
+        </w:rPr>
+        <w:t xml:space="preserve">- </w:t>
+      </w:r>
+      <w:r>
+        <w:rPr>
+          <w:rFonts w:ascii="Calibri" w:hAnsi="Calibri" w:cs="Calibri"/>
+        </w:rPr>
+        <w:t>zero water detected at any scale; visually confirmed no water body exists at the claimed site.</w:t>
       </w:r>
     </w:p>
     <w:p>
       <w:pPr>
         <w:numPr>
           <w:ilvl w:val="0"/>
-          <w:numId w:val="2"/>
+          <w:numId w:val="16"/>
         </w:numPr>
+        <w:jc w:val="both"/>
+        <w:rPr>
+          <w:rFonts w:ascii="Calibri" w:hAnsi="Calibri" w:cs="Calibri"/>
+        </w:rPr>
       </w:pPr>
       <w:proofErr w:type="spellStart"/>
       <w:r>
         <w:rPr>
+          <w:rFonts w:ascii="Calibri" w:hAnsi="Calibri" w:cs="Calibri"/>
           <w:b/>
           <w:bCs/>
         </w:rPr>
-        <w:t>Arror</w:t>
+        <w:t>Kimwarer</w:t>
       </w:r>
       <w:proofErr w:type="spellEnd"/>
       <w:r>
         <w:rPr>
+          <w:rFonts w:ascii="Calibri" w:hAnsi="Calibri" w:cs="Calibri"/>
           <w:b/>
           <w:bCs/>
         </w:rPr>
         <w:t xml:space="preserve"> Dam</w:t>
       </w:r>
       <w:r>
+        <w:rPr>
+          <w:rFonts w:ascii="Calibri" w:hAnsi="Calibri" w:cs="Calibri"/>
+        </w:rPr>
         <w:t xml:space="preserve"> (</w:t>
       </w:r>
       <w:proofErr w:type="spellStart"/>
       <w:r>
+        <w:rPr>
+          <w:rFonts w:ascii="Calibri" w:hAnsi="Calibri" w:cs="Calibri"/>
+        </w:rPr>
         <w:t>Elgeyo</w:t>
       </w:r>
       <w:proofErr w:type="spellEnd"/>
       <w:r>
-        <w:t xml:space="preserve"> Marakwet): Not Delivered — zero water detected at any scale; visually confirmed no water body exists at the claimed site.</w:t>
+        <w:rPr>
+          <w:rFonts w:ascii="Calibri" w:hAnsi="Calibri" w:cs="Calibri"/>
+        </w:rPr>
+        <w:t xml:space="preserve"> Marakwet): Not Delivered</w:t>
+      </w:r>
+      <w:r>
+        <w:rPr>
+          <w:rFonts w:ascii="Calibri" w:hAnsi="Calibri" w:cs="Calibri"/>
+        </w:rPr>
+        <w:t xml:space="preserve">- </w:t>
+      </w:r>
+      <w:r>
+        <w:rPr>
+          <w:rFonts w:ascii="Calibri" w:hAnsi="Calibri" w:cs="Calibri"/>
+        </w:rPr>
+        <w:t>a small pre-existing pond is visible nearby but falls far below the guardrail threshold for the claimed 215-hectare reservoir, correctly distinguished from evidence of the actual project.</w:t>
+      </w:r>
+    </w:p>
+    <w:p>
+      <w:pPr>
+        <w:jc w:val="both"/>
+        <w:rPr>
+          <w:rFonts w:ascii="Calibri" w:hAnsi="Calibri" w:cs="Calibri"/>
+        </w:rPr>
+      </w:pPr>
+      <w:r>
+        <w:rPr>
+          <w:rFonts w:ascii="Calibri" w:hAnsi="Calibri" w:cs="Calibri"/>
+        </w:rPr>
+        <w:t xml:space="preserve">Four further cases (two road projects and two stadiums) are sourced and documented but </w:t>
+      </w:r>
+      <w:proofErr w:type="gramStart"/>
+      <w:r>
+        <w:rPr>
+          <w:rFonts w:ascii="Calibri" w:hAnsi="Calibri" w:cs="Calibri"/>
+        </w:rPr>
+        <w:t>not</w:t>
+      </w:r>
+      <w:proofErr w:type="gramEnd"/>
+      <w:r>
+        <w:rPr>
+          <w:rFonts w:ascii="Calibri" w:hAnsi="Calibri" w:cs="Calibri"/>
+        </w:rPr>
+        <w:t xml:space="preserve"> yet run through a detection pipeline.</w:t>
+      </w:r>
+      <w:r>
+        <w:rPr>
+          <w:rFonts w:ascii="Calibri" w:hAnsi="Calibri" w:cs="Calibri"/>
+        </w:rPr>
+        <w:t xml:space="preserve"> </w:t>
+      </w:r>
+      <w:r>
+        <w:rPr>
+          <w:rFonts w:ascii="Calibri" w:hAnsi="Calibri" w:cs="Calibri"/>
+        </w:rPr>
+        <w:t>(</w:t>
+      </w:r>
+      <w:r>
+        <w:rPr>
+          <w:rFonts w:ascii="Calibri" w:hAnsi="Calibri" w:cs="Calibri"/>
+        </w:rPr>
+        <w:t xml:space="preserve">see </w:t>
+      </w:r>
+      <w:r>
+        <w:rPr>
+          <w:rFonts w:ascii="Calibri" w:hAnsi="Calibri" w:cs="Calibri"/>
+        </w:rPr>
+        <w:t>l</w:t>
+      </w:r>
+      <w:r>
+        <w:rPr>
+          <w:rFonts w:ascii="Calibri" w:hAnsi="Calibri" w:cs="Calibri"/>
+        </w:rPr>
+        <w:t>imitations</w:t>
+      </w:r>
+      <w:r>
+        <w:rPr>
+          <w:rFonts w:ascii="Calibri" w:hAnsi="Calibri" w:cs="Calibri"/>
+        </w:rPr>
+        <w:t>).</w:t>
+      </w:r>
+    </w:p>
+    <w:p>
+      <w:pPr>
+        <w:rPr>
+          <w:rFonts w:ascii="Calibri" w:hAnsi="Calibri" w:cs="Calibri"/>
+          <w:b/>
+          <w:bCs/>
+        </w:rPr>
+      </w:pPr>
+      <w:r>
+        <w:rPr>
+          <w:rFonts w:ascii="Calibri" w:hAnsi="Calibri" w:cs="Calibri"/>
+          <w:b/>
+          <w:bCs/>
+        </w:rPr>
+        <w:t>Why this is trustworthy, not just automated</w:t>
+      </w:r>
+    </w:p>
+    <w:p>
+      <w:pPr>
+        <w:jc w:val="both"/>
+        <w:rPr>
+          <w:rFonts w:ascii="Calibri" w:hAnsi="Calibri" w:cs="Calibri"/>
+        </w:rPr>
+      </w:pPr>
+      <w:r>
+        <w:rPr>
+          <w:rFonts w:ascii="Calibri" w:hAnsi="Calibri" w:cs="Calibri"/>
+        </w:rPr>
+        <w:t>Every verdict in this submission was cross-checked against the raw satellite imagery by a human before being reported as fact</w:t>
+      </w:r>
+      <w:r>
+        <w:rPr>
+          <w:rFonts w:ascii="Calibri" w:hAnsi="Calibri" w:cs="Calibri"/>
+        </w:rPr>
+        <w:t xml:space="preserve">, </w:t>
+      </w:r>
+      <w:r>
+        <w:rPr>
+          <w:rFonts w:ascii="Calibri" w:hAnsi="Calibri" w:cs="Calibri"/>
+        </w:rPr>
+        <w:t xml:space="preserve">the pipeline flags its own uncertainty (e.g., zero usable cloud-free imagery, or a detected feature below the scale of the claim) rather than forcing a confident answer from ambiguous evidence. The </w:t>
+      </w:r>
+      <w:proofErr w:type="spellStart"/>
+      <w:r>
+        <w:rPr>
+          <w:rFonts w:ascii="Calibri" w:hAnsi="Calibri" w:cs="Calibri"/>
+        </w:rPr>
+        <w:t>Kimwarer</w:t>
+      </w:r>
+      <w:proofErr w:type="spellEnd"/>
+      <w:r>
+        <w:rPr>
+          <w:rFonts w:ascii="Calibri" w:hAnsi="Calibri" w:cs="Calibri"/>
+        </w:rPr>
+        <w:t xml:space="preserve"> case is included specifically because it demonstrates the tool correctly avoiding a false positive it could easily have produced with a simpler method.</w:t>
+      </w:r>
+    </w:p>
+    <w:p>
+      <w:pPr>
+        <w:rPr>
+          <w:rFonts w:ascii="Calibri" w:hAnsi="Calibri" w:cs="Calibri"/>
+          <w:b/>
+          <w:bCs/>
+        </w:rPr>
+      </w:pPr>
+      <w:r>
+        <w:rPr>
+          <w:rFonts w:ascii="Calibri" w:hAnsi="Calibri" w:cs="Calibri"/>
+          <w:b/>
+          <w:bCs/>
+        </w:rPr>
+        <w:t>Limitations, stated plainly</w:t>
       </w:r>
     </w:p>
     <w:p>
       <w:pPr>
         <w:numPr>
           <w:ilvl w:val="0"/>
-          <w:numId w:val="2"/>
+          <w:numId w:val="17"/>
         </w:numPr>
-      </w:pPr>
-      <w:proofErr w:type="spellStart"/>
-      <w:r>
-        <w:rPr>
+        <w:spacing w:after="0" w:line="240" w:lineRule="auto"/>
+        <w:jc w:val="both"/>
+        <w:rPr>
+          <w:rFonts w:ascii="Calibri" w:hAnsi="Calibri" w:cs="Calibri"/>
+        </w:rPr>
+      </w:pPr>
+      <w:r>
+        <w:rPr>
+          <w:rFonts w:ascii="Calibri" w:hAnsi="Calibri" w:cs="Calibri"/>
+        </w:rPr>
+        <w:t xml:space="preserve">Free satellite imagery (10m resolution) cannot resolve small features like </w:t>
+      </w:r>
+      <w:proofErr w:type="gramStart"/>
+      <w:r>
+        <w:rPr>
+          <w:rFonts w:ascii="Calibri" w:hAnsi="Calibri" w:cs="Calibri"/>
+        </w:rPr>
+        <w:t>boreholes</w:t>
+      </w:r>
+      <w:r>
+        <w:rPr>
+          <w:rFonts w:ascii="Calibri" w:hAnsi="Calibri" w:cs="Calibri"/>
+        </w:rPr>
+        <w:t xml:space="preserve">, </w:t>
+      </w:r>
+      <w:r>
+        <w:rPr>
+          <w:rFonts w:ascii="Calibri" w:hAnsi="Calibri" w:cs="Calibri"/>
+        </w:rPr>
+        <w:t xml:space="preserve"> this</w:t>
+      </w:r>
+      <w:proofErr w:type="gramEnd"/>
+      <w:r>
+        <w:rPr>
+          <w:rFonts w:ascii="Calibri" w:hAnsi="Calibri" w:cs="Calibri"/>
+        </w:rPr>
+        <w:t xml:space="preserve"> project type was excluded rather than faked with a weak proxy.</w:t>
+      </w:r>
+    </w:p>
+    <w:p>
+      <w:pPr>
+        <w:numPr>
+          <w:ilvl w:val="0"/>
+          <w:numId w:val="17"/>
+        </w:numPr>
+        <w:spacing w:after="0" w:line="240" w:lineRule="auto"/>
+        <w:jc w:val="both"/>
+        <w:rPr>
+          <w:rFonts w:ascii="Calibri" w:hAnsi="Calibri" w:cs="Calibri"/>
+        </w:rPr>
+      </w:pPr>
+      <w:r>
+        <w:rPr>
+          <w:rFonts w:ascii="Calibri" w:hAnsi="Calibri" w:cs="Calibri"/>
+        </w:rPr>
+        <w:t>Road and stadium detection are designed but not yet implemented in this submission.</w:t>
+      </w:r>
+    </w:p>
+    <w:p>
+      <w:pPr>
+        <w:numPr>
+          <w:ilvl w:val="0"/>
+          <w:numId w:val="17"/>
+        </w:numPr>
+        <w:spacing w:after="0" w:line="240" w:lineRule="auto"/>
+        <w:jc w:val="both"/>
+        <w:rPr>
+          <w:rFonts w:ascii="Calibri" w:hAnsi="Calibri" w:cs="Calibri"/>
+        </w:rPr>
+      </w:pPr>
+      <w:r>
+        <w:rPr>
+          <w:rFonts w:ascii="Calibri" w:hAnsi="Calibri" w:cs="Calibri"/>
+        </w:rPr>
+        <w:t>Circular buffers are a rough approximation of actual reservoir/river shapes; a production version would use proper polygon geometries.</w:t>
+      </w:r>
+    </w:p>
+    <w:p>
+      <w:pPr>
+        <w:numPr>
+          <w:ilvl w:val="0"/>
+          <w:numId w:val="17"/>
+        </w:numPr>
+        <w:spacing w:after="0" w:line="240" w:lineRule="auto"/>
+        <w:jc w:val="both"/>
+        <w:rPr>
+          <w:rFonts w:ascii="Calibri" w:hAnsi="Calibri" w:cs="Calibri"/>
+        </w:rPr>
+      </w:pPr>
+      <w:r>
+        <w:rPr>
+          <w:rFonts w:ascii="Calibri" w:hAnsi="Calibri" w:cs="Calibri"/>
+        </w:rPr>
+        <w:t>Design-capacity figures for two cases were reconstructed from engineering descriptions rather than pulled from a single authoritative source table and should be independently verified before any public claim relies on precise figures.</w:t>
+      </w:r>
+    </w:p>
+    <w:p>
+      <w:pPr>
+        <w:numPr>
+          <w:ilvl w:val="0"/>
+          <w:numId w:val="17"/>
+        </w:numPr>
+        <w:spacing w:after="0" w:line="240" w:lineRule="auto"/>
+        <w:jc w:val="both"/>
+        <w:rPr>
+          <w:rFonts w:ascii="Calibri" w:hAnsi="Calibri" w:cs="Calibri"/>
+        </w:rPr>
+      </w:pPr>
+      <w:r>
+        <w:rPr>
+          <w:rFonts w:ascii="Calibri" w:hAnsi="Calibri" w:cs="Calibri"/>
+        </w:rPr>
+        <w:t>This is a proof of concept validated on a handful of hand-checked cases, not a scaled or automated system</w:t>
+      </w:r>
+      <w:r>
+        <w:rPr>
+          <w:rFonts w:ascii="Calibri" w:hAnsi="Calibri" w:cs="Calibri"/>
+        </w:rPr>
+        <w:t xml:space="preserve">, </w:t>
+      </w:r>
+      <w:r>
+        <w:rPr>
+          <w:rFonts w:ascii="Calibri" w:hAnsi="Calibri" w:cs="Calibri"/>
+        </w:rPr>
+        <w:t>every result here required a human to open and check the underlying imagery.</w:t>
+      </w:r>
+    </w:p>
+    <w:p>
+      <w:pPr>
+        <w:rPr>
+          <w:rFonts w:ascii="Calibri" w:hAnsi="Calibri" w:cs="Calibri"/>
           <w:b/>
           <w:bCs/>
         </w:rPr>
-        <w:t>Kimwarer</w:t>
-      </w:r>
-      <w:proofErr w:type="spellEnd"/>
-      <w:r>
-        <w:rPr>
+      </w:pPr>
+      <w:r>
+        <w:rPr>
+          <w:rFonts w:ascii="Calibri" w:hAnsi="Calibri" w:cs="Calibri"/>
           <w:b/>
           <w:bCs/>
         </w:rPr>
-        <w:t xml:space="preserve"> Dam</w:t>
-      </w:r>
-      <w:r>
-        <w:t xml:space="preserve"> (</w:t>
-      </w:r>
-      <w:proofErr w:type="spellStart"/>
-      <w:r>
-        <w:t>Elgeyo</w:t>
-      </w:r>
-      <w:proofErr w:type="spellEnd"/>
-      <w:r>
-        <w:t xml:space="preserve"> Marakwet): Not Delivered — a small pre-existing pond is visible nearby but falls far below the guardrail threshold for the claimed 215-hectare reservoir, correctly distinguished from evidence of the actual project.</w:t>
-      </w:r>
-    </w:p>
-    <w:p>
-      <w:r>
-        <w:t>Three further cases (two road projects, two stadiums) are sourced and documented but not yet run through a detection pipeline — see Limitations.</w:t>
-      </w:r>
-    </w:p>
-    <w:p>
-      <w:pPr>
-        <w:rPr>
+        <w:t>Operating constraints — honest status, not aspirational</w:t>
+      </w:r>
+    </w:p>
+    <w:p>
+      <w:pPr>
+        <w:numPr>
+          <w:ilvl w:val="0"/>
+          <w:numId w:val="18"/>
+        </w:numPr>
+        <w:spacing w:after="0" w:line="240" w:lineRule="auto"/>
+        <w:jc w:val="both"/>
+        <w:rPr>
+          <w:rFonts w:ascii="Calibri" w:hAnsi="Calibri" w:cs="Calibri"/>
+        </w:rPr>
+      </w:pPr>
+      <w:r>
+        <w:rPr>
+          <w:rFonts w:ascii="Calibri" w:hAnsi="Calibri" w:cs="Calibri"/>
           <w:b/>
           <w:bCs/>
         </w:rPr>
-      </w:pPr>
-      <w:r>
-        <w:rPr>
+        <w:t xml:space="preserve">Trust and </w:t>
+      </w:r>
+      <w:proofErr w:type="gramStart"/>
+      <w:r>
+        <w:rPr>
+          <w:rFonts w:ascii="Calibri" w:hAnsi="Calibri" w:cs="Calibri"/>
           <w:b/>
           <w:bCs/>
         </w:rPr>
-        <w:t>Why this is trustworthy, not just automated</w:t>
-      </w:r>
-    </w:p>
-    <w:p>
-      <w:r>
-        <w:t xml:space="preserve">Every verdict in this submission was cross-checked against the raw satellite imagery by a human before being reported as fact — the pipeline flags its own uncertainty (e.g., zero usable cloud-free imagery, or a detected feature below the scale of the claim) rather than forcing a confident answer from ambiguous evidence. The </w:t>
+        <w:t>verification</w:t>
+      </w:r>
+      <w:r>
+        <w:rPr>
+          <w:rFonts w:ascii="Calibri" w:hAnsi="Calibri" w:cs="Calibri"/>
+        </w:rPr>
+        <w:t>:</w:t>
+      </w:r>
+      <w:proofErr w:type="gramEnd"/>
+      <w:r>
+        <w:rPr>
+          <w:rFonts w:ascii="Calibri" w:hAnsi="Calibri" w:cs="Calibri"/>
+        </w:rPr>
+        <w:t xml:space="preserve"> partially built. Every claim is sourced; every verdict now carries a </w:t>
       </w:r>
       <w:proofErr w:type="spellStart"/>
       <w:r>
-        <w:t>Kimwarer</w:t>
+        <w:rPr>
+          <w:rFonts w:ascii="Calibri" w:hAnsi="Calibri" w:cs="Calibri"/>
+        </w:rPr>
+        <w:t>checked_on_utc</w:t>
       </w:r>
       <w:proofErr w:type="spellEnd"/>
       <w:r>
-        <w:t xml:space="preserve"> case is included specifically because it demonstrates the tool correctly avoiding a false positive it could easily have produced with a simpler method.</w:t>
-      </w:r>
-    </w:p>
-    <w:p>
-      <w:pPr>
-        <w:rPr>
+        <w:rPr>
+          <w:rFonts w:ascii="Calibri" w:hAnsi="Calibri" w:cs="Calibri"/>
+        </w:rPr>
+        <w:t xml:space="preserve"> timestamp so a user knows when it was last generated, since Sentinel-2 imagery updates roughly every 5 days and a stale result shouldn't be trusted indefinitely.</w:t>
+      </w:r>
+    </w:p>
+    <w:p>
+      <w:pPr>
+        <w:spacing w:after="0" w:line="240" w:lineRule="auto"/>
+        <w:ind w:left="720"/>
+        <w:jc w:val="both"/>
+        <w:rPr>
+          <w:rFonts w:ascii="Calibri" w:hAnsi="Calibri" w:cs="Calibri"/>
+        </w:rPr>
+      </w:pPr>
+    </w:p>
+    <w:p>
+      <w:pPr>
+        <w:numPr>
+          <w:ilvl w:val="0"/>
+          <w:numId w:val="18"/>
+        </w:numPr>
+        <w:spacing w:after="0" w:line="240" w:lineRule="auto"/>
+        <w:rPr>
+          <w:rFonts w:ascii="Calibri" w:hAnsi="Calibri" w:cs="Calibri"/>
+        </w:rPr>
+      </w:pPr>
+      <w:r>
+        <w:rPr>
+          <w:rFonts w:ascii="Calibri" w:hAnsi="Calibri" w:cs="Calibri"/>
           <w:b/>
           <w:bCs/>
         </w:rPr>
-      </w:pPr>
-      <w:r>
-        <w:rPr>
+        <w:t>Low bandwidth</w:t>
+      </w:r>
+      <w:r>
+        <w:rPr>
+          <w:rFonts w:ascii="Calibri" w:hAnsi="Calibri" w:cs="Calibri"/>
+        </w:rPr>
+        <w:t xml:space="preserve">: not built. The current PoC is a </w:t>
+      </w:r>
+      <w:proofErr w:type="spellStart"/>
+      <w:r>
+        <w:rPr>
+          <w:rFonts w:ascii="Calibri" w:hAnsi="Calibri" w:cs="Calibri"/>
+        </w:rPr>
+        <w:t>Colab</w:t>
+      </w:r>
+      <w:proofErr w:type="spellEnd"/>
+      <w:r>
+        <w:rPr>
+          <w:rFonts w:ascii="Calibri" w:hAnsi="Calibri" w:cs="Calibri"/>
+        </w:rPr>
+        <w:t xml:space="preserve"> notebook making live Earth Engine calls it requires solid, unmetered internet to run at all. Roadmap only.</w:t>
+      </w:r>
+    </w:p>
+    <w:p>
+      <w:pPr>
+        <w:spacing w:after="0" w:line="240" w:lineRule="auto"/>
+        <w:ind w:left="720"/>
+        <w:rPr>
+          <w:rFonts w:ascii="Calibri" w:hAnsi="Calibri" w:cs="Calibri"/>
+        </w:rPr>
+      </w:pPr>
+    </w:p>
+    <w:p>
+      <w:pPr>
+        <w:numPr>
+          <w:ilvl w:val="0"/>
+          <w:numId w:val="18"/>
+        </w:numPr>
+        <w:spacing w:after="0" w:line="240" w:lineRule="auto"/>
+        <w:jc w:val="both"/>
+        <w:rPr>
+          <w:rFonts w:ascii="Calibri" w:hAnsi="Calibri" w:cs="Calibri"/>
+        </w:rPr>
+      </w:pPr>
+      <w:r>
+        <w:rPr>
+          <w:rFonts w:ascii="Calibri" w:hAnsi="Calibri" w:cs="Calibri"/>
           <w:b/>
           <w:bCs/>
         </w:rPr>
-        <w:t>Limitations, stated plainly</w:t>
-      </w:r>
+        <w:t xml:space="preserve">Accessibility and </w:t>
+      </w:r>
+      <w:proofErr w:type="gramStart"/>
+      <w:r>
+        <w:rPr>
+          <w:rFonts w:ascii="Calibri" w:hAnsi="Calibri" w:cs="Calibri"/>
+          <w:b/>
+          <w:bCs/>
+        </w:rPr>
+        <w:t>inclusion</w:t>
+      </w:r>
+      <w:r>
+        <w:rPr>
+          <w:rFonts w:ascii="Calibri" w:hAnsi="Calibri" w:cs="Calibri"/>
+        </w:rPr>
+        <w:t>:</w:t>
+      </w:r>
+      <w:proofErr w:type="gramEnd"/>
+      <w:r>
+        <w:rPr>
+          <w:rFonts w:ascii="Calibri" w:hAnsi="Calibri" w:cs="Calibri"/>
+        </w:rPr>
+        <w:t xml:space="preserve"> not built, and this is a real gap, not just an unstarted feature. No frontend exists to design for different literacy levels, disabilities, or digital confidence the only user-facing artifacts today (raw satellite thumbnails, a code notebook) assume </w:t>
+      </w:r>
+      <w:r>
+        <w:rPr>
+          <w:rFonts w:ascii="Calibri" w:hAnsi="Calibri" w:cs="Calibri"/>
+        </w:rPr>
+        <w:lastRenderedPageBreak/>
+        <w:t>both technical and visual literacy. Even the roadmap's planned frontend will need an explicit accessibility pass (plain-language verdict text with no jargon, screen-reader-compatible layout, no reliance on color alone to convey a verdict) rather than treating a low-bandwidth build as automatically accessible</w:t>
+      </w:r>
+      <w:r>
+        <w:rPr>
+          <w:rFonts w:ascii="Calibri" w:hAnsi="Calibri" w:cs="Calibri"/>
+        </w:rPr>
+        <w:t>.</w:t>
+      </w:r>
+    </w:p>
+    <w:p>
+      <w:pPr>
+        <w:spacing w:after="0" w:line="240" w:lineRule="auto"/>
+        <w:jc w:val="both"/>
+        <w:rPr>
+          <w:rFonts w:ascii="Calibri" w:hAnsi="Calibri" w:cs="Calibri"/>
+        </w:rPr>
+      </w:pPr>
     </w:p>
     <w:p>
       <w:pPr>
         <w:numPr>
           <w:ilvl w:val="0"/>
-          <w:numId w:val="3"/>
+          <w:numId w:val="18"/>
         </w:numPr>
-      </w:pPr>
-      <w:r>
-        <w:t>Free satellite imagery (10m resolution) cannot resolve small features like boreholes — this project type was excluded rather than faked with a weak proxy.</w:t>
-      </w:r>
+        <w:spacing w:after="0" w:line="240" w:lineRule="auto"/>
+        <w:rPr>
+          <w:rFonts w:ascii="Calibri" w:hAnsi="Calibri" w:cs="Calibri"/>
+        </w:rPr>
+      </w:pPr>
+      <w:r>
+        <w:rPr>
+          <w:rFonts w:ascii="Calibri" w:hAnsi="Calibri" w:cs="Calibri"/>
+          <w:b/>
+          <w:bCs/>
+        </w:rPr>
+        <w:t>Multilingual access</w:t>
+      </w:r>
+      <w:r>
+        <w:rPr>
+          <w:rFonts w:ascii="Calibri" w:hAnsi="Calibri" w:cs="Calibri"/>
+        </w:rPr>
+        <w:t>: not built. English only, everywhere, right now. Roadmap.</w:t>
+      </w:r>
+    </w:p>
+    <w:p>
+      <w:pPr>
+        <w:spacing w:after="0" w:line="240" w:lineRule="auto"/>
+        <w:rPr>
+          <w:rFonts w:ascii="Calibri" w:hAnsi="Calibri" w:cs="Calibri"/>
+        </w:rPr>
+      </w:pPr>
     </w:p>
     <w:p>
       <w:pPr>
         <w:numPr>
           <w:ilvl w:val="0"/>
-          <w:numId w:val="3"/>
+          <w:numId w:val="18"/>
         </w:numPr>
-      </w:pPr>
-      <w:r>
-        <w:t>Road and stadium detection are designed but not yet implemented in this submission.</w:t>
+        <w:spacing w:after="0" w:line="240" w:lineRule="auto"/>
+        <w:rPr>
+          <w:rFonts w:ascii="Calibri" w:hAnsi="Calibri" w:cs="Calibri"/>
+        </w:rPr>
+      </w:pPr>
+      <w:r>
+        <w:rPr>
+          <w:rFonts w:ascii="Calibri" w:hAnsi="Calibri" w:cs="Calibri"/>
+          <w:b/>
+          <w:bCs/>
+        </w:rPr>
+        <w:t>Privacy and security</w:t>
+      </w:r>
+      <w:r>
+        <w:rPr>
+          <w:rFonts w:ascii="Calibri" w:hAnsi="Calibri" w:cs="Calibri"/>
+        </w:rPr>
+        <w:t xml:space="preserve">: not yet applicable </w:t>
+      </w:r>
+      <w:r>
+        <w:rPr>
+          <w:rFonts w:ascii="Calibri" w:hAnsi="Calibri" w:cs="Calibri"/>
+        </w:rPr>
+        <w:t xml:space="preserve">- </w:t>
+      </w:r>
+      <w:r>
+        <w:rPr>
+          <w:rFonts w:ascii="Calibri" w:hAnsi="Calibri" w:cs="Calibri"/>
+        </w:rPr>
+        <w:t>no personal data is collected today. The planned crowd-corroboration feature will need an anonymity design before it's built, not retrofitted after.</w:t>
       </w:r>
     </w:p>
     <w:p>
       <w:pPr>
         <w:numPr>
           <w:ilvl w:val="0"/>
-          <w:numId w:val="3"/>
+          <w:numId w:val="18"/>
         </w:numPr>
-      </w:pPr>
-      <w:r>
-        <w:t>Circular buffers are a rough approximation of actual reservoir/river shapes; a production version would use proper polygon geometries.</w:t>
+        <w:spacing w:after="0" w:line="240" w:lineRule="auto"/>
+        <w:rPr>
+          <w:rFonts w:ascii="Calibri" w:hAnsi="Calibri" w:cs="Calibri"/>
+        </w:rPr>
+      </w:pPr>
+      <w:r>
+        <w:rPr>
+          <w:rFonts w:ascii="Calibri" w:hAnsi="Calibri" w:cs="Calibri"/>
+          <w:b/>
+          <w:bCs/>
+        </w:rPr>
+        <w:t>Local relevance</w:t>
+      </w:r>
+      <w:r>
+        <w:rPr>
+          <w:rFonts w:ascii="Calibri" w:hAnsi="Calibri" w:cs="Calibri"/>
+        </w:rPr>
+        <w:t>: built and genuinely strong</w:t>
+      </w:r>
+      <w:r>
+        <w:rPr>
+          <w:rFonts w:ascii="Calibri" w:hAnsi="Calibri" w:cs="Calibri"/>
+        </w:rPr>
+        <w:t xml:space="preserve">, </w:t>
+      </w:r>
+      <w:r>
+        <w:rPr>
+          <w:rFonts w:ascii="Calibri" w:hAnsi="Calibri" w:cs="Calibri"/>
+        </w:rPr>
+        <w:t>every case is real, sourced, and Kenya-specific.</w:t>
       </w:r>
     </w:p>
     <w:p>
       <w:pPr>
         <w:numPr>
           <w:ilvl w:val="0"/>
-          <w:numId w:val="3"/>
+          <w:numId w:val="18"/>
         </w:numPr>
-      </w:pPr>
-      <w:r>
-        <w:t xml:space="preserve">Design-capacity figures for two cases were reconstructed from engineering descriptions rather than pulled from a single authoritative source </w:t>
+        <w:spacing w:after="0" w:line="240" w:lineRule="auto"/>
+        <w:jc w:val="both"/>
+        <w:rPr>
+          <w:rFonts w:ascii="Calibri" w:hAnsi="Calibri" w:cs="Calibri"/>
+        </w:rPr>
+      </w:pPr>
+      <w:r>
+        <w:rPr>
+          <w:rFonts w:ascii="Calibri" w:hAnsi="Calibri" w:cs="Calibri"/>
+          <w:b/>
+          <w:bCs/>
+        </w:rPr>
+        <w:t xml:space="preserve">Clear next </w:t>
       </w:r>
       <w:proofErr w:type="gramStart"/>
       <w:r>
-        <w:t>table, and</w:t>
+        <w:rPr>
+          <w:rFonts w:ascii="Calibri" w:hAnsi="Calibri" w:cs="Calibri"/>
+          <w:b/>
+          <w:bCs/>
+        </w:rPr>
+        <w:t>steps</w:t>
+      </w:r>
+      <w:r>
+        <w:rPr>
+          <w:rFonts w:ascii="Calibri" w:hAnsi="Calibri" w:cs="Calibri"/>
+        </w:rPr>
+        <w:t>:</w:t>
       </w:r>
       <w:proofErr w:type="gramEnd"/>
       <w:r>
-        <w:t xml:space="preserve"> should be independently verified before any public claim relies on precise figures.</w:t>
+        <w:rPr>
+          <w:rFonts w:ascii="Calibri" w:hAnsi="Calibri" w:cs="Calibri"/>
+        </w:rPr>
+        <w:t xml:space="preserve"> partially built. Every case with a confirmed or suspected non-delivery verdict now includes a real, sourced reporting contact (Kenya's Ethics and Anti-Corruption Commission</w:t>
+      </w:r>
+      <w:r>
+        <w:rPr>
+          <w:rFonts w:ascii="Calibri" w:hAnsi="Calibri" w:cs="Calibri"/>
+        </w:rPr>
+        <w:t xml:space="preserve">- </w:t>
+      </w:r>
+      <w:r>
+        <w:rPr>
+          <w:rFonts w:ascii="Calibri" w:hAnsi="Calibri" w:cs="Calibri"/>
+        </w:rPr>
+        <w:t>toll-free 1551, report@integrity.go.ke) in the case data. This is a minimal first version of the "Action" step, not a finished product</w:t>
+      </w:r>
+      <w:r>
+        <w:rPr>
+          <w:rFonts w:ascii="Calibri" w:hAnsi="Calibri" w:cs="Calibri"/>
+        </w:rPr>
+        <w:t xml:space="preserve">, </w:t>
+      </w:r>
+      <w:r>
+        <w:rPr>
+          <w:rFonts w:ascii="Calibri" w:hAnsi="Calibri" w:cs="Calibri"/>
+        </w:rPr>
+        <w:t>no in-app routing or case-specific escalation paths yet.</w:t>
+      </w:r>
+    </w:p>
+    <w:p>
+      <w:pPr>
+        <w:spacing w:after="0" w:line="240" w:lineRule="auto"/>
+        <w:ind w:left="360"/>
+        <w:rPr>
+          <w:rFonts w:ascii="Calibri" w:hAnsi="Calibri" w:cs="Calibri"/>
+        </w:rPr>
+      </w:pPr>
+    </w:p>
+    <w:p>
+      <w:pPr>
+        <w:rPr>
+          <w:rFonts w:ascii="Calibri" w:hAnsi="Calibri" w:cs="Calibri"/>
+          <w:b/>
+          <w:bCs/>
+        </w:rPr>
+      </w:pPr>
+      <w:r>
+        <w:rPr>
+          <w:rFonts w:ascii="Calibri" w:hAnsi="Calibri" w:cs="Calibri"/>
+          <w:b/>
+          <w:bCs/>
+        </w:rPr>
+        <w:t>Next steps</w:t>
+      </w:r>
+    </w:p>
+    <w:p>
+      <w:pPr>
+        <w:jc w:val="both"/>
+        <w:rPr>
+          <w:rFonts w:ascii="Calibri" w:hAnsi="Calibri" w:cs="Calibri"/>
+        </w:rPr>
+      </w:pPr>
+      <w:r>
+        <w:rPr>
+          <w:rFonts w:ascii="Calibri" w:hAnsi="Calibri" w:cs="Calibri"/>
+        </w:rPr>
+        <w:t>Build out road and stadium detection; replace circular buffers with real geometry; add a crowd-corroboration channel so citizens can supply ground-truth evidence for cases satellite imagery can't resolve alone (like boreholes); connect confirmed non-delivery cases to concrete actions</w:t>
+      </w:r>
+      <w:r>
+        <w:rPr>
+          <w:rFonts w:ascii="Calibri" w:hAnsi="Calibri" w:cs="Calibri"/>
+        </w:rPr>
+        <w:t xml:space="preserve">, </w:t>
+      </w:r>
+      <w:r>
+        <w:rPr>
+          <w:rFonts w:ascii="Calibri" w:hAnsi="Calibri" w:cs="Calibri"/>
+        </w:rPr>
+        <w:t>a template petition to the relevant county assembly, or a link to Kenya's Auditor-General or EACC reporting channels; build a low-bandwidth, multilingual (English/Swahili) frontend so the tool is usable without running code.</w:t>
+      </w:r>
+    </w:p>
+    <w:p>
+      <w:pPr>
+        <w:rPr>
+          <w:rFonts w:ascii="Calibri" w:hAnsi="Calibri" w:cs="Calibri"/>
+          <w:b/>
+          <w:bCs/>
+        </w:rPr>
+      </w:pPr>
+      <w:r>
+        <w:rPr>
+          <w:rFonts w:ascii="Calibri" w:hAnsi="Calibri" w:cs="Calibri"/>
+          <w:b/>
+          <w:bCs/>
+        </w:rPr>
+        <w:t>Information sources</w:t>
+      </w:r>
+    </w:p>
+    <w:p>
+      <w:pPr>
+        <w:jc w:val="both"/>
+        <w:rPr>
+          <w:rFonts w:ascii="Calibri" w:hAnsi="Calibri" w:cs="Calibri"/>
+        </w:rPr>
+      </w:pPr>
+      <w:r>
+        <w:rPr>
+          <w:rFonts w:ascii="Calibri" w:hAnsi="Calibri" w:cs="Calibri"/>
+        </w:rPr>
+        <w:t xml:space="preserve">Claim dates, locations, and project status: public Kenyan reporting (Nation, Kenyans.co.ke, Newsroom, Pulse Sports) and Wikipedia's documented account of the </w:t>
+      </w:r>
+      <w:proofErr w:type="spellStart"/>
+      <w:r>
+        <w:rPr>
+          <w:rFonts w:ascii="Calibri" w:hAnsi="Calibri" w:cs="Calibri"/>
+        </w:rPr>
+        <w:t>Arror</w:t>
+      </w:r>
+      <w:proofErr w:type="spellEnd"/>
+      <w:r>
+        <w:rPr>
+          <w:rFonts w:ascii="Calibri" w:hAnsi="Calibri" w:cs="Calibri"/>
+        </w:rPr>
+        <w:t>/</w:t>
+      </w:r>
+      <w:proofErr w:type="spellStart"/>
+      <w:r>
+        <w:rPr>
+          <w:rFonts w:ascii="Calibri" w:hAnsi="Calibri" w:cs="Calibri"/>
+        </w:rPr>
+        <w:t>Kimwarer</w:t>
+      </w:r>
+      <w:proofErr w:type="spellEnd"/>
+      <w:r>
+        <w:rPr>
+          <w:rFonts w:ascii="Calibri" w:hAnsi="Calibri" w:cs="Calibri"/>
+        </w:rPr>
+        <w:t xml:space="preserve"> scandal, cited per-case in the repository's case file. Design specifications (dam height, crest length, reservoir surface area): reconstructed from NEMA environmental impact assessment engineering descriptions for </w:t>
+      </w:r>
+      <w:proofErr w:type="spellStart"/>
+      <w:r>
+        <w:rPr>
+          <w:rFonts w:ascii="Calibri" w:hAnsi="Calibri" w:cs="Calibri"/>
+        </w:rPr>
+        <w:t>Arror</w:t>
+      </w:r>
+      <w:proofErr w:type="spellEnd"/>
+      <w:r>
+        <w:rPr>
+          <w:rFonts w:ascii="Calibri" w:hAnsi="Calibri" w:cs="Calibri"/>
+        </w:rPr>
+        <w:t xml:space="preserve"> and </w:t>
+      </w:r>
+      <w:proofErr w:type="spellStart"/>
+      <w:r>
+        <w:rPr>
+          <w:rFonts w:ascii="Calibri" w:hAnsi="Calibri" w:cs="Calibri"/>
+        </w:rPr>
+        <w:t>Kimwarer</w:t>
+      </w:r>
+      <w:proofErr w:type="spellEnd"/>
+      <w:r>
+        <w:rPr>
+          <w:rFonts w:ascii="Calibri" w:hAnsi="Calibri" w:cs="Calibri"/>
+        </w:rPr>
+        <w:t xml:space="preserve">; Ministry of Water/Kenya Engineer reporting for </w:t>
+      </w:r>
+      <w:proofErr w:type="spellStart"/>
+      <w:r>
+        <w:rPr>
+          <w:rFonts w:ascii="Calibri" w:hAnsi="Calibri" w:cs="Calibri"/>
+        </w:rPr>
+        <w:t>Thwake</w:t>
+      </w:r>
+      <w:proofErr w:type="spellEnd"/>
+      <w:r>
+        <w:rPr>
+          <w:rFonts w:ascii="Calibri" w:hAnsi="Calibri" w:cs="Calibri"/>
+        </w:rPr>
+        <w:t xml:space="preserve">. </w:t>
+      </w:r>
+    </w:p>
+    <w:p>
+      <w:pPr>
+        <w:jc w:val="both"/>
+        <w:rPr>
+          <w:rFonts w:ascii="Calibri" w:hAnsi="Calibri" w:cs="Calibri"/>
+        </w:rPr>
+      </w:pPr>
+      <w:r>
+        <w:rPr>
+          <w:rFonts w:ascii="Calibri" w:hAnsi="Calibri" w:cs="Calibri"/>
+        </w:rPr>
+        <w:t>Satellite imagery: Copernicus Sentinel-2 (European Space Agency), accessed via Google Earth Engine. Every source is cited inline in the case file rather than asserted without attribution, and every case's satellite-derived verdict was independently visually confirmed against the raw imagery before being reported as fact.</w:t>
+      </w:r>
+    </w:p>
+    <w:p>
+      <w:pPr>
+        <w:rPr>
+          <w:rFonts w:ascii="Calibri" w:hAnsi="Calibri" w:cs="Calibri"/>
+          <w:b/>
+          <w:bCs/>
+        </w:rPr>
+      </w:pPr>
+      <w:r>
+        <w:rPr>
+          <w:rFonts w:ascii="Calibri" w:hAnsi="Calibri" w:cs="Calibri"/>
+          <w:b/>
+          <w:bCs/>
+        </w:rPr>
+        <w:t>Our approach to trust and accuracy</w:t>
+      </w:r>
+    </w:p>
+    <w:p>
+      <w:pPr>
+        <w:rPr>
+          <w:rFonts w:ascii="Calibri" w:hAnsi="Calibri" w:cs="Calibri"/>
+        </w:rPr>
+      </w:pPr>
+      <w:r>
+        <w:rPr>
+          <w:rFonts w:ascii="Calibri" w:hAnsi="Calibri" w:cs="Calibri"/>
+        </w:rPr>
+        <w:lastRenderedPageBreak/>
+        <w:t>Two safeguards drive this project, both born from real mistakes caught during development rather than designed in the abstract from the start:</w:t>
       </w:r>
     </w:p>
     <w:p>
       <w:pPr>
         <w:numPr>
           <w:ilvl w:val="0"/>
-          <w:numId w:val="3"/>
+          <w:numId w:val="19"/>
         </w:numPr>
-      </w:pPr>
-      <w:r>
-        <w:t xml:space="preserve">This is a proof of concept validated on a handful of hand-checked cases, not a scaled or automated system — every result here </w:t>
-      </w:r>
-      <w:proofErr w:type="gramStart"/>
-      <w:r>
-        <w:t>required</w:t>
-      </w:r>
-      <w:proofErr w:type="gramEnd"/>
-      <w:r>
-        <w:t xml:space="preserve"> a human to open and check the underlying imagery.</w:t>
-      </w:r>
-    </w:p>
-    <w:p>
-      <w:pPr>
-        <w:rPr>
+        <w:jc w:val="both"/>
+        <w:rPr>
+          <w:rFonts w:ascii="Calibri" w:hAnsi="Calibri" w:cs="Calibri"/>
+        </w:rPr>
+      </w:pPr>
+      <w:r>
+        <w:rPr>
+          <w:rFonts w:ascii="Calibri" w:hAnsi="Calibri" w:cs="Calibri"/>
           <w:b/>
           <w:bCs/>
         </w:rPr>
-      </w:pPr>
-      <w:r>
-        <w:rPr>
+        <w:t>The delta-over-baseline guardrail.</w:t>
+      </w:r>
+      <w:r>
+        <w:rPr>
+          <w:rFonts w:ascii="Calibri" w:hAnsi="Calibri" w:cs="Calibri"/>
+        </w:rPr>
+        <w:t xml:space="preserve"> Early testing surfaced a real case (</w:t>
+      </w:r>
+      <w:proofErr w:type="spellStart"/>
+      <w:r>
+        <w:rPr>
+          <w:rFonts w:ascii="Calibri" w:hAnsi="Calibri" w:cs="Calibri"/>
+        </w:rPr>
+        <w:t>Kimwarer</w:t>
+      </w:r>
+      <w:proofErr w:type="spellEnd"/>
+      <w:r>
+        <w:rPr>
+          <w:rFonts w:ascii="Calibri" w:hAnsi="Calibri" w:cs="Calibri"/>
+        </w:rPr>
+        <w:t xml:space="preserve">) where a small, pre-existing pond sits </w:t>
+      </w:r>
+      <w:proofErr w:type="gramStart"/>
+      <w:r>
+        <w:rPr>
+          <w:rFonts w:ascii="Calibri" w:hAnsi="Calibri" w:cs="Calibri"/>
+        </w:rPr>
+        <w:t>near</w:t>
+      </w:r>
+      <w:r>
+        <w:rPr>
+          <w:rFonts w:ascii="Calibri" w:hAnsi="Calibri" w:cs="Calibri"/>
+        </w:rPr>
+        <w:t xml:space="preserve">, </w:t>
+      </w:r>
+      <w:r>
+        <w:rPr>
+          <w:rFonts w:ascii="Calibri" w:hAnsi="Calibri" w:cs="Calibri"/>
+        </w:rPr>
+        <w:t>but</w:t>
+      </w:r>
+      <w:proofErr w:type="gramEnd"/>
+      <w:r>
+        <w:rPr>
+          <w:rFonts w:ascii="Calibri" w:hAnsi="Calibri" w:cs="Calibri"/>
+        </w:rPr>
+        <w:t xml:space="preserve"> is unrelated to the claimed dam site. A naive "is there water present" check would have misread this as partial evidence of a 215-hectare reservoir. We </w:t>
+      </w:r>
+      <w:proofErr w:type="gramStart"/>
+      <w:r>
+        <w:rPr>
+          <w:rFonts w:ascii="Calibri" w:hAnsi="Calibri" w:cs="Calibri"/>
+        </w:rPr>
+        <w:t>rebuilt</w:t>
+      </w:r>
+      <w:proofErr w:type="gramEnd"/>
+      <w:r>
+        <w:rPr>
+          <w:rFonts w:ascii="Calibri" w:hAnsi="Calibri" w:cs="Calibri"/>
+        </w:rPr>
+        <w:t xml:space="preserve"> the verdict logic to compare water added </w:t>
+      </w:r>
+      <w:r>
+        <w:rPr>
+          <w:rFonts w:ascii="Calibri" w:hAnsi="Calibri" w:cs="Calibri"/>
+          <w:i/>
+          <w:iCs/>
+        </w:rPr>
+        <w:t>since baseline</w:t>
+      </w:r>
+      <w:r>
+        <w:rPr>
+          <w:rFonts w:ascii="Calibri" w:hAnsi="Calibri" w:cs="Calibri"/>
+        </w:rPr>
+        <w:t xml:space="preserve"> against the project's actual design scale, specifically to catch this failure mode and it does.</w:t>
+      </w:r>
+    </w:p>
+    <w:p>
+      <w:pPr>
+        <w:numPr>
+          <w:ilvl w:val="0"/>
+          <w:numId w:val="19"/>
+        </w:numPr>
+        <w:jc w:val="both"/>
+        <w:rPr>
+          <w:rFonts w:ascii="Calibri" w:hAnsi="Calibri" w:cs="Calibri"/>
+        </w:rPr>
+      </w:pPr>
+      <w:r>
+        <w:rPr>
+          <w:rFonts w:ascii="Calibri" w:hAnsi="Calibri" w:cs="Calibri"/>
           <w:b/>
           <w:bCs/>
         </w:rPr>
-        <w:lastRenderedPageBreak/>
-        <w:t>Next steps</w:t>
-      </w:r>
-    </w:p>
-    <w:p>
-      <w:r>
-        <w:t>Build out road and stadium detection; replace circular buffers with real geometry; add a crowd-corroboration channel so citizens can supply ground-truth evidence for cases satellite imagery can't resolve alone (like boreholes); connect confirmed non-delivery cases to concrete actions — a template petition to the relevant county assembly, or a link to Kenya's Auditor-General or EACC reporting channels; build a low-bandwidth, multilingual (English/Swahili) frontend so the tool is usable without running code.</w:t>
-      </w:r>
-    </w:p>
-    <w:p>
-      <w:pPr>
-        <w:rPr>
+        <w:t>Coordinate verification before trusting any verdict.</w:t>
+      </w:r>
+      <w:r>
+        <w:rPr>
+          <w:rFonts w:ascii="Calibri" w:hAnsi="Calibri" w:cs="Calibri"/>
+        </w:rPr>
+        <w:t xml:space="preserve"> Over the course of building this, the </w:t>
+      </w:r>
+      <w:proofErr w:type="spellStart"/>
+      <w:r>
+        <w:rPr>
+          <w:rFonts w:ascii="Calibri" w:hAnsi="Calibri" w:cs="Calibri"/>
+        </w:rPr>
+        <w:t>Arror</w:t>
+      </w:r>
+      <w:proofErr w:type="spellEnd"/>
+      <w:r>
+        <w:rPr>
+          <w:rFonts w:ascii="Calibri" w:hAnsi="Calibri" w:cs="Calibri"/>
+        </w:rPr>
+        <w:t xml:space="preserve"> and </w:t>
+      </w:r>
+      <w:proofErr w:type="spellStart"/>
+      <w:r>
+        <w:rPr>
+          <w:rFonts w:ascii="Calibri" w:hAnsi="Calibri" w:cs="Calibri"/>
+        </w:rPr>
+        <w:t>Kimwarer</w:t>
+      </w:r>
+      <w:proofErr w:type="spellEnd"/>
+      <w:r>
+        <w:rPr>
+          <w:rFonts w:ascii="Calibri" w:hAnsi="Calibri" w:cs="Calibri"/>
+        </w:rPr>
+        <w:t xml:space="preserve"> site coordinates were revised three times from different sources before we had values we could visually confirm against real satellite imagery. We treat this as a design principle now, not an embarrassing footnote: every automated verdict in this submission was manually cross-checked against the raw satellite composite before being reported as fact, and the repository documents that check openly rather than presenting only the clean final answer.</w:t>
+      </w:r>
+    </w:p>
+    <w:p>
+      <w:pPr>
+        <w:rPr>
+          <w:rFonts w:ascii="Calibri" w:hAnsi="Calibri" w:cs="Calibri"/>
           <w:b/>
           <w:bCs/>
         </w:rPr>
       </w:pPr>
       <w:r>
         <w:rPr>
+          <w:rFonts w:ascii="Calibri" w:hAnsi="Calibri" w:cs="Calibri"/>
           <w:b/>
           <w:bCs/>
         </w:rPr>
+        <w:t>How we used AI tools</w:t>
+      </w:r>
+    </w:p>
+    <w:p>
+      <w:pPr>
+        <w:jc w:val="both"/>
+        <w:rPr>
+          <w:rFonts w:ascii="Calibri" w:hAnsi="Calibri" w:cs="Calibri"/>
+        </w:rPr>
+      </w:pPr>
+      <w:r>
+        <w:rPr>
+          <w:rFonts w:ascii="Calibri" w:hAnsi="Calibri" w:cs="Calibri"/>
+        </w:rPr>
+        <w:t>We used an AI coding assistant (Claude) throughout development, in a specific division of labor: the assistant wrote and iterated on the Google Earth Engine pipeline code (cloud masking, water index computation, the delta/guardrail logic, error debugging), while the core idea, case selection, source verification, and every accuracy judgment remained ours. Concretely:</w:t>
+      </w:r>
+    </w:p>
+    <w:p>
+      <w:pPr>
+        <w:numPr>
+          <w:ilvl w:val="0"/>
+          <w:numId w:val="20"/>
+        </w:numPr>
+        <w:jc w:val="both"/>
+        <w:rPr>
+          <w:rFonts w:ascii="Calibri" w:hAnsi="Calibri" w:cs="Calibri"/>
+        </w:rPr>
+      </w:pPr>
+      <w:r>
+        <w:rPr>
+          <w:rFonts w:ascii="Calibri" w:hAnsi="Calibri" w:cs="Calibri"/>
+        </w:rPr>
+        <w:t>The assistant produced the initial pipeline scaffold, then iteratively rewrote it as real bugs surfaced</w:t>
+      </w:r>
+      <w:r>
+        <w:rPr>
+          <w:rFonts w:ascii="Calibri" w:hAnsi="Calibri" w:cs="Calibri"/>
+        </w:rPr>
+        <w:t xml:space="preserve">, </w:t>
+      </w:r>
+      <w:r>
+        <w:rPr>
+          <w:rFonts w:ascii="Calibri" w:hAnsi="Calibri" w:cs="Calibri"/>
+        </w:rPr>
+        <w:t xml:space="preserve">a broken date-placeholder bug, an unquoted project-ID string causing a </w:t>
+      </w:r>
+      <w:proofErr w:type="spellStart"/>
+      <w:r>
+        <w:rPr>
+          <w:rFonts w:ascii="Calibri" w:hAnsi="Calibri" w:cs="Calibri"/>
+        </w:rPr>
+        <w:t>NameError</w:t>
+      </w:r>
+      <w:proofErr w:type="spellEnd"/>
+      <w:r>
+        <w:rPr>
+          <w:rFonts w:ascii="Calibri" w:hAnsi="Calibri" w:cs="Calibri"/>
+        </w:rPr>
+        <w:t>, and a missing-variable error in a table-building cell were each caught from real error output and fixed in place, not anticipated in advance.</w:t>
+      </w:r>
+    </w:p>
+    <w:p>
+      <w:pPr>
+        <w:numPr>
+          <w:ilvl w:val="0"/>
+          <w:numId w:val="20"/>
+        </w:numPr>
+        <w:jc w:val="both"/>
+        <w:rPr>
+          <w:rFonts w:ascii="Calibri" w:hAnsi="Calibri" w:cs="Calibri"/>
+        </w:rPr>
+      </w:pPr>
+      <w:r>
+        <w:rPr>
+          <w:rFonts w:ascii="Calibri" w:hAnsi="Calibri" w:cs="Calibri"/>
+        </w:rPr>
+        <w:t>When we noticed a coordinate discrepancy between two sourced locations for the same dam (a ~40km gap), the assistant flagged it rather than silently using either value, which led us to re-derive more precise coordinates from a NEMA UTM grid reference.</w:t>
+      </w:r>
+    </w:p>
+    <w:p>
+      <w:pPr>
+        <w:numPr>
+          <w:ilvl w:val="0"/>
+          <w:numId w:val="20"/>
+        </w:numPr>
+        <w:jc w:val="both"/>
+        <w:rPr>
+          <w:rFonts w:ascii="Calibri" w:hAnsi="Calibri" w:cs="Calibri"/>
+        </w:rPr>
+      </w:pPr>
+      <w:r>
+        <w:rPr>
+          <w:rFonts w:ascii="Calibri" w:hAnsi="Calibri" w:cs="Calibri"/>
+        </w:rPr>
+        <w:t>The assistant flagged a methodological gap on its own</w:t>
+      </w:r>
+      <w:r>
+        <w:rPr>
+          <w:rFonts w:ascii="Calibri" w:hAnsi="Calibri" w:cs="Calibri"/>
+        </w:rPr>
+        <w:t xml:space="preserve">, </w:t>
+      </w:r>
+      <w:r>
+        <w:rPr>
+          <w:rFonts w:ascii="Calibri" w:hAnsi="Calibri" w:cs="Calibri"/>
+        </w:rPr>
+        <w:t>the original guardrail compared raw current water extent rather than water added since baseline</w:t>
+      </w:r>
+      <w:r>
+        <w:rPr>
+          <w:rFonts w:ascii="Calibri" w:hAnsi="Calibri" w:cs="Calibri"/>
+        </w:rPr>
+        <w:t xml:space="preserve">, </w:t>
+      </w:r>
+      <w:r>
+        <w:rPr>
+          <w:rFonts w:ascii="Calibri" w:hAnsi="Calibri" w:cs="Calibri"/>
+        </w:rPr>
+        <w:t>before we had run the pipeline against a case where it would have mattered, and rebuilt the logic accordingly.</w:t>
+      </w:r>
+    </w:p>
+    <w:p>
+      <w:pPr>
+        <w:numPr>
+          <w:ilvl w:val="0"/>
+          <w:numId w:val="20"/>
+        </w:numPr>
+        <w:jc w:val="both"/>
+        <w:rPr>
+          <w:rFonts w:ascii="Calibri" w:hAnsi="Calibri" w:cs="Calibri"/>
+        </w:rPr>
+      </w:pPr>
+      <w:r>
+        <w:rPr>
+          <w:rFonts w:ascii="Calibri" w:hAnsi="Calibri" w:cs="Calibri"/>
+        </w:rPr>
+        <w:t>I</w:t>
+      </w:r>
+      <w:r>
+        <w:rPr>
+          <w:rFonts w:ascii="Calibri" w:hAnsi="Calibri" w:cs="Calibri"/>
+        </w:rPr>
+        <w:t xml:space="preserve"> independently verified every AI-assisted claim against primary evidence: the satellite thumbnails, the source articles, and the NEMA reservoir dimensions were all checked by us before being trusted, including catching a case (</w:t>
+      </w:r>
+      <w:proofErr w:type="spellStart"/>
+      <w:r>
+        <w:rPr>
+          <w:rFonts w:ascii="Calibri" w:hAnsi="Calibri" w:cs="Calibri"/>
+        </w:rPr>
+        <w:t>Kimwarer</w:t>
+      </w:r>
+      <w:proofErr w:type="spellEnd"/>
+      <w:r>
+        <w:rPr>
+          <w:rFonts w:ascii="Calibri" w:hAnsi="Calibri" w:cs="Calibri"/>
+        </w:rPr>
+        <w:t>) where an AI-drafted case note said a dam "did not exist" when the more precise, verifiable claim was "no water at the scale of the claimed project."</w:t>
+      </w:r>
+    </w:p>
+    <w:p>
+      <w:pPr>
+        <w:jc w:val="both"/>
+        <w:rPr>
+          <w:rFonts w:ascii="Calibri" w:hAnsi="Calibri" w:cs="Calibri"/>
+        </w:rPr>
+      </w:pPr>
+      <w:r>
+        <w:rPr>
+          <w:rFonts w:ascii="Calibri" w:hAnsi="Calibri" w:cs="Calibri"/>
+        </w:rPr>
+        <w:lastRenderedPageBreak/>
+        <w:t xml:space="preserve">The idea, the choice to build a delta/guardrail-based verifier rather than a simple presence check, and the specific Kenyan case studies are our own; AI tools accelerated implementation and caught our own errors faster than manual debugging would </w:t>
+      </w:r>
+      <w:r>
+        <w:rPr>
+          <w:rFonts w:ascii="Calibri" w:hAnsi="Calibri" w:cs="Calibri"/>
+        </w:rPr>
+        <w:t>have but</w:t>
+      </w:r>
+      <w:r>
+        <w:rPr>
+          <w:rFonts w:ascii="Calibri" w:hAnsi="Calibri" w:cs="Calibri"/>
+        </w:rPr>
+        <w:t xml:space="preserve"> did not originate the capstone concept.</w:t>
+      </w:r>
+    </w:p>
+    <w:p>
+      <w:pPr>
+        <w:rPr>
+          <w:rFonts w:ascii="Calibri" w:hAnsi="Calibri" w:cs="Calibri"/>
+          <w:b/>
+          <w:bCs/>
+        </w:rPr>
+      </w:pPr>
+      <w:r>
+        <w:rPr>
+          <w:rFonts w:ascii="Calibri" w:hAnsi="Calibri" w:cs="Calibri"/>
+          <w:b/>
+          <w:bCs/>
+        </w:rPr>
         <w:t>Repository</w:t>
       </w:r>
     </w:p>
     <w:p>
-      <w:r>
-        <w:t>[Insert your GitHub repo link here]</w:t>
-      </w:r>
-    </w:p>
-    <w:p/>
+      <w:pPr>
+        <w:rPr>
+          <w:rFonts w:ascii="Calibri" w:hAnsi="Calibri" w:cs="Calibri"/>
+        </w:rPr>
+      </w:pPr>
+      <w:r>
+        <w:rPr>
+          <w:rFonts w:ascii="Calibri" w:hAnsi="Calibri" w:cs="Calibri"/>
+        </w:rPr>
+        <w:t>https://github.com/Bmaina/PromiseWatch</w:t>
+      </w:r>
+    </w:p>
+    <w:p>
+      <w:pPr>
+        <w:rPr>
+          <w:rFonts w:ascii="Calibri" w:hAnsi="Calibri" w:cs="Calibri"/>
+        </w:rPr>
+      </w:pPr>
+    </w:p>
     <w:sectPr>
+      <w:footerReference w:type="default" r:id="rId7"/>
       <w:pgSz w:w="12240" w:h="15840"/>
       <w:pgMar w:top="1440" w:right="1440" w:bottom="1440" w:left="1440" w:header="720" w:footer="720" w:gutter="0"/>
       <w:cols w:space="720"/>
@@ -490,9 +1892,225 @@
 </w:document>
 </file>
 
+<file path=word/endnotes.xml><?xml version="1.0" encoding="utf-8"?>
+<w:endnotes xmlns:wpc="http://schemas.microsoft.com/office/word/2010/wordprocessingCanvas" xmlns:cx="http://schemas.microsoft.com/office/drawing/2014/chartex" xmlns:cx1="http://schemas.microsoft.com/office/drawing/2015/9/8/chartex" xmlns:cx2="http://schemas.microsoft.com/office/drawing/2015/10/21/chartex" xmlns:cx3="http://schemas.microsoft.com/office/drawing/2016/5/9/chartex" xmlns:cx4="http://schemas.microsoft.com/office/drawing/2016/5/10/chartex" xmlns:cx5="http://schemas.microsoft.com/office/drawing/2016/5/11/chartex" xmlns:cx6="http://schemas.microsoft.com/office/drawing/2016/5/12/chartex" xmlns:cx7="http://schemas.microsoft.com/office/drawing/2016/5/13/chartex" xmlns:cx8="http://schemas.microsoft.com/office/drawing/2016/5/14/chartex" xmlns:mc="http://schemas.openxmlformats.org/markup-compatibility/2006" xmlns:aink="http://schemas.microsoft.com/office/drawing/2016/ink" xmlns:am3d="http://schemas.microsoft.com/office/drawing/2017/model3d" xmlns:o="urn:schemas-microsoft-com:office:office" xmlns:oel="http://schemas.microsoft.com/office/2019/extlst" xmlns:r="http://schemas.openxmlformats.org/officeDocument/2006/relationships" xmlns:m="http://schemas.openxmlformats.org/officeDocument/2006/math" xmlns:v="urn:schemas-microsoft-com:vml" xmlns:wp14="http://schemas.microsoft.com/office/word/2010/wordprocessingDrawing" xmlns:wp="http://schemas.openxmlformats.org/drawingml/2006/wordprocessingDrawing" xmlns:w10="urn:schemas-microsoft-com:office:word" xmlns:w="http://schemas.openxmlformats.org/wordprocessingml/2006/main" xmlns:w14="http://schemas.microsoft.com/office/word/2010/wordml" xmlns:w15="http://schemas.microsoft.com/office/word/2012/wordml" xmlns:w16cex="http://schemas.microsoft.com/office/word/2018/wordml/cex" xmlns:w16cid="http://schemas.microsoft.com/office/word/2016/wordml/cid" xmlns:w16="http://schemas.microsoft.com/office/word/2018/wordml" xmlns:w16du="http://schemas.microsoft.com/office/word/2023/wordml/word16du" xmlns:w16sdtdh="http://schemas.microsoft.com/office/word/2020/wordml/sdtdatahash" xmlns:w16sdtfl="http://schemas.microsoft.com/office/word/2024/wordml/sdtformatlock" xmlns:w16se="http://schemas.microsoft.com/office/word/2015/wordml/symex" xmlns:wpg="http://schemas.microsoft.com/office/word/2010/wordprocessingGroup" xmlns:wpi="http://schemas.microsoft.com/office/word/2010/wordprocessingInk" xmlns:wne="http://schemas.microsoft.com/office/word/2006/wordml" xmlns:wps="http://schemas.microsoft.com/office/word/2010/wordprocessingShape" mc:Ignorable="w14 w15 w16se w16cid w16 w16cex w16sdtdh w16sdtfl w16du wp14">
+  <w:endnote w:type="separator" w:id="-1">
+    <w:p>
+      <w:pPr>
+        <w:spacing w:after="0" w:line="240" w:lineRule="auto"/>
+      </w:pPr>
+      <w:r>
+        <w:separator/>
+      </w:r>
+    </w:p>
+  </w:endnote>
+  <w:endnote w:type="continuationSeparator" w:id="0">
+    <w:p>
+      <w:pPr>
+        <w:spacing w:after="0" w:line="240" w:lineRule="auto"/>
+      </w:pPr>
+      <w:r>
+        <w:continuationSeparator/>
+      </w:r>
+    </w:p>
+  </w:endnote>
+</w:endnotes>
+</file>
+
+<file path=word/footer1.xml><?xml version="1.0" encoding="utf-8"?>
+<w:ftr xmlns:wpc="http://schemas.microsoft.com/office/word/2010/wordprocessingCanvas" xmlns:cx="http://schemas.microsoft.com/office/drawing/2014/chartex" xmlns:cx1="http://schemas.microsoft.com/office/drawing/2015/9/8/chartex" xmlns:cx2="http://schemas.microsoft.com/office/drawing/2015/10/21/chartex" xmlns:cx3="http://schemas.microsoft.com/office/drawing/2016/5/9/chartex" xmlns:cx4="http://schemas.microsoft.com/office/drawing/2016/5/10/chartex" xmlns:cx5="http://schemas.microsoft.com/office/drawing/2016/5/11/chartex" xmlns:cx6="http://schemas.microsoft.com/office/drawing/2016/5/12/chartex" xmlns:cx7="http://schemas.microsoft.com/office/drawing/2016/5/13/chartex" xmlns:cx8="http://schemas.microsoft.com/office/drawing/2016/5/14/chartex" xmlns:mc="http://schemas.openxmlformats.org/markup-compatibility/2006" xmlns:aink="http://schemas.microsoft.com/office/drawing/2016/ink" xmlns:am3d="http://schemas.microsoft.com/office/drawing/2017/model3d" xmlns:o="urn:schemas-microsoft-com:office:office" xmlns:oel="http://schemas.microsoft.com/office/2019/extlst" xmlns:r="http://schemas.openxmlformats.org/officeDocument/2006/relationships" xmlns:m="http://schemas.openxmlformats.org/officeDocument/2006/math" xmlns:v="urn:schemas-microsoft-com:vml" xmlns:wp14="http://schemas.microsoft.com/office/word/2010/wordprocessingDrawing" xmlns:wp="http://schemas.openxmlformats.org/drawingml/2006/wordprocessingDrawing" xmlns:w10="urn:schemas-microsoft-com:office:word" xmlns:w="http://schemas.openxmlformats.org/wordprocessingml/2006/main" xmlns:w14="http://schemas.microsoft.com/office/word/2010/wordml" xmlns:w15="http://schemas.microsoft.com/office/word/2012/wordml" xmlns:w16cex="http://schemas.microsoft.com/office/word/2018/wordml/cex" xmlns:w16cid="http://schemas.microsoft.com/office/word/2016/wordml/cid" xmlns:w16="http://schemas.microsoft.com/office/word/2018/wordml" xmlns:w16du="http://schemas.microsoft.com/office/word/2023/wordml/word16du" xmlns:w16sdtdh="http://schemas.microsoft.com/office/word/2020/wordml/sdtdatahash" xmlns:w16sdtfl="http://schemas.microsoft.com/office/word/2024/wordml/sdtformatlock" xmlns:w16se="http://schemas.microsoft.com/office/word/2015/wordml/symex" xmlns:wpg="http://schemas.microsoft.com/office/word/2010/wordprocessingGroup" xmlns:wpi="http://schemas.microsoft.com/office/word/2010/wordprocessingInk" xmlns:wne="http://schemas.microsoft.com/office/word/2006/wordml" xmlns:wps="http://schemas.microsoft.com/office/word/2010/wordprocessingShape" mc:Ignorable="w14 w15 w16se w16cid w16 w16cex w16sdtdh w16sdtfl w16du wp14">
+  <w:sdt>
+    <w:sdtPr>
+      <w:id w:val="-393277519"/>
+      <w:docPartObj>
+        <w:docPartGallery w:val="Page Numbers (Bottom of Page)"/>
+        <w:docPartUnique/>
+      </w:docPartObj>
+    </w:sdtPr>
+    <w:sdtEndPr>
+      <w:rPr>
+        <w:noProof/>
+      </w:rPr>
+    </w:sdtEndPr>
+    <w:sdtContent>
+      <w:p>
+        <w:pPr>
+          <w:pStyle w:val="Footer"/>
+          <w:jc w:val="right"/>
+        </w:pPr>
+        <w:r>
+          <w:fldChar w:fldCharType="begin"/>
+        </w:r>
+        <w:r>
+          <w:instrText xml:space="preserve"> PAGE   \* MERGEFORMAT </w:instrText>
+        </w:r>
+        <w:r>
+          <w:fldChar w:fldCharType="separate"/>
+        </w:r>
+        <w:r>
+          <w:rPr>
+            <w:noProof/>
+          </w:rPr>
+          <w:t>2</w:t>
+        </w:r>
+        <w:r>
+          <w:rPr>
+            <w:noProof/>
+          </w:rPr>
+          <w:fldChar w:fldCharType="end"/>
+        </w:r>
+      </w:p>
+    </w:sdtContent>
+  </w:sdt>
+  <w:p>
+    <w:pPr>
+      <w:pStyle w:val="Footer"/>
+    </w:pPr>
+  </w:p>
+</w:ftr>
+</file>
+
+<file path=word/footnotes.xml><?xml version="1.0" encoding="utf-8"?>
+<w:footnotes xmlns:wpc="http://schemas.microsoft.com/office/word/2010/wordprocessingCanvas" xmlns:cx="http://schemas.microsoft.com/office/drawing/2014/chartex" xmlns:cx1="http://schemas.microsoft.com/office/drawing/2015/9/8/chartex" xmlns:cx2="http://schemas.microsoft.com/office/drawing/2015/10/21/chartex" xmlns:cx3="http://schemas.microsoft.com/office/drawing/2016/5/9/chartex" xmlns:cx4="http://schemas.microsoft.com/office/drawing/2016/5/10/chartex" xmlns:cx5="http://schemas.microsoft.com/office/drawing/2016/5/11/chartex" xmlns:cx6="http://schemas.microsoft.com/office/drawing/2016/5/12/chartex" xmlns:cx7="http://schemas.microsoft.com/office/drawing/2016/5/13/chartex" xmlns:cx8="http://schemas.microsoft.com/office/drawing/2016/5/14/chartex" xmlns:mc="http://schemas.openxmlformats.org/markup-compatibility/2006" xmlns:aink="http://schemas.microsoft.com/office/drawing/2016/ink" xmlns:am3d="http://schemas.microsoft.com/office/drawing/2017/model3d" xmlns:o="urn:schemas-microsoft-com:office:office" xmlns:oel="http://schemas.microsoft.com/office/2019/extlst" xmlns:r="http://schemas.openxmlformats.org/officeDocument/2006/relationships" xmlns:m="http://schemas.openxmlformats.org/officeDocument/2006/math" xmlns:v="urn:schemas-microsoft-com:vml" xmlns:wp14="http://schemas.microsoft.com/office/word/2010/wordprocessingDrawing" xmlns:wp="http://schemas.openxmlformats.org/drawingml/2006/wordprocessingDrawing" xmlns:w10="urn:schemas-microsoft-com:office:word" xmlns:w="http://schemas.openxmlformats.org/wordprocessingml/2006/main" xmlns:w14="http://schemas.microsoft.com/office/word/2010/wordml" xmlns:w15="http://schemas.microsoft.com/office/word/2012/wordml" xmlns:w16cex="http://schemas.microsoft.com/office/word/2018/wordml/cex" xmlns:w16cid="http://schemas.microsoft.com/office/word/2016/wordml/cid" xmlns:w16="http://schemas.microsoft.com/office/word/2018/wordml" xmlns:w16du="http://schemas.microsoft.com/office/word/2023/wordml/word16du" xmlns:w16sdtdh="http://schemas.microsoft.com/office/word/2020/wordml/sdtdatahash" xmlns:w16sdtfl="http://schemas.microsoft.com/office/word/2024/wordml/sdtformatlock" xmlns:w16se="http://schemas.microsoft.com/office/word/2015/wordml/symex" xmlns:wpg="http://schemas.microsoft.com/office/word/2010/wordprocessingGroup" xmlns:wpi="http://schemas.microsoft.com/office/word/2010/wordprocessingInk" xmlns:wne="http://schemas.microsoft.com/office/word/2006/wordml" xmlns:wps="http://schemas.microsoft.com/office/word/2010/wordprocessingShape" mc:Ignorable="w14 w15 w16se w16cid w16 w16cex w16sdtdh w16sdtfl w16du wp14">
+  <w:footnote w:type="separator" w:id="-1">
+    <w:p>
+      <w:pPr>
+        <w:spacing w:after="0" w:line="240" w:lineRule="auto"/>
+      </w:pPr>
+      <w:r>
+        <w:separator/>
+      </w:r>
+    </w:p>
+  </w:footnote>
+  <w:footnote w:type="continuationSeparator" w:id="0">
+    <w:p>
+      <w:pPr>
+        <w:spacing w:after="0" w:line="240" w:lineRule="auto"/>
+      </w:pPr>
+      <w:r>
+        <w:continuationSeparator/>
+      </w:r>
+    </w:p>
+  </w:footnote>
+</w:footnotes>
+</file>
+
 <file path=word/numbering.xml><?xml version="1.0" encoding="utf-8"?>
-<w:numbering xmlns:wpc="http://schemas.microsoft.com/office/word/2010/wordprocessingCanvas" xmlns:cx="http://schemas.microsoft.com/office/drawing/2014/chartex" xmlns:cx1="http://schemas.microsoft.com/office/drawing/2015/9/8/chartex" xmlns:cx2="http://schemas.microsoft.com/office/drawing/2015/10/21/chartex" xmlns:cx3="http://schemas.microsoft.com/office/drawing/2016/5/9/chartex" xmlns:cx4="http://schemas.microsoft.com/office/drawing/2016/5/10/chartex" xmlns:cx5="http://schemas.microsoft.com/office/drawing/2016/5/11/chartex" xmlns:cx6="http://schemas.microsoft.com/office/drawing/2016/5/12/chartex" xmlns:cx7="http://schemas.microsoft.com/office/drawing/2016/5/13/chartex" xmlns:cx8="http://schemas.microsoft.com/office/drawing/2016/5/14/chartex" xmlns:mc="http://schemas.openxmlformats.org/markup-compatibility/2006" xmlns:aink="http://schemas.microsoft.com/office/drawing/2016/ink" xmlns:am3d="http://schemas.microsoft.com/office/drawing/2017/model3d" xmlns:o="urn:schemas-microsoft-com:office:office" xmlns:oel="http://schemas.microsoft.com/office/2019/extlst" xmlns:r="http://schemas.openxmlformats.org/officeDocument/2006/relationships" xmlns:m="http://schemas.openxmlformats.org/officeDocument/2006/math" xmlns:v="urn:schemas-microsoft-com:vml" xmlns:wp14="http://schemas.microsoft.com/office/word/2010/wordprocessingDrawing" xmlns:wp="http://schemas.openxmlformats.org/drawingml/2006/wordprocessingDrawing" xmlns:w10="urn:schemas-microsoft-com:office:word" xmlns:w="http://schemas.openxmlformats.org/wordprocessingml/2006/main" xmlns:w14="http://schemas.microsoft.com/office/word/2010/wordml" xmlns:w15="http://schemas.microsoft.com/office/word/2012/wordml" xmlns:w16cei="http://schemas.microsoft.com/office/word/2026/wordml/cei" xmlns:w16cex="http://schemas.microsoft.com/office/word/2018/wordml/cex" xmlns:w16cid="http://schemas.microsoft.com/office/word/2016/wordml/cid" xmlns:w16="http://schemas.microsoft.com/office/word/2018/wordml" xmlns:w16du="http://schemas.microsoft.com/office/word/2023/wordml/word16du" xmlns:w16sdtdh="http://schemas.microsoft.com/office/word/2020/wordml/sdtdatahash" xmlns:w16sdtfl="http://schemas.microsoft.com/office/word/2024/wordml/sdtformatlock" xmlns:w16se="http://schemas.microsoft.com/office/word/2015/wordml/symex" xmlns:wpg="http://schemas.microsoft.com/office/word/2010/wordprocessingGroup" xmlns:wpi="http://schemas.microsoft.com/office/word/2010/wordprocessingInk" xmlns:wne="http://schemas.microsoft.com/office/word/2006/wordml" xmlns:wps="http://schemas.microsoft.com/office/word/2010/wordprocessingShape" mc:Ignorable="w14 w15 w16se w16cid w16 w16cex w16sdtdh w16sdtfl w16du wp14">
+<w:numbering xmlns:wpc="http://schemas.microsoft.com/office/word/2010/wordprocessingCanvas" xmlns:cx="http://schemas.microsoft.com/office/drawing/2014/chartex" xmlns:cx1="http://schemas.microsoft.com/office/drawing/2015/9/8/chartex" xmlns:cx2="http://schemas.microsoft.com/office/drawing/2015/10/21/chartex" xmlns:cx3="http://schemas.microsoft.com/office/drawing/2016/5/9/chartex" xmlns:cx4="http://schemas.microsoft.com/office/drawing/2016/5/10/chartex" xmlns:cx5="http://schemas.microsoft.com/office/drawing/2016/5/11/chartex" xmlns:cx6="http://schemas.microsoft.com/office/drawing/2016/5/12/chartex" xmlns:cx7="http://schemas.microsoft.com/office/drawing/2016/5/13/chartex" xmlns:cx8="http://schemas.microsoft.com/office/drawing/2016/5/14/chartex" xmlns:mc="http://schemas.openxmlformats.org/markup-compatibility/2006" xmlns:aink="http://schemas.microsoft.com/office/drawing/2016/ink" xmlns:am3d="http://schemas.microsoft.com/office/drawing/2017/model3d" xmlns:o="urn:schemas-microsoft-com:office:office" xmlns:oel="http://schemas.microsoft.com/office/2019/extlst" xmlns:r="http://schemas.openxmlformats.org/officeDocument/2006/relationships" xmlns:m="http://schemas.openxmlformats.org/officeDocument/2006/math" xmlns:v="urn:schemas-microsoft-com:vml" xmlns:wp14="http://schemas.microsoft.com/office/word/2010/wordprocessingDrawing" xmlns:wp="http://schemas.openxmlformats.org/drawingml/2006/wordprocessingDrawing" xmlns:w10="urn:schemas-microsoft-com:office:word" xmlns:w="http://schemas.openxmlformats.org/wordprocessingml/2006/main" xmlns:w14="http://schemas.microsoft.com/office/word/2010/wordml" xmlns:w15="http://schemas.microsoft.com/office/word/2012/wordml" xmlns:w16cex="http://schemas.microsoft.com/office/word/2018/wordml/cex" xmlns:w16cid="http://schemas.microsoft.com/office/word/2016/wordml/cid" xmlns:w16="http://schemas.microsoft.com/office/word/2018/wordml" xmlns:w16du="http://schemas.microsoft.com/office/word/2023/wordml/word16du" xmlns:w16sdtdh="http://schemas.microsoft.com/office/word/2020/wordml/sdtdatahash" xmlns:w16sdtfl="http://schemas.microsoft.com/office/word/2024/wordml/sdtformatlock" xmlns:w16se="http://schemas.microsoft.com/office/word/2015/wordml/symex" xmlns:wpg="http://schemas.microsoft.com/office/word/2010/wordprocessingGroup" xmlns:wpi="http://schemas.microsoft.com/office/word/2010/wordprocessingInk" xmlns:wne="http://schemas.microsoft.com/office/word/2006/wordml" xmlns:wps="http://schemas.microsoft.com/office/word/2010/wordprocessingShape" mc:Ignorable="w14 w15 w16se w16cid w16 w16cex w16sdtdh w16sdtfl w16du wp14">
   <w:abstractNum w:abstractNumId="0" w15:restartNumberingAfterBreak="0">
+    <w:nsid w:val="0B637780"/>
+    <w:multiLevelType w:val="multilevel"/>
+    <w:tmpl w:val="95763B8A"/>
+    <w:lvl w:ilvl="0">
+      <w:start w:val="1"/>
+      <w:numFmt w:val="decimal"/>
+      <w:lvlText w:val="%1."/>
+      <w:lvlJc w:val="left"/>
+      <w:pPr>
+        <w:tabs>
+          <w:tab w:val="num" w:pos="720"/>
+        </w:tabs>
+        <w:ind w:left="720" w:hanging="360"/>
+      </w:pPr>
+    </w:lvl>
+    <w:lvl w:ilvl="1" w:tentative="1">
+      <w:start w:val="1"/>
+      <w:numFmt w:val="decimal"/>
+      <w:lvlText w:val="%2."/>
+      <w:lvlJc w:val="left"/>
+      <w:pPr>
+        <w:tabs>
+          <w:tab w:val="num" w:pos="1440"/>
+        </w:tabs>
+        <w:ind w:left="1440" w:hanging="360"/>
+      </w:pPr>
+    </w:lvl>
+    <w:lvl w:ilvl="2" w:tentative="1">
+      <w:start w:val="1"/>
+      <w:numFmt w:val="decimal"/>
+      <w:lvlText w:val="%3."/>
+      <w:lvlJc w:val="left"/>
+      <w:pPr>
+        <w:tabs>
+          <w:tab w:val="num" w:pos="2160"/>
+        </w:tabs>
+        <w:ind w:left="2160" w:hanging="360"/>
+      </w:pPr>
+    </w:lvl>
+    <w:lvl w:ilvl="3" w:tentative="1">
+      <w:start w:val="1"/>
+      <w:numFmt w:val="decimal"/>
+      <w:lvlText w:val="%4."/>
+      <w:lvlJc w:val="left"/>
+      <w:pPr>
+        <w:tabs>
+          <w:tab w:val="num" w:pos="2880"/>
+        </w:tabs>
+        <w:ind w:left="2880" w:hanging="360"/>
+      </w:pPr>
+    </w:lvl>
+    <w:lvl w:ilvl="4" w:tentative="1">
+      <w:start w:val="1"/>
+      <w:numFmt w:val="decimal"/>
+      <w:lvlText w:val="%5."/>
+      <w:lvlJc w:val="left"/>
+      <w:pPr>
+        <w:tabs>
+          <w:tab w:val="num" w:pos="3600"/>
+        </w:tabs>
+        <w:ind w:left="3600" w:hanging="360"/>
+      </w:pPr>
+    </w:lvl>
+    <w:lvl w:ilvl="5" w:tentative="1">
+      <w:start w:val="1"/>
+      <w:numFmt w:val="decimal"/>
+      <w:lvlText w:val="%6."/>
+      <w:lvlJc w:val="left"/>
+      <w:pPr>
+        <w:tabs>
+          <w:tab w:val="num" w:pos="4320"/>
+        </w:tabs>
+        <w:ind w:left="4320" w:hanging="360"/>
+      </w:pPr>
+    </w:lvl>
+    <w:lvl w:ilvl="6" w:tentative="1">
+      <w:start w:val="1"/>
+      <w:numFmt w:val="decimal"/>
+      <w:lvlText w:val="%7."/>
+      <w:lvlJc w:val="left"/>
+      <w:pPr>
+        <w:tabs>
+          <w:tab w:val="num" w:pos="5040"/>
+        </w:tabs>
+        <w:ind w:left="5040" w:hanging="360"/>
+      </w:pPr>
+    </w:lvl>
+    <w:lvl w:ilvl="7" w:tentative="1">
+      <w:start w:val="1"/>
+      <w:numFmt w:val="decimal"/>
+      <w:lvlText w:val="%8."/>
+      <w:lvlJc w:val="left"/>
+      <w:pPr>
+        <w:tabs>
+          <w:tab w:val="num" w:pos="5760"/>
+        </w:tabs>
+        <w:ind w:left="5760" w:hanging="360"/>
+      </w:pPr>
+    </w:lvl>
+    <w:lvl w:ilvl="8" w:tentative="1">
+      <w:start w:val="1"/>
+      <w:numFmt w:val="decimal"/>
+      <w:lvlText w:val="%9."/>
+      <w:lvlJc w:val="left"/>
+      <w:pPr>
+        <w:tabs>
+          <w:tab w:val="num" w:pos="6480"/>
+        </w:tabs>
+        <w:ind w:left="6480" w:hanging="360"/>
+      </w:pPr>
+    </w:lvl>
+  </w:abstractNum>
+  <w:abstractNum w:abstractNumId="1" w15:restartNumberingAfterBreak="0">
     <w:nsid w:val="12184AA4"/>
     <w:multiLevelType w:val="multilevel"/>
     <w:tmpl w:val="5C024606"/>
@@ -605,7 +2223,531 @@
       </w:pPr>
     </w:lvl>
   </w:abstractNum>
-  <w:abstractNum w:abstractNumId="1" w15:restartNumberingAfterBreak="0">
+  <w:abstractNum w:abstractNumId="2" w15:restartNumberingAfterBreak="0">
+    <w:nsid w:val="127E1446"/>
+    <w:multiLevelType w:val="multilevel"/>
+    <w:tmpl w:val="CB2E2E48"/>
+    <w:lvl w:ilvl="0">
+      <w:start w:val="1"/>
+      <w:numFmt w:val="bullet"/>
+      <w:lvlText w:val=""/>
+      <w:lvlJc w:val="left"/>
+      <w:pPr>
+        <w:tabs>
+          <w:tab w:val="num" w:pos="720"/>
+        </w:tabs>
+        <w:ind w:left="720" w:hanging="360"/>
+      </w:pPr>
+      <w:rPr>
+        <w:rFonts w:ascii="Symbol" w:hAnsi="Symbol" w:hint="default"/>
+        <w:sz w:val="20"/>
+      </w:rPr>
+    </w:lvl>
+    <w:lvl w:ilvl="1" w:tentative="1">
+      <w:start w:val="1"/>
+      <w:numFmt w:val="bullet"/>
+      <w:lvlText w:val="o"/>
+      <w:lvlJc w:val="left"/>
+      <w:pPr>
+        <w:tabs>
+          <w:tab w:val="num" w:pos="1440"/>
+        </w:tabs>
+        <w:ind w:left="1440" w:hanging="360"/>
+      </w:pPr>
+      <w:rPr>
+        <w:rFonts w:ascii="Courier New" w:hAnsi="Courier New" w:hint="default"/>
+        <w:sz w:val="20"/>
+      </w:rPr>
+    </w:lvl>
+    <w:lvl w:ilvl="2" w:tentative="1">
+      <w:start w:val="1"/>
+      <w:numFmt w:val="bullet"/>
+      <w:lvlText w:val=""/>
+      <w:lvlJc w:val="left"/>
+      <w:pPr>
+        <w:tabs>
+          <w:tab w:val="num" w:pos="2160"/>
+        </w:tabs>
+        <w:ind w:left="2160" w:hanging="360"/>
+      </w:pPr>
+      <w:rPr>
+        <w:rFonts w:ascii="Wingdings" w:hAnsi="Wingdings" w:hint="default"/>
+        <w:sz w:val="20"/>
+      </w:rPr>
+    </w:lvl>
+    <w:lvl w:ilvl="3" w:tentative="1">
+      <w:start w:val="1"/>
+      <w:numFmt w:val="bullet"/>
+      <w:lvlText w:val=""/>
+      <w:lvlJc w:val="left"/>
+      <w:pPr>
+        <w:tabs>
+          <w:tab w:val="num" w:pos="2880"/>
+        </w:tabs>
+        <w:ind w:left="2880" w:hanging="360"/>
+      </w:pPr>
+      <w:rPr>
+        <w:rFonts w:ascii="Wingdings" w:hAnsi="Wingdings" w:hint="default"/>
+        <w:sz w:val="20"/>
+      </w:rPr>
+    </w:lvl>
+    <w:lvl w:ilvl="4" w:tentative="1">
+      <w:start w:val="1"/>
+      <w:numFmt w:val="bullet"/>
+      <w:lvlText w:val=""/>
+      <w:lvlJc w:val="left"/>
+      <w:pPr>
+        <w:tabs>
+          <w:tab w:val="num" w:pos="3600"/>
+        </w:tabs>
+        <w:ind w:left="3600" w:hanging="360"/>
+      </w:pPr>
+      <w:rPr>
+        <w:rFonts w:ascii="Wingdings" w:hAnsi="Wingdings" w:hint="default"/>
+        <w:sz w:val="20"/>
+      </w:rPr>
+    </w:lvl>
+    <w:lvl w:ilvl="5" w:tentative="1">
+      <w:start w:val="1"/>
+      <w:numFmt w:val="bullet"/>
+      <w:lvlText w:val=""/>
+      <w:lvlJc w:val="left"/>
+      <w:pPr>
+        <w:tabs>
+          <w:tab w:val="num" w:pos="4320"/>
+        </w:tabs>
+        <w:ind w:left="4320" w:hanging="360"/>
+      </w:pPr>
+      <w:rPr>
+        <w:rFonts w:ascii="Wingdings" w:hAnsi="Wingdings" w:hint="default"/>
+        <w:sz w:val="20"/>
+      </w:rPr>
+    </w:lvl>
+    <w:lvl w:ilvl="6" w:tentative="1">
+      <w:start w:val="1"/>
+      <w:numFmt w:val="bullet"/>
+      <w:lvlText w:val=""/>
+      <w:lvlJc w:val="left"/>
+      <w:pPr>
+        <w:tabs>
+          <w:tab w:val="num" w:pos="5040"/>
+        </w:tabs>
+        <w:ind w:left="5040" w:hanging="360"/>
+      </w:pPr>
+      <w:rPr>
+        <w:rFonts w:ascii="Wingdings" w:hAnsi="Wingdings" w:hint="default"/>
+        <w:sz w:val="20"/>
+      </w:rPr>
+    </w:lvl>
+    <w:lvl w:ilvl="7" w:tentative="1">
+      <w:start w:val="1"/>
+      <w:numFmt w:val="bullet"/>
+      <w:lvlText w:val=""/>
+      <w:lvlJc w:val="left"/>
+      <w:pPr>
+        <w:tabs>
+          <w:tab w:val="num" w:pos="5760"/>
+        </w:tabs>
+        <w:ind w:left="5760" w:hanging="360"/>
+      </w:pPr>
+      <w:rPr>
+        <w:rFonts w:ascii="Wingdings" w:hAnsi="Wingdings" w:hint="default"/>
+        <w:sz w:val="20"/>
+      </w:rPr>
+    </w:lvl>
+    <w:lvl w:ilvl="8" w:tentative="1">
+      <w:start w:val="1"/>
+      <w:numFmt w:val="bullet"/>
+      <w:lvlText w:val=""/>
+      <w:lvlJc w:val="left"/>
+      <w:pPr>
+        <w:tabs>
+          <w:tab w:val="num" w:pos="6480"/>
+        </w:tabs>
+        <w:ind w:left="6480" w:hanging="360"/>
+      </w:pPr>
+      <w:rPr>
+        <w:rFonts w:ascii="Wingdings" w:hAnsi="Wingdings" w:hint="default"/>
+        <w:sz w:val="20"/>
+      </w:rPr>
+    </w:lvl>
+  </w:abstractNum>
+  <w:abstractNum w:abstractNumId="3" w15:restartNumberingAfterBreak="0">
+    <w:nsid w:val="186F05C4"/>
+    <w:multiLevelType w:val="multilevel"/>
+    <w:tmpl w:val="C42073E2"/>
+    <w:lvl w:ilvl="0">
+      <w:start w:val="1"/>
+      <w:numFmt w:val="decimal"/>
+      <w:lvlText w:val="%1."/>
+      <w:lvlJc w:val="left"/>
+      <w:pPr>
+        <w:tabs>
+          <w:tab w:val="num" w:pos="720"/>
+        </w:tabs>
+        <w:ind w:left="720" w:hanging="360"/>
+      </w:pPr>
+    </w:lvl>
+    <w:lvl w:ilvl="1" w:tentative="1">
+      <w:start w:val="1"/>
+      <w:numFmt w:val="decimal"/>
+      <w:lvlText w:val="%2."/>
+      <w:lvlJc w:val="left"/>
+      <w:pPr>
+        <w:tabs>
+          <w:tab w:val="num" w:pos="1440"/>
+        </w:tabs>
+        <w:ind w:left="1440" w:hanging="360"/>
+      </w:pPr>
+    </w:lvl>
+    <w:lvl w:ilvl="2" w:tentative="1">
+      <w:start w:val="1"/>
+      <w:numFmt w:val="decimal"/>
+      <w:lvlText w:val="%3."/>
+      <w:lvlJc w:val="left"/>
+      <w:pPr>
+        <w:tabs>
+          <w:tab w:val="num" w:pos="2160"/>
+        </w:tabs>
+        <w:ind w:left="2160" w:hanging="360"/>
+      </w:pPr>
+    </w:lvl>
+    <w:lvl w:ilvl="3" w:tentative="1">
+      <w:start w:val="1"/>
+      <w:numFmt w:val="decimal"/>
+      <w:lvlText w:val="%4."/>
+      <w:lvlJc w:val="left"/>
+      <w:pPr>
+        <w:tabs>
+          <w:tab w:val="num" w:pos="2880"/>
+        </w:tabs>
+        <w:ind w:left="2880" w:hanging="360"/>
+      </w:pPr>
+    </w:lvl>
+    <w:lvl w:ilvl="4" w:tentative="1">
+      <w:start w:val="1"/>
+      <w:numFmt w:val="decimal"/>
+      <w:lvlText w:val="%5."/>
+      <w:lvlJc w:val="left"/>
+      <w:pPr>
+        <w:tabs>
+          <w:tab w:val="num" w:pos="3600"/>
+        </w:tabs>
+        <w:ind w:left="3600" w:hanging="360"/>
+      </w:pPr>
+    </w:lvl>
+    <w:lvl w:ilvl="5" w:tentative="1">
+      <w:start w:val="1"/>
+      <w:numFmt w:val="decimal"/>
+      <w:lvlText w:val="%6."/>
+      <w:lvlJc w:val="left"/>
+      <w:pPr>
+        <w:tabs>
+          <w:tab w:val="num" w:pos="4320"/>
+        </w:tabs>
+        <w:ind w:left="4320" w:hanging="360"/>
+      </w:pPr>
+    </w:lvl>
+    <w:lvl w:ilvl="6" w:tentative="1">
+      <w:start w:val="1"/>
+      <w:numFmt w:val="decimal"/>
+      <w:lvlText w:val="%7."/>
+      <w:lvlJc w:val="left"/>
+      <w:pPr>
+        <w:tabs>
+          <w:tab w:val="num" w:pos="5040"/>
+        </w:tabs>
+        <w:ind w:left="5040" w:hanging="360"/>
+      </w:pPr>
+    </w:lvl>
+    <w:lvl w:ilvl="7" w:tentative="1">
+      <w:start w:val="1"/>
+      <w:numFmt w:val="decimal"/>
+      <w:lvlText w:val="%8."/>
+      <w:lvlJc w:val="left"/>
+      <w:pPr>
+        <w:tabs>
+          <w:tab w:val="num" w:pos="5760"/>
+        </w:tabs>
+        <w:ind w:left="5760" w:hanging="360"/>
+      </w:pPr>
+    </w:lvl>
+    <w:lvl w:ilvl="8" w:tentative="1">
+      <w:start w:val="1"/>
+      <w:numFmt w:val="decimal"/>
+      <w:lvlText w:val="%9."/>
+      <w:lvlJc w:val="left"/>
+      <w:pPr>
+        <w:tabs>
+          <w:tab w:val="num" w:pos="6480"/>
+        </w:tabs>
+        <w:ind w:left="6480" w:hanging="360"/>
+      </w:pPr>
+    </w:lvl>
+  </w:abstractNum>
+  <w:abstractNum w:abstractNumId="4" w15:restartNumberingAfterBreak="0">
+    <w:nsid w:val="27DE2D7D"/>
+    <w:multiLevelType w:val="multilevel"/>
+    <w:tmpl w:val="A2F04054"/>
+    <w:lvl w:ilvl="0">
+      <w:start w:val="1"/>
+      <w:numFmt w:val="decimal"/>
+      <w:lvlText w:val="%1."/>
+      <w:lvlJc w:val="left"/>
+      <w:pPr>
+        <w:tabs>
+          <w:tab w:val="num" w:pos="720"/>
+        </w:tabs>
+        <w:ind w:left="720" w:hanging="360"/>
+      </w:pPr>
+    </w:lvl>
+    <w:lvl w:ilvl="1" w:tentative="1">
+      <w:start w:val="1"/>
+      <w:numFmt w:val="decimal"/>
+      <w:lvlText w:val="%2."/>
+      <w:lvlJc w:val="left"/>
+      <w:pPr>
+        <w:tabs>
+          <w:tab w:val="num" w:pos="1440"/>
+        </w:tabs>
+        <w:ind w:left="1440" w:hanging="360"/>
+      </w:pPr>
+    </w:lvl>
+    <w:lvl w:ilvl="2" w:tentative="1">
+      <w:start w:val="1"/>
+      <w:numFmt w:val="decimal"/>
+      <w:lvlText w:val="%3."/>
+      <w:lvlJc w:val="left"/>
+      <w:pPr>
+        <w:tabs>
+          <w:tab w:val="num" w:pos="2160"/>
+        </w:tabs>
+        <w:ind w:left="2160" w:hanging="360"/>
+      </w:pPr>
+    </w:lvl>
+    <w:lvl w:ilvl="3" w:tentative="1">
+      <w:start w:val="1"/>
+      <w:numFmt w:val="decimal"/>
+      <w:lvlText w:val="%4."/>
+      <w:lvlJc w:val="left"/>
+      <w:pPr>
+        <w:tabs>
+          <w:tab w:val="num" w:pos="2880"/>
+        </w:tabs>
+        <w:ind w:left="2880" w:hanging="360"/>
+      </w:pPr>
+    </w:lvl>
+    <w:lvl w:ilvl="4" w:tentative="1">
+      <w:start w:val="1"/>
+      <w:numFmt w:val="decimal"/>
+      <w:lvlText w:val="%5."/>
+      <w:lvlJc w:val="left"/>
+      <w:pPr>
+        <w:tabs>
+          <w:tab w:val="num" w:pos="3600"/>
+        </w:tabs>
+        <w:ind w:left="3600" w:hanging="360"/>
+      </w:pPr>
+    </w:lvl>
+    <w:lvl w:ilvl="5" w:tentative="1">
+      <w:start w:val="1"/>
+      <w:numFmt w:val="decimal"/>
+      <w:lvlText w:val="%6."/>
+      <w:lvlJc w:val="left"/>
+      <w:pPr>
+        <w:tabs>
+          <w:tab w:val="num" w:pos="4320"/>
+        </w:tabs>
+        <w:ind w:left="4320" w:hanging="360"/>
+      </w:pPr>
+    </w:lvl>
+    <w:lvl w:ilvl="6" w:tentative="1">
+      <w:start w:val="1"/>
+      <w:numFmt w:val="decimal"/>
+      <w:lvlText w:val="%7."/>
+      <w:lvlJc w:val="left"/>
+      <w:pPr>
+        <w:tabs>
+          <w:tab w:val="num" w:pos="5040"/>
+        </w:tabs>
+        <w:ind w:left="5040" w:hanging="360"/>
+      </w:pPr>
+    </w:lvl>
+    <w:lvl w:ilvl="7" w:tentative="1">
+      <w:start w:val="1"/>
+      <w:numFmt w:val="decimal"/>
+      <w:lvlText w:val="%8."/>
+      <w:lvlJc w:val="left"/>
+      <w:pPr>
+        <w:tabs>
+          <w:tab w:val="num" w:pos="5760"/>
+        </w:tabs>
+        <w:ind w:left="5760" w:hanging="360"/>
+      </w:pPr>
+    </w:lvl>
+    <w:lvl w:ilvl="8" w:tentative="1">
+      <w:start w:val="1"/>
+      <w:numFmt w:val="decimal"/>
+      <w:lvlText w:val="%9."/>
+      <w:lvlJc w:val="left"/>
+      <w:pPr>
+        <w:tabs>
+          <w:tab w:val="num" w:pos="6480"/>
+        </w:tabs>
+        <w:ind w:left="6480" w:hanging="360"/>
+      </w:pPr>
+    </w:lvl>
+  </w:abstractNum>
+  <w:abstractNum w:abstractNumId="5" w15:restartNumberingAfterBreak="0">
+    <w:nsid w:val="38735DFB"/>
+    <w:multiLevelType w:val="multilevel"/>
+    <w:tmpl w:val="53EA8E0A"/>
+    <w:lvl w:ilvl="0">
+      <w:start w:val="1"/>
+      <w:numFmt w:val="bullet"/>
+      <w:lvlText w:val=""/>
+      <w:lvlJc w:val="left"/>
+      <w:pPr>
+        <w:tabs>
+          <w:tab w:val="num" w:pos="720"/>
+        </w:tabs>
+        <w:ind w:left="720" w:hanging="360"/>
+      </w:pPr>
+      <w:rPr>
+        <w:rFonts w:ascii="Symbol" w:hAnsi="Symbol" w:hint="default"/>
+        <w:sz w:val="20"/>
+      </w:rPr>
+    </w:lvl>
+    <w:lvl w:ilvl="1" w:tentative="1">
+      <w:start w:val="1"/>
+      <w:numFmt w:val="bullet"/>
+      <w:lvlText w:val="o"/>
+      <w:lvlJc w:val="left"/>
+      <w:pPr>
+        <w:tabs>
+          <w:tab w:val="num" w:pos="1440"/>
+        </w:tabs>
+        <w:ind w:left="1440" w:hanging="360"/>
+      </w:pPr>
+      <w:rPr>
+        <w:rFonts w:ascii="Courier New" w:hAnsi="Courier New" w:hint="default"/>
+        <w:sz w:val="20"/>
+      </w:rPr>
+    </w:lvl>
+    <w:lvl w:ilvl="2" w:tentative="1">
+      <w:start w:val="1"/>
+      <w:numFmt w:val="bullet"/>
+      <w:lvlText w:val=""/>
+      <w:lvlJc w:val="left"/>
+      <w:pPr>
+        <w:tabs>
+          <w:tab w:val="num" w:pos="2160"/>
+        </w:tabs>
+        <w:ind w:left="2160" w:hanging="360"/>
+      </w:pPr>
+      <w:rPr>
+        <w:rFonts w:ascii="Wingdings" w:hAnsi="Wingdings" w:hint="default"/>
+        <w:sz w:val="20"/>
+      </w:rPr>
+    </w:lvl>
+    <w:lvl w:ilvl="3" w:tentative="1">
+      <w:start w:val="1"/>
+      <w:numFmt w:val="bullet"/>
+      <w:lvlText w:val=""/>
+      <w:lvlJc w:val="left"/>
+      <w:pPr>
+        <w:tabs>
+          <w:tab w:val="num" w:pos="2880"/>
+        </w:tabs>
+        <w:ind w:left="2880" w:hanging="360"/>
+      </w:pPr>
+      <w:rPr>
+        <w:rFonts w:ascii="Wingdings" w:hAnsi="Wingdings" w:hint="default"/>
+        <w:sz w:val="20"/>
+      </w:rPr>
+    </w:lvl>
+    <w:lvl w:ilvl="4" w:tentative="1">
+      <w:start w:val="1"/>
+      <w:numFmt w:val="bullet"/>
+      <w:lvlText w:val=""/>
+      <w:lvlJc w:val="left"/>
+      <w:pPr>
+        <w:tabs>
+          <w:tab w:val="num" w:pos="3600"/>
+        </w:tabs>
+        <w:ind w:left="3600" w:hanging="360"/>
+      </w:pPr>
+      <w:rPr>
+        <w:rFonts w:ascii="Wingdings" w:hAnsi="Wingdings" w:hint="default"/>
+        <w:sz w:val="20"/>
+      </w:rPr>
+    </w:lvl>
+    <w:lvl w:ilvl="5" w:tentative="1">
+      <w:start w:val="1"/>
+      <w:numFmt w:val="bullet"/>
+      <w:lvlText w:val=""/>
+      <w:lvlJc w:val="left"/>
+      <w:pPr>
+        <w:tabs>
+          <w:tab w:val="num" w:pos="4320"/>
+        </w:tabs>
+        <w:ind w:left="4320" w:hanging="360"/>
+      </w:pPr>
+      <w:rPr>
+        <w:rFonts w:ascii="Wingdings" w:hAnsi="Wingdings" w:hint="default"/>
+        <w:sz w:val="20"/>
+      </w:rPr>
+    </w:lvl>
+    <w:lvl w:ilvl="6" w:tentative="1">
+      <w:start w:val="1"/>
+      <w:numFmt w:val="bullet"/>
+      <w:lvlText w:val=""/>
+      <w:lvlJc w:val="left"/>
+      <w:pPr>
+        <w:tabs>
+          <w:tab w:val="num" w:pos="5040"/>
+        </w:tabs>
+        <w:ind w:left="5040" w:hanging="360"/>
+      </w:pPr>
+      <w:rPr>
+        <w:rFonts w:ascii="Wingdings" w:hAnsi="Wingdings" w:hint="default"/>
+        <w:sz w:val="20"/>
+      </w:rPr>
+    </w:lvl>
+    <w:lvl w:ilvl="7" w:tentative="1">
+      <w:start w:val="1"/>
+      <w:numFmt w:val="bullet"/>
+      <w:lvlText w:val=""/>
+      <w:lvlJc w:val="left"/>
+      <w:pPr>
+        <w:tabs>
+          <w:tab w:val="num" w:pos="5760"/>
+        </w:tabs>
+        <w:ind w:left="5760" w:hanging="360"/>
+      </w:pPr>
+      <w:rPr>
+        <w:rFonts w:ascii="Wingdings" w:hAnsi="Wingdings" w:hint="default"/>
+        <w:sz w:val="20"/>
+      </w:rPr>
+    </w:lvl>
+    <w:lvl w:ilvl="8" w:tentative="1">
+      <w:start w:val="1"/>
+      <w:numFmt w:val="bullet"/>
+      <w:lvlText w:val=""/>
+      <w:lvlJc w:val="left"/>
+      <w:pPr>
+        <w:tabs>
+          <w:tab w:val="num" w:pos="6480"/>
+        </w:tabs>
+        <w:ind w:left="6480" w:hanging="360"/>
+      </w:pPr>
+      <w:rPr>
+        <w:rFonts w:ascii="Wingdings" w:hAnsi="Wingdings" w:hint="default"/>
+        <w:sz w:val="20"/>
+      </w:rPr>
+    </w:lvl>
+  </w:abstractNum>
+  <w:abstractNum w:abstractNumId="6" w15:restartNumberingAfterBreak="0">
     <w:nsid w:val="3A922ED9"/>
     <w:multiLevelType w:val="multilevel"/>
     <w:tmpl w:val="07080FDC"/>
@@ -754,7 +2896,7 @@
       </w:rPr>
     </w:lvl>
   </w:abstractNum>
-  <w:abstractNum w:abstractNumId="2" w15:restartNumberingAfterBreak="0">
+  <w:abstractNum w:abstractNumId="7" w15:restartNumberingAfterBreak="0">
     <w:nsid w:val="415A6752"/>
     <w:multiLevelType w:val="multilevel"/>
     <w:tmpl w:val="1DE2C85A"/>
@@ -903,14 +3045,1745 @@
       </w:rPr>
     </w:lvl>
   </w:abstractNum>
+  <w:abstractNum w:abstractNumId="8" w15:restartNumberingAfterBreak="0">
+    <w:nsid w:val="4829145F"/>
+    <w:multiLevelType w:val="multilevel"/>
+    <w:tmpl w:val="5902F320"/>
+    <w:lvl w:ilvl="0">
+      <w:start w:val="1"/>
+      <w:numFmt w:val="bullet"/>
+      <w:lvlText w:val=""/>
+      <w:lvlJc w:val="left"/>
+      <w:pPr>
+        <w:tabs>
+          <w:tab w:val="num" w:pos="720"/>
+        </w:tabs>
+        <w:ind w:left="720" w:hanging="360"/>
+      </w:pPr>
+      <w:rPr>
+        <w:rFonts w:ascii="Symbol" w:hAnsi="Symbol" w:hint="default"/>
+        <w:sz w:val="20"/>
+      </w:rPr>
+    </w:lvl>
+    <w:lvl w:ilvl="1" w:tentative="1">
+      <w:start w:val="1"/>
+      <w:numFmt w:val="bullet"/>
+      <w:lvlText w:val="o"/>
+      <w:lvlJc w:val="left"/>
+      <w:pPr>
+        <w:tabs>
+          <w:tab w:val="num" w:pos="1440"/>
+        </w:tabs>
+        <w:ind w:left="1440" w:hanging="360"/>
+      </w:pPr>
+      <w:rPr>
+        <w:rFonts w:ascii="Courier New" w:hAnsi="Courier New" w:hint="default"/>
+        <w:sz w:val="20"/>
+      </w:rPr>
+    </w:lvl>
+    <w:lvl w:ilvl="2" w:tentative="1">
+      <w:start w:val="1"/>
+      <w:numFmt w:val="bullet"/>
+      <w:lvlText w:val=""/>
+      <w:lvlJc w:val="left"/>
+      <w:pPr>
+        <w:tabs>
+          <w:tab w:val="num" w:pos="2160"/>
+        </w:tabs>
+        <w:ind w:left="2160" w:hanging="360"/>
+      </w:pPr>
+      <w:rPr>
+        <w:rFonts w:ascii="Wingdings" w:hAnsi="Wingdings" w:hint="default"/>
+        <w:sz w:val="20"/>
+      </w:rPr>
+    </w:lvl>
+    <w:lvl w:ilvl="3" w:tentative="1">
+      <w:start w:val="1"/>
+      <w:numFmt w:val="bullet"/>
+      <w:lvlText w:val=""/>
+      <w:lvlJc w:val="left"/>
+      <w:pPr>
+        <w:tabs>
+          <w:tab w:val="num" w:pos="2880"/>
+        </w:tabs>
+        <w:ind w:left="2880" w:hanging="360"/>
+      </w:pPr>
+      <w:rPr>
+        <w:rFonts w:ascii="Wingdings" w:hAnsi="Wingdings" w:hint="default"/>
+        <w:sz w:val="20"/>
+      </w:rPr>
+    </w:lvl>
+    <w:lvl w:ilvl="4" w:tentative="1">
+      <w:start w:val="1"/>
+      <w:numFmt w:val="bullet"/>
+      <w:lvlText w:val=""/>
+      <w:lvlJc w:val="left"/>
+      <w:pPr>
+        <w:tabs>
+          <w:tab w:val="num" w:pos="3600"/>
+        </w:tabs>
+        <w:ind w:left="3600" w:hanging="360"/>
+      </w:pPr>
+      <w:rPr>
+        <w:rFonts w:ascii="Wingdings" w:hAnsi="Wingdings" w:hint="default"/>
+        <w:sz w:val="20"/>
+      </w:rPr>
+    </w:lvl>
+    <w:lvl w:ilvl="5" w:tentative="1">
+      <w:start w:val="1"/>
+      <w:numFmt w:val="bullet"/>
+      <w:lvlText w:val=""/>
+      <w:lvlJc w:val="left"/>
+      <w:pPr>
+        <w:tabs>
+          <w:tab w:val="num" w:pos="4320"/>
+        </w:tabs>
+        <w:ind w:left="4320" w:hanging="360"/>
+      </w:pPr>
+      <w:rPr>
+        <w:rFonts w:ascii="Wingdings" w:hAnsi="Wingdings" w:hint="default"/>
+        <w:sz w:val="20"/>
+      </w:rPr>
+    </w:lvl>
+    <w:lvl w:ilvl="6" w:tentative="1">
+      <w:start w:val="1"/>
+      <w:numFmt w:val="bullet"/>
+      <w:lvlText w:val=""/>
+      <w:lvlJc w:val="left"/>
+      <w:pPr>
+        <w:tabs>
+          <w:tab w:val="num" w:pos="5040"/>
+        </w:tabs>
+        <w:ind w:left="5040" w:hanging="360"/>
+      </w:pPr>
+      <w:rPr>
+        <w:rFonts w:ascii="Wingdings" w:hAnsi="Wingdings" w:hint="default"/>
+        <w:sz w:val="20"/>
+      </w:rPr>
+    </w:lvl>
+    <w:lvl w:ilvl="7" w:tentative="1">
+      <w:start w:val="1"/>
+      <w:numFmt w:val="bullet"/>
+      <w:lvlText w:val=""/>
+      <w:lvlJc w:val="left"/>
+      <w:pPr>
+        <w:tabs>
+          <w:tab w:val="num" w:pos="5760"/>
+        </w:tabs>
+        <w:ind w:left="5760" w:hanging="360"/>
+      </w:pPr>
+      <w:rPr>
+        <w:rFonts w:ascii="Wingdings" w:hAnsi="Wingdings" w:hint="default"/>
+        <w:sz w:val="20"/>
+      </w:rPr>
+    </w:lvl>
+    <w:lvl w:ilvl="8" w:tentative="1">
+      <w:start w:val="1"/>
+      <w:numFmt w:val="bullet"/>
+      <w:lvlText w:val=""/>
+      <w:lvlJc w:val="left"/>
+      <w:pPr>
+        <w:tabs>
+          <w:tab w:val="num" w:pos="6480"/>
+        </w:tabs>
+        <w:ind w:left="6480" w:hanging="360"/>
+      </w:pPr>
+      <w:rPr>
+        <w:rFonts w:ascii="Wingdings" w:hAnsi="Wingdings" w:hint="default"/>
+        <w:sz w:val="20"/>
+      </w:rPr>
+    </w:lvl>
+  </w:abstractNum>
+  <w:abstractNum w:abstractNumId="9" w15:restartNumberingAfterBreak="0">
+    <w:nsid w:val="4D9230DB"/>
+    <w:multiLevelType w:val="multilevel"/>
+    <w:tmpl w:val="DD6AE3A8"/>
+    <w:lvl w:ilvl="0">
+      <w:start w:val="1"/>
+      <w:numFmt w:val="bullet"/>
+      <w:lvlText w:val=""/>
+      <w:lvlJc w:val="left"/>
+      <w:pPr>
+        <w:tabs>
+          <w:tab w:val="num" w:pos="720"/>
+        </w:tabs>
+        <w:ind w:left="720" w:hanging="360"/>
+      </w:pPr>
+      <w:rPr>
+        <w:rFonts w:ascii="Symbol" w:hAnsi="Symbol" w:hint="default"/>
+        <w:sz w:val="20"/>
+      </w:rPr>
+    </w:lvl>
+    <w:lvl w:ilvl="1" w:tentative="1">
+      <w:start w:val="1"/>
+      <w:numFmt w:val="bullet"/>
+      <w:lvlText w:val="o"/>
+      <w:lvlJc w:val="left"/>
+      <w:pPr>
+        <w:tabs>
+          <w:tab w:val="num" w:pos="1440"/>
+        </w:tabs>
+        <w:ind w:left="1440" w:hanging="360"/>
+      </w:pPr>
+      <w:rPr>
+        <w:rFonts w:ascii="Courier New" w:hAnsi="Courier New" w:hint="default"/>
+        <w:sz w:val="20"/>
+      </w:rPr>
+    </w:lvl>
+    <w:lvl w:ilvl="2" w:tentative="1">
+      <w:start w:val="1"/>
+      <w:numFmt w:val="bullet"/>
+      <w:lvlText w:val=""/>
+      <w:lvlJc w:val="left"/>
+      <w:pPr>
+        <w:tabs>
+          <w:tab w:val="num" w:pos="2160"/>
+        </w:tabs>
+        <w:ind w:left="2160" w:hanging="360"/>
+      </w:pPr>
+      <w:rPr>
+        <w:rFonts w:ascii="Wingdings" w:hAnsi="Wingdings" w:hint="default"/>
+        <w:sz w:val="20"/>
+      </w:rPr>
+    </w:lvl>
+    <w:lvl w:ilvl="3" w:tentative="1">
+      <w:start w:val="1"/>
+      <w:numFmt w:val="bullet"/>
+      <w:lvlText w:val=""/>
+      <w:lvlJc w:val="left"/>
+      <w:pPr>
+        <w:tabs>
+          <w:tab w:val="num" w:pos="2880"/>
+        </w:tabs>
+        <w:ind w:left="2880" w:hanging="360"/>
+      </w:pPr>
+      <w:rPr>
+        <w:rFonts w:ascii="Wingdings" w:hAnsi="Wingdings" w:hint="default"/>
+        <w:sz w:val="20"/>
+      </w:rPr>
+    </w:lvl>
+    <w:lvl w:ilvl="4" w:tentative="1">
+      <w:start w:val="1"/>
+      <w:numFmt w:val="bullet"/>
+      <w:lvlText w:val=""/>
+      <w:lvlJc w:val="left"/>
+      <w:pPr>
+        <w:tabs>
+          <w:tab w:val="num" w:pos="3600"/>
+        </w:tabs>
+        <w:ind w:left="3600" w:hanging="360"/>
+      </w:pPr>
+      <w:rPr>
+        <w:rFonts w:ascii="Wingdings" w:hAnsi="Wingdings" w:hint="default"/>
+        <w:sz w:val="20"/>
+      </w:rPr>
+    </w:lvl>
+    <w:lvl w:ilvl="5" w:tentative="1">
+      <w:start w:val="1"/>
+      <w:numFmt w:val="bullet"/>
+      <w:lvlText w:val=""/>
+      <w:lvlJc w:val="left"/>
+      <w:pPr>
+        <w:tabs>
+          <w:tab w:val="num" w:pos="4320"/>
+        </w:tabs>
+        <w:ind w:left="4320" w:hanging="360"/>
+      </w:pPr>
+      <w:rPr>
+        <w:rFonts w:ascii="Wingdings" w:hAnsi="Wingdings" w:hint="default"/>
+        <w:sz w:val="20"/>
+      </w:rPr>
+    </w:lvl>
+    <w:lvl w:ilvl="6" w:tentative="1">
+      <w:start w:val="1"/>
+      <w:numFmt w:val="bullet"/>
+      <w:lvlText w:val=""/>
+      <w:lvlJc w:val="left"/>
+      <w:pPr>
+        <w:tabs>
+          <w:tab w:val="num" w:pos="5040"/>
+        </w:tabs>
+        <w:ind w:left="5040" w:hanging="360"/>
+      </w:pPr>
+      <w:rPr>
+        <w:rFonts w:ascii="Wingdings" w:hAnsi="Wingdings" w:hint="default"/>
+        <w:sz w:val="20"/>
+      </w:rPr>
+    </w:lvl>
+    <w:lvl w:ilvl="7" w:tentative="1">
+      <w:start w:val="1"/>
+      <w:numFmt w:val="bullet"/>
+      <w:lvlText w:val=""/>
+      <w:lvlJc w:val="left"/>
+      <w:pPr>
+        <w:tabs>
+          <w:tab w:val="num" w:pos="5760"/>
+        </w:tabs>
+        <w:ind w:left="5760" w:hanging="360"/>
+      </w:pPr>
+      <w:rPr>
+        <w:rFonts w:ascii="Wingdings" w:hAnsi="Wingdings" w:hint="default"/>
+        <w:sz w:val="20"/>
+      </w:rPr>
+    </w:lvl>
+    <w:lvl w:ilvl="8" w:tentative="1">
+      <w:start w:val="1"/>
+      <w:numFmt w:val="bullet"/>
+      <w:lvlText w:val=""/>
+      <w:lvlJc w:val="left"/>
+      <w:pPr>
+        <w:tabs>
+          <w:tab w:val="num" w:pos="6480"/>
+        </w:tabs>
+        <w:ind w:left="6480" w:hanging="360"/>
+      </w:pPr>
+      <w:rPr>
+        <w:rFonts w:ascii="Wingdings" w:hAnsi="Wingdings" w:hint="default"/>
+        <w:sz w:val="20"/>
+      </w:rPr>
+    </w:lvl>
+  </w:abstractNum>
+  <w:abstractNum w:abstractNumId="10" w15:restartNumberingAfterBreak="0">
+    <w:nsid w:val="56471F9F"/>
+    <w:multiLevelType w:val="multilevel"/>
+    <w:tmpl w:val="8B84E118"/>
+    <w:lvl w:ilvl="0">
+      <w:start w:val="1"/>
+      <w:numFmt w:val="decimal"/>
+      <w:lvlText w:val="%1."/>
+      <w:lvlJc w:val="left"/>
+      <w:pPr>
+        <w:tabs>
+          <w:tab w:val="num" w:pos="720"/>
+        </w:tabs>
+        <w:ind w:left="720" w:hanging="360"/>
+      </w:pPr>
+    </w:lvl>
+    <w:lvl w:ilvl="1" w:tentative="1">
+      <w:start w:val="1"/>
+      <w:numFmt w:val="decimal"/>
+      <w:lvlText w:val="%2."/>
+      <w:lvlJc w:val="left"/>
+      <w:pPr>
+        <w:tabs>
+          <w:tab w:val="num" w:pos="1440"/>
+        </w:tabs>
+        <w:ind w:left="1440" w:hanging="360"/>
+      </w:pPr>
+    </w:lvl>
+    <w:lvl w:ilvl="2" w:tentative="1">
+      <w:start w:val="1"/>
+      <w:numFmt w:val="decimal"/>
+      <w:lvlText w:val="%3."/>
+      <w:lvlJc w:val="left"/>
+      <w:pPr>
+        <w:tabs>
+          <w:tab w:val="num" w:pos="2160"/>
+        </w:tabs>
+        <w:ind w:left="2160" w:hanging="360"/>
+      </w:pPr>
+    </w:lvl>
+    <w:lvl w:ilvl="3" w:tentative="1">
+      <w:start w:val="1"/>
+      <w:numFmt w:val="decimal"/>
+      <w:lvlText w:val="%4."/>
+      <w:lvlJc w:val="left"/>
+      <w:pPr>
+        <w:tabs>
+          <w:tab w:val="num" w:pos="2880"/>
+        </w:tabs>
+        <w:ind w:left="2880" w:hanging="360"/>
+      </w:pPr>
+    </w:lvl>
+    <w:lvl w:ilvl="4" w:tentative="1">
+      <w:start w:val="1"/>
+      <w:numFmt w:val="decimal"/>
+      <w:lvlText w:val="%5."/>
+      <w:lvlJc w:val="left"/>
+      <w:pPr>
+        <w:tabs>
+          <w:tab w:val="num" w:pos="3600"/>
+        </w:tabs>
+        <w:ind w:left="3600" w:hanging="360"/>
+      </w:pPr>
+    </w:lvl>
+    <w:lvl w:ilvl="5" w:tentative="1">
+      <w:start w:val="1"/>
+      <w:numFmt w:val="decimal"/>
+      <w:lvlText w:val="%6."/>
+      <w:lvlJc w:val="left"/>
+      <w:pPr>
+        <w:tabs>
+          <w:tab w:val="num" w:pos="4320"/>
+        </w:tabs>
+        <w:ind w:left="4320" w:hanging="360"/>
+      </w:pPr>
+    </w:lvl>
+    <w:lvl w:ilvl="6" w:tentative="1">
+      <w:start w:val="1"/>
+      <w:numFmt w:val="decimal"/>
+      <w:lvlText w:val="%7."/>
+      <w:lvlJc w:val="left"/>
+      <w:pPr>
+        <w:tabs>
+          <w:tab w:val="num" w:pos="5040"/>
+        </w:tabs>
+        <w:ind w:left="5040" w:hanging="360"/>
+      </w:pPr>
+    </w:lvl>
+    <w:lvl w:ilvl="7" w:tentative="1">
+      <w:start w:val="1"/>
+      <w:numFmt w:val="decimal"/>
+      <w:lvlText w:val="%8."/>
+      <w:lvlJc w:val="left"/>
+      <w:pPr>
+        <w:tabs>
+          <w:tab w:val="num" w:pos="5760"/>
+        </w:tabs>
+        <w:ind w:left="5760" w:hanging="360"/>
+      </w:pPr>
+    </w:lvl>
+    <w:lvl w:ilvl="8" w:tentative="1">
+      <w:start w:val="1"/>
+      <w:numFmt w:val="decimal"/>
+      <w:lvlText w:val="%9."/>
+      <w:lvlJc w:val="left"/>
+      <w:pPr>
+        <w:tabs>
+          <w:tab w:val="num" w:pos="6480"/>
+        </w:tabs>
+        <w:ind w:left="6480" w:hanging="360"/>
+      </w:pPr>
+    </w:lvl>
+  </w:abstractNum>
+  <w:abstractNum w:abstractNumId="11" w15:restartNumberingAfterBreak="0">
+    <w:nsid w:val="5B7B4CBA"/>
+    <w:multiLevelType w:val="multilevel"/>
+    <w:tmpl w:val="A4EECE86"/>
+    <w:lvl w:ilvl="0">
+      <w:start w:val="1"/>
+      <w:numFmt w:val="bullet"/>
+      <w:lvlText w:val=""/>
+      <w:lvlJc w:val="left"/>
+      <w:pPr>
+        <w:tabs>
+          <w:tab w:val="num" w:pos="720"/>
+        </w:tabs>
+        <w:ind w:left="720" w:hanging="360"/>
+      </w:pPr>
+      <w:rPr>
+        <w:rFonts w:ascii="Symbol" w:hAnsi="Symbol" w:hint="default"/>
+        <w:sz w:val="20"/>
+      </w:rPr>
+    </w:lvl>
+    <w:lvl w:ilvl="1" w:tentative="1">
+      <w:start w:val="1"/>
+      <w:numFmt w:val="bullet"/>
+      <w:lvlText w:val="o"/>
+      <w:lvlJc w:val="left"/>
+      <w:pPr>
+        <w:tabs>
+          <w:tab w:val="num" w:pos="1440"/>
+        </w:tabs>
+        <w:ind w:left="1440" w:hanging="360"/>
+      </w:pPr>
+      <w:rPr>
+        <w:rFonts w:ascii="Courier New" w:hAnsi="Courier New" w:hint="default"/>
+        <w:sz w:val="20"/>
+      </w:rPr>
+    </w:lvl>
+    <w:lvl w:ilvl="2" w:tentative="1">
+      <w:start w:val="1"/>
+      <w:numFmt w:val="bullet"/>
+      <w:lvlText w:val=""/>
+      <w:lvlJc w:val="left"/>
+      <w:pPr>
+        <w:tabs>
+          <w:tab w:val="num" w:pos="2160"/>
+        </w:tabs>
+        <w:ind w:left="2160" w:hanging="360"/>
+      </w:pPr>
+      <w:rPr>
+        <w:rFonts w:ascii="Wingdings" w:hAnsi="Wingdings" w:hint="default"/>
+        <w:sz w:val="20"/>
+      </w:rPr>
+    </w:lvl>
+    <w:lvl w:ilvl="3" w:tentative="1">
+      <w:start w:val="1"/>
+      <w:numFmt w:val="bullet"/>
+      <w:lvlText w:val=""/>
+      <w:lvlJc w:val="left"/>
+      <w:pPr>
+        <w:tabs>
+          <w:tab w:val="num" w:pos="2880"/>
+        </w:tabs>
+        <w:ind w:left="2880" w:hanging="360"/>
+      </w:pPr>
+      <w:rPr>
+        <w:rFonts w:ascii="Wingdings" w:hAnsi="Wingdings" w:hint="default"/>
+        <w:sz w:val="20"/>
+      </w:rPr>
+    </w:lvl>
+    <w:lvl w:ilvl="4" w:tentative="1">
+      <w:start w:val="1"/>
+      <w:numFmt w:val="bullet"/>
+      <w:lvlText w:val=""/>
+      <w:lvlJc w:val="left"/>
+      <w:pPr>
+        <w:tabs>
+          <w:tab w:val="num" w:pos="3600"/>
+        </w:tabs>
+        <w:ind w:left="3600" w:hanging="360"/>
+      </w:pPr>
+      <w:rPr>
+        <w:rFonts w:ascii="Wingdings" w:hAnsi="Wingdings" w:hint="default"/>
+        <w:sz w:val="20"/>
+      </w:rPr>
+    </w:lvl>
+    <w:lvl w:ilvl="5" w:tentative="1">
+      <w:start w:val="1"/>
+      <w:numFmt w:val="bullet"/>
+      <w:lvlText w:val=""/>
+      <w:lvlJc w:val="left"/>
+      <w:pPr>
+        <w:tabs>
+          <w:tab w:val="num" w:pos="4320"/>
+        </w:tabs>
+        <w:ind w:left="4320" w:hanging="360"/>
+      </w:pPr>
+      <w:rPr>
+        <w:rFonts w:ascii="Wingdings" w:hAnsi="Wingdings" w:hint="default"/>
+        <w:sz w:val="20"/>
+      </w:rPr>
+    </w:lvl>
+    <w:lvl w:ilvl="6" w:tentative="1">
+      <w:start w:val="1"/>
+      <w:numFmt w:val="bullet"/>
+      <w:lvlText w:val=""/>
+      <w:lvlJc w:val="left"/>
+      <w:pPr>
+        <w:tabs>
+          <w:tab w:val="num" w:pos="5040"/>
+        </w:tabs>
+        <w:ind w:left="5040" w:hanging="360"/>
+      </w:pPr>
+      <w:rPr>
+        <w:rFonts w:ascii="Wingdings" w:hAnsi="Wingdings" w:hint="default"/>
+        <w:sz w:val="20"/>
+      </w:rPr>
+    </w:lvl>
+    <w:lvl w:ilvl="7" w:tentative="1">
+      <w:start w:val="1"/>
+      <w:numFmt w:val="bullet"/>
+      <w:lvlText w:val=""/>
+      <w:lvlJc w:val="left"/>
+      <w:pPr>
+        <w:tabs>
+          <w:tab w:val="num" w:pos="5760"/>
+        </w:tabs>
+        <w:ind w:left="5760" w:hanging="360"/>
+      </w:pPr>
+      <w:rPr>
+        <w:rFonts w:ascii="Wingdings" w:hAnsi="Wingdings" w:hint="default"/>
+        <w:sz w:val="20"/>
+      </w:rPr>
+    </w:lvl>
+    <w:lvl w:ilvl="8" w:tentative="1">
+      <w:start w:val="1"/>
+      <w:numFmt w:val="bullet"/>
+      <w:lvlText w:val=""/>
+      <w:lvlJc w:val="left"/>
+      <w:pPr>
+        <w:tabs>
+          <w:tab w:val="num" w:pos="6480"/>
+        </w:tabs>
+        <w:ind w:left="6480" w:hanging="360"/>
+      </w:pPr>
+      <w:rPr>
+        <w:rFonts w:ascii="Wingdings" w:hAnsi="Wingdings" w:hint="default"/>
+        <w:sz w:val="20"/>
+      </w:rPr>
+    </w:lvl>
+  </w:abstractNum>
+  <w:abstractNum w:abstractNumId="12" w15:restartNumberingAfterBreak="0">
+    <w:nsid w:val="60FD1721"/>
+    <w:multiLevelType w:val="multilevel"/>
+    <w:tmpl w:val="0C4ADCCC"/>
+    <w:lvl w:ilvl="0">
+      <w:start w:val="1"/>
+      <w:numFmt w:val="bullet"/>
+      <w:lvlText w:val=""/>
+      <w:lvlJc w:val="left"/>
+      <w:pPr>
+        <w:tabs>
+          <w:tab w:val="num" w:pos="720"/>
+        </w:tabs>
+        <w:ind w:left="720" w:hanging="360"/>
+      </w:pPr>
+      <w:rPr>
+        <w:rFonts w:ascii="Symbol" w:hAnsi="Symbol" w:hint="default"/>
+        <w:sz w:val="20"/>
+      </w:rPr>
+    </w:lvl>
+    <w:lvl w:ilvl="1" w:tentative="1">
+      <w:start w:val="1"/>
+      <w:numFmt w:val="bullet"/>
+      <w:lvlText w:val="o"/>
+      <w:lvlJc w:val="left"/>
+      <w:pPr>
+        <w:tabs>
+          <w:tab w:val="num" w:pos="1440"/>
+        </w:tabs>
+        <w:ind w:left="1440" w:hanging="360"/>
+      </w:pPr>
+      <w:rPr>
+        <w:rFonts w:ascii="Courier New" w:hAnsi="Courier New" w:hint="default"/>
+        <w:sz w:val="20"/>
+      </w:rPr>
+    </w:lvl>
+    <w:lvl w:ilvl="2" w:tentative="1">
+      <w:start w:val="1"/>
+      <w:numFmt w:val="bullet"/>
+      <w:lvlText w:val=""/>
+      <w:lvlJc w:val="left"/>
+      <w:pPr>
+        <w:tabs>
+          <w:tab w:val="num" w:pos="2160"/>
+        </w:tabs>
+        <w:ind w:left="2160" w:hanging="360"/>
+      </w:pPr>
+      <w:rPr>
+        <w:rFonts w:ascii="Wingdings" w:hAnsi="Wingdings" w:hint="default"/>
+        <w:sz w:val="20"/>
+      </w:rPr>
+    </w:lvl>
+    <w:lvl w:ilvl="3" w:tentative="1">
+      <w:start w:val="1"/>
+      <w:numFmt w:val="bullet"/>
+      <w:lvlText w:val=""/>
+      <w:lvlJc w:val="left"/>
+      <w:pPr>
+        <w:tabs>
+          <w:tab w:val="num" w:pos="2880"/>
+        </w:tabs>
+        <w:ind w:left="2880" w:hanging="360"/>
+      </w:pPr>
+      <w:rPr>
+        <w:rFonts w:ascii="Wingdings" w:hAnsi="Wingdings" w:hint="default"/>
+        <w:sz w:val="20"/>
+      </w:rPr>
+    </w:lvl>
+    <w:lvl w:ilvl="4" w:tentative="1">
+      <w:start w:val="1"/>
+      <w:numFmt w:val="bullet"/>
+      <w:lvlText w:val=""/>
+      <w:lvlJc w:val="left"/>
+      <w:pPr>
+        <w:tabs>
+          <w:tab w:val="num" w:pos="3600"/>
+        </w:tabs>
+        <w:ind w:left="3600" w:hanging="360"/>
+      </w:pPr>
+      <w:rPr>
+        <w:rFonts w:ascii="Wingdings" w:hAnsi="Wingdings" w:hint="default"/>
+        <w:sz w:val="20"/>
+      </w:rPr>
+    </w:lvl>
+    <w:lvl w:ilvl="5" w:tentative="1">
+      <w:start w:val="1"/>
+      <w:numFmt w:val="bullet"/>
+      <w:lvlText w:val=""/>
+      <w:lvlJc w:val="left"/>
+      <w:pPr>
+        <w:tabs>
+          <w:tab w:val="num" w:pos="4320"/>
+        </w:tabs>
+        <w:ind w:left="4320" w:hanging="360"/>
+      </w:pPr>
+      <w:rPr>
+        <w:rFonts w:ascii="Wingdings" w:hAnsi="Wingdings" w:hint="default"/>
+        <w:sz w:val="20"/>
+      </w:rPr>
+    </w:lvl>
+    <w:lvl w:ilvl="6" w:tentative="1">
+      <w:start w:val="1"/>
+      <w:numFmt w:val="bullet"/>
+      <w:lvlText w:val=""/>
+      <w:lvlJc w:val="left"/>
+      <w:pPr>
+        <w:tabs>
+          <w:tab w:val="num" w:pos="5040"/>
+        </w:tabs>
+        <w:ind w:left="5040" w:hanging="360"/>
+      </w:pPr>
+      <w:rPr>
+        <w:rFonts w:ascii="Wingdings" w:hAnsi="Wingdings" w:hint="default"/>
+        <w:sz w:val="20"/>
+      </w:rPr>
+    </w:lvl>
+    <w:lvl w:ilvl="7" w:tentative="1">
+      <w:start w:val="1"/>
+      <w:numFmt w:val="bullet"/>
+      <w:lvlText w:val=""/>
+      <w:lvlJc w:val="left"/>
+      <w:pPr>
+        <w:tabs>
+          <w:tab w:val="num" w:pos="5760"/>
+        </w:tabs>
+        <w:ind w:left="5760" w:hanging="360"/>
+      </w:pPr>
+      <w:rPr>
+        <w:rFonts w:ascii="Wingdings" w:hAnsi="Wingdings" w:hint="default"/>
+        <w:sz w:val="20"/>
+      </w:rPr>
+    </w:lvl>
+    <w:lvl w:ilvl="8" w:tentative="1">
+      <w:start w:val="1"/>
+      <w:numFmt w:val="bullet"/>
+      <w:lvlText w:val=""/>
+      <w:lvlJc w:val="left"/>
+      <w:pPr>
+        <w:tabs>
+          <w:tab w:val="num" w:pos="6480"/>
+        </w:tabs>
+        <w:ind w:left="6480" w:hanging="360"/>
+      </w:pPr>
+      <w:rPr>
+        <w:rFonts w:ascii="Wingdings" w:hAnsi="Wingdings" w:hint="default"/>
+        <w:sz w:val="20"/>
+      </w:rPr>
+    </w:lvl>
+  </w:abstractNum>
+  <w:abstractNum w:abstractNumId="13" w15:restartNumberingAfterBreak="0">
+    <w:nsid w:val="616A7BF2"/>
+    <w:multiLevelType w:val="multilevel"/>
+    <w:tmpl w:val="78EEA572"/>
+    <w:lvl w:ilvl="0">
+      <w:start w:val="1"/>
+      <w:numFmt w:val="bullet"/>
+      <w:lvlText w:val=""/>
+      <w:lvlJc w:val="left"/>
+      <w:pPr>
+        <w:tabs>
+          <w:tab w:val="num" w:pos="720"/>
+        </w:tabs>
+        <w:ind w:left="720" w:hanging="360"/>
+      </w:pPr>
+      <w:rPr>
+        <w:rFonts w:ascii="Symbol" w:hAnsi="Symbol" w:hint="default"/>
+        <w:sz w:val="20"/>
+      </w:rPr>
+    </w:lvl>
+    <w:lvl w:ilvl="1" w:tentative="1">
+      <w:start w:val="1"/>
+      <w:numFmt w:val="bullet"/>
+      <w:lvlText w:val="o"/>
+      <w:lvlJc w:val="left"/>
+      <w:pPr>
+        <w:tabs>
+          <w:tab w:val="num" w:pos="1440"/>
+        </w:tabs>
+        <w:ind w:left="1440" w:hanging="360"/>
+      </w:pPr>
+      <w:rPr>
+        <w:rFonts w:ascii="Courier New" w:hAnsi="Courier New" w:hint="default"/>
+        <w:sz w:val="20"/>
+      </w:rPr>
+    </w:lvl>
+    <w:lvl w:ilvl="2" w:tentative="1">
+      <w:start w:val="1"/>
+      <w:numFmt w:val="bullet"/>
+      <w:lvlText w:val=""/>
+      <w:lvlJc w:val="left"/>
+      <w:pPr>
+        <w:tabs>
+          <w:tab w:val="num" w:pos="2160"/>
+        </w:tabs>
+        <w:ind w:left="2160" w:hanging="360"/>
+      </w:pPr>
+      <w:rPr>
+        <w:rFonts w:ascii="Wingdings" w:hAnsi="Wingdings" w:hint="default"/>
+        <w:sz w:val="20"/>
+      </w:rPr>
+    </w:lvl>
+    <w:lvl w:ilvl="3" w:tentative="1">
+      <w:start w:val="1"/>
+      <w:numFmt w:val="bullet"/>
+      <w:lvlText w:val=""/>
+      <w:lvlJc w:val="left"/>
+      <w:pPr>
+        <w:tabs>
+          <w:tab w:val="num" w:pos="2880"/>
+        </w:tabs>
+        <w:ind w:left="2880" w:hanging="360"/>
+      </w:pPr>
+      <w:rPr>
+        <w:rFonts w:ascii="Wingdings" w:hAnsi="Wingdings" w:hint="default"/>
+        <w:sz w:val="20"/>
+      </w:rPr>
+    </w:lvl>
+    <w:lvl w:ilvl="4" w:tentative="1">
+      <w:start w:val="1"/>
+      <w:numFmt w:val="bullet"/>
+      <w:lvlText w:val=""/>
+      <w:lvlJc w:val="left"/>
+      <w:pPr>
+        <w:tabs>
+          <w:tab w:val="num" w:pos="3600"/>
+        </w:tabs>
+        <w:ind w:left="3600" w:hanging="360"/>
+      </w:pPr>
+      <w:rPr>
+        <w:rFonts w:ascii="Wingdings" w:hAnsi="Wingdings" w:hint="default"/>
+        <w:sz w:val="20"/>
+      </w:rPr>
+    </w:lvl>
+    <w:lvl w:ilvl="5" w:tentative="1">
+      <w:start w:val="1"/>
+      <w:numFmt w:val="bullet"/>
+      <w:lvlText w:val=""/>
+      <w:lvlJc w:val="left"/>
+      <w:pPr>
+        <w:tabs>
+          <w:tab w:val="num" w:pos="4320"/>
+        </w:tabs>
+        <w:ind w:left="4320" w:hanging="360"/>
+      </w:pPr>
+      <w:rPr>
+        <w:rFonts w:ascii="Wingdings" w:hAnsi="Wingdings" w:hint="default"/>
+        <w:sz w:val="20"/>
+      </w:rPr>
+    </w:lvl>
+    <w:lvl w:ilvl="6" w:tentative="1">
+      <w:start w:val="1"/>
+      <w:numFmt w:val="bullet"/>
+      <w:lvlText w:val=""/>
+      <w:lvlJc w:val="left"/>
+      <w:pPr>
+        <w:tabs>
+          <w:tab w:val="num" w:pos="5040"/>
+        </w:tabs>
+        <w:ind w:left="5040" w:hanging="360"/>
+      </w:pPr>
+      <w:rPr>
+        <w:rFonts w:ascii="Wingdings" w:hAnsi="Wingdings" w:hint="default"/>
+        <w:sz w:val="20"/>
+      </w:rPr>
+    </w:lvl>
+    <w:lvl w:ilvl="7" w:tentative="1">
+      <w:start w:val="1"/>
+      <w:numFmt w:val="bullet"/>
+      <w:lvlText w:val=""/>
+      <w:lvlJc w:val="left"/>
+      <w:pPr>
+        <w:tabs>
+          <w:tab w:val="num" w:pos="5760"/>
+        </w:tabs>
+        <w:ind w:left="5760" w:hanging="360"/>
+      </w:pPr>
+      <w:rPr>
+        <w:rFonts w:ascii="Wingdings" w:hAnsi="Wingdings" w:hint="default"/>
+        <w:sz w:val="20"/>
+      </w:rPr>
+    </w:lvl>
+    <w:lvl w:ilvl="8" w:tentative="1">
+      <w:start w:val="1"/>
+      <w:numFmt w:val="bullet"/>
+      <w:lvlText w:val=""/>
+      <w:lvlJc w:val="left"/>
+      <w:pPr>
+        <w:tabs>
+          <w:tab w:val="num" w:pos="6480"/>
+        </w:tabs>
+        <w:ind w:left="6480" w:hanging="360"/>
+      </w:pPr>
+      <w:rPr>
+        <w:rFonts w:ascii="Wingdings" w:hAnsi="Wingdings" w:hint="default"/>
+        <w:sz w:val="20"/>
+      </w:rPr>
+    </w:lvl>
+  </w:abstractNum>
+  <w:abstractNum w:abstractNumId="14" w15:restartNumberingAfterBreak="0">
+    <w:nsid w:val="655D67C2"/>
+    <w:multiLevelType w:val="multilevel"/>
+    <w:tmpl w:val="AE1865DA"/>
+    <w:lvl w:ilvl="0">
+      <w:start w:val="1"/>
+      <w:numFmt w:val="bullet"/>
+      <w:lvlText w:val=""/>
+      <w:lvlJc w:val="left"/>
+      <w:pPr>
+        <w:tabs>
+          <w:tab w:val="num" w:pos="720"/>
+        </w:tabs>
+        <w:ind w:left="720" w:hanging="360"/>
+      </w:pPr>
+      <w:rPr>
+        <w:rFonts w:ascii="Symbol" w:hAnsi="Symbol" w:hint="default"/>
+        <w:sz w:val="20"/>
+      </w:rPr>
+    </w:lvl>
+    <w:lvl w:ilvl="1" w:tentative="1">
+      <w:start w:val="1"/>
+      <w:numFmt w:val="bullet"/>
+      <w:lvlText w:val="o"/>
+      <w:lvlJc w:val="left"/>
+      <w:pPr>
+        <w:tabs>
+          <w:tab w:val="num" w:pos="1440"/>
+        </w:tabs>
+        <w:ind w:left="1440" w:hanging="360"/>
+      </w:pPr>
+      <w:rPr>
+        <w:rFonts w:ascii="Courier New" w:hAnsi="Courier New" w:hint="default"/>
+        <w:sz w:val="20"/>
+      </w:rPr>
+    </w:lvl>
+    <w:lvl w:ilvl="2" w:tentative="1">
+      <w:start w:val="1"/>
+      <w:numFmt w:val="bullet"/>
+      <w:lvlText w:val=""/>
+      <w:lvlJc w:val="left"/>
+      <w:pPr>
+        <w:tabs>
+          <w:tab w:val="num" w:pos="2160"/>
+        </w:tabs>
+        <w:ind w:left="2160" w:hanging="360"/>
+      </w:pPr>
+      <w:rPr>
+        <w:rFonts w:ascii="Wingdings" w:hAnsi="Wingdings" w:hint="default"/>
+        <w:sz w:val="20"/>
+      </w:rPr>
+    </w:lvl>
+    <w:lvl w:ilvl="3" w:tentative="1">
+      <w:start w:val="1"/>
+      <w:numFmt w:val="bullet"/>
+      <w:lvlText w:val=""/>
+      <w:lvlJc w:val="left"/>
+      <w:pPr>
+        <w:tabs>
+          <w:tab w:val="num" w:pos="2880"/>
+        </w:tabs>
+        <w:ind w:left="2880" w:hanging="360"/>
+      </w:pPr>
+      <w:rPr>
+        <w:rFonts w:ascii="Wingdings" w:hAnsi="Wingdings" w:hint="default"/>
+        <w:sz w:val="20"/>
+      </w:rPr>
+    </w:lvl>
+    <w:lvl w:ilvl="4" w:tentative="1">
+      <w:start w:val="1"/>
+      <w:numFmt w:val="bullet"/>
+      <w:lvlText w:val=""/>
+      <w:lvlJc w:val="left"/>
+      <w:pPr>
+        <w:tabs>
+          <w:tab w:val="num" w:pos="3600"/>
+        </w:tabs>
+        <w:ind w:left="3600" w:hanging="360"/>
+      </w:pPr>
+      <w:rPr>
+        <w:rFonts w:ascii="Wingdings" w:hAnsi="Wingdings" w:hint="default"/>
+        <w:sz w:val="20"/>
+      </w:rPr>
+    </w:lvl>
+    <w:lvl w:ilvl="5" w:tentative="1">
+      <w:start w:val="1"/>
+      <w:numFmt w:val="bullet"/>
+      <w:lvlText w:val=""/>
+      <w:lvlJc w:val="left"/>
+      <w:pPr>
+        <w:tabs>
+          <w:tab w:val="num" w:pos="4320"/>
+        </w:tabs>
+        <w:ind w:left="4320" w:hanging="360"/>
+      </w:pPr>
+      <w:rPr>
+        <w:rFonts w:ascii="Wingdings" w:hAnsi="Wingdings" w:hint="default"/>
+        <w:sz w:val="20"/>
+      </w:rPr>
+    </w:lvl>
+    <w:lvl w:ilvl="6" w:tentative="1">
+      <w:start w:val="1"/>
+      <w:numFmt w:val="bullet"/>
+      <w:lvlText w:val=""/>
+      <w:lvlJc w:val="left"/>
+      <w:pPr>
+        <w:tabs>
+          <w:tab w:val="num" w:pos="5040"/>
+        </w:tabs>
+        <w:ind w:left="5040" w:hanging="360"/>
+      </w:pPr>
+      <w:rPr>
+        <w:rFonts w:ascii="Wingdings" w:hAnsi="Wingdings" w:hint="default"/>
+        <w:sz w:val="20"/>
+      </w:rPr>
+    </w:lvl>
+    <w:lvl w:ilvl="7" w:tentative="1">
+      <w:start w:val="1"/>
+      <w:numFmt w:val="bullet"/>
+      <w:lvlText w:val=""/>
+      <w:lvlJc w:val="left"/>
+      <w:pPr>
+        <w:tabs>
+          <w:tab w:val="num" w:pos="5760"/>
+        </w:tabs>
+        <w:ind w:left="5760" w:hanging="360"/>
+      </w:pPr>
+      <w:rPr>
+        <w:rFonts w:ascii="Wingdings" w:hAnsi="Wingdings" w:hint="default"/>
+        <w:sz w:val="20"/>
+      </w:rPr>
+    </w:lvl>
+    <w:lvl w:ilvl="8" w:tentative="1">
+      <w:start w:val="1"/>
+      <w:numFmt w:val="bullet"/>
+      <w:lvlText w:val=""/>
+      <w:lvlJc w:val="left"/>
+      <w:pPr>
+        <w:tabs>
+          <w:tab w:val="num" w:pos="6480"/>
+        </w:tabs>
+        <w:ind w:left="6480" w:hanging="360"/>
+      </w:pPr>
+      <w:rPr>
+        <w:rFonts w:ascii="Wingdings" w:hAnsi="Wingdings" w:hint="default"/>
+        <w:sz w:val="20"/>
+      </w:rPr>
+    </w:lvl>
+  </w:abstractNum>
+  <w:abstractNum w:abstractNumId="15" w15:restartNumberingAfterBreak="0">
+    <w:nsid w:val="68A00BC6"/>
+    <w:multiLevelType w:val="multilevel"/>
+    <w:tmpl w:val="BF7EDF04"/>
+    <w:lvl w:ilvl="0">
+      <w:start w:val="1"/>
+      <w:numFmt w:val="bullet"/>
+      <w:lvlText w:val=""/>
+      <w:lvlJc w:val="left"/>
+      <w:pPr>
+        <w:tabs>
+          <w:tab w:val="num" w:pos="720"/>
+        </w:tabs>
+        <w:ind w:left="720" w:hanging="360"/>
+      </w:pPr>
+      <w:rPr>
+        <w:rFonts w:ascii="Symbol" w:hAnsi="Symbol" w:hint="default"/>
+        <w:sz w:val="20"/>
+      </w:rPr>
+    </w:lvl>
+    <w:lvl w:ilvl="1" w:tentative="1">
+      <w:start w:val="1"/>
+      <w:numFmt w:val="bullet"/>
+      <w:lvlText w:val="o"/>
+      <w:lvlJc w:val="left"/>
+      <w:pPr>
+        <w:tabs>
+          <w:tab w:val="num" w:pos="1440"/>
+        </w:tabs>
+        <w:ind w:left="1440" w:hanging="360"/>
+      </w:pPr>
+      <w:rPr>
+        <w:rFonts w:ascii="Courier New" w:hAnsi="Courier New" w:hint="default"/>
+        <w:sz w:val="20"/>
+      </w:rPr>
+    </w:lvl>
+    <w:lvl w:ilvl="2" w:tentative="1">
+      <w:start w:val="1"/>
+      <w:numFmt w:val="bullet"/>
+      <w:lvlText w:val=""/>
+      <w:lvlJc w:val="left"/>
+      <w:pPr>
+        <w:tabs>
+          <w:tab w:val="num" w:pos="2160"/>
+        </w:tabs>
+        <w:ind w:left="2160" w:hanging="360"/>
+      </w:pPr>
+      <w:rPr>
+        <w:rFonts w:ascii="Wingdings" w:hAnsi="Wingdings" w:hint="default"/>
+        <w:sz w:val="20"/>
+      </w:rPr>
+    </w:lvl>
+    <w:lvl w:ilvl="3" w:tentative="1">
+      <w:start w:val="1"/>
+      <w:numFmt w:val="bullet"/>
+      <w:lvlText w:val=""/>
+      <w:lvlJc w:val="left"/>
+      <w:pPr>
+        <w:tabs>
+          <w:tab w:val="num" w:pos="2880"/>
+        </w:tabs>
+        <w:ind w:left="2880" w:hanging="360"/>
+      </w:pPr>
+      <w:rPr>
+        <w:rFonts w:ascii="Wingdings" w:hAnsi="Wingdings" w:hint="default"/>
+        <w:sz w:val="20"/>
+      </w:rPr>
+    </w:lvl>
+    <w:lvl w:ilvl="4" w:tentative="1">
+      <w:start w:val="1"/>
+      <w:numFmt w:val="bullet"/>
+      <w:lvlText w:val=""/>
+      <w:lvlJc w:val="left"/>
+      <w:pPr>
+        <w:tabs>
+          <w:tab w:val="num" w:pos="3600"/>
+        </w:tabs>
+        <w:ind w:left="3600" w:hanging="360"/>
+      </w:pPr>
+      <w:rPr>
+        <w:rFonts w:ascii="Wingdings" w:hAnsi="Wingdings" w:hint="default"/>
+        <w:sz w:val="20"/>
+      </w:rPr>
+    </w:lvl>
+    <w:lvl w:ilvl="5" w:tentative="1">
+      <w:start w:val="1"/>
+      <w:numFmt w:val="bullet"/>
+      <w:lvlText w:val=""/>
+      <w:lvlJc w:val="left"/>
+      <w:pPr>
+        <w:tabs>
+          <w:tab w:val="num" w:pos="4320"/>
+        </w:tabs>
+        <w:ind w:left="4320" w:hanging="360"/>
+      </w:pPr>
+      <w:rPr>
+        <w:rFonts w:ascii="Wingdings" w:hAnsi="Wingdings" w:hint="default"/>
+        <w:sz w:val="20"/>
+      </w:rPr>
+    </w:lvl>
+    <w:lvl w:ilvl="6" w:tentative="1">
+      <w:start w:val="1"/>
+      <w:numFmt w:val="bullet"/>
+      <w:lvlText w:val=""/>
+      <w:lvlJc w:val="left"/>
+      <w:pPr>
+        <w:tabs>
+          <w:tab w:val="num" w:pos="5040"/>
+        </w:tabs>
+        <w:ind w:left="5040" w:hanging="360"/>
+      </w:pPr>
+      <w:rPr>
+        <w:rFonts w:ascii="Wingdings" w:hAnsi="Wingdings" w:hint="default"/>
+        <w:sz w:val="20"/>
+      </w:rPr>
+    </w:lvl>
+    <w:lvl w:ilvl="7" w:tentative="1">
+      <w:start w:val="1"/>
+      <w:numFmt w:val="bullet"/>
+      <w:lvlText w:val=""/>
+      <w:lvlJc w:val="left"/>
+      <w:pPr>
+        <w:tabs>
+          <w:tab w:val="num" w:pos="5760"/>
+        </w:tabs>
+        <w:ind w:left="5760" w:hanging="360"/>
+      </w:pPr>
+      <w:rPr>
+        <w:rFonts w:ascii="Wingdings" w:hAnsi="Wingdings" w:hint="default"/>
+        <w:sz w:val="20"/>
+      </w:rPr>
+    </w:lvl>
+    <w:lvl w:ilvl="8" w:tentative="1">
+      <w:start w:val="1"/>
+      <w:numFmt w:val="bullet"/>
+      <w:lvlText w:val=""/>
+      <w:lvlJc w:val="left"/>
+      <w:pPr>
+        <w:tabs>
+          <w:tab w:val="num" w:pos="6480"/>
+        </w:tabs>
+        <w:ind w:left="6480" w:hanging="360"/>
+      </w:pPr>
+      <w:rPr>
+        <w:rFonts w:ascii="Wingdings" w:hAnsi="Wingdings" w:hint="default"/>
+        <w:sz w:val="20"/>
+      </w:rPr>
+    </w:lvl>
+  </w:abstractNum>
+  <w:abstractNum w:abstractNumId="16" w15:restartNumberingAfterBreak="0">
+    <w:nsid w:val="69C506C7"/>
+    <w:multiLevelType w:val="multilevel"/>
+    <w:tmpl w:val="3D3E00E4"/>
+    <w:lvl w:ilvl="0">
+      <w:start w:val="1"/>
+      <w:numFmt w:val="decimal"/>
+      <w:lvlText w:val="%1."/>
+      <w:lvlJc w:val="left"/>
+      <w:pPr>
+        <w:tabs>
+          <w:tab w:val="num" w:pos="720"/>
+        </w:tabs>
+        <w:ind w:left="720" w:hanging="360"/>
+      </w:pPr>
+    </w:lvl>
+    <w:lvl w:ilvl="1" w:tentative="1">
+      <w:start w:val="1"/>
+      <w:numFmt w:val="decimal"/>
+      <w:lvlText w:val="%2."/>
+      <w:lvlJc w:val="left"/>
+      <w:pPr>
+        <w:tabs>
+          <w:tab w:val="num" w:pos="1440"/>
+        </w:tabs>
+        <w:ind w:left="1440" w:hanging="360"/>
+      </w:pPr>
+    </w:lvl>
+    <w:lvl w:ilvl="2" w:tentative="1">
+      <w:start w:val="1"/>
+      <w:numFmt w:val="decimal"/>
+      <w:lvlText w:val="%3."/>
+      <w:lvlJc w:val="left"/>
+      <w:pPr>
+        <w:tabs>
+          <w:tab w:val="num" w:pos="2160"/>
+        </w:tabs>
+        <w:ind w:left="2160" w:hanging="360"/>
+      </w:pPr>
+    </w:lvl>
+    <w:lvl w:ilvl="3" w:tentative="1">
+      <w:start w:val="1"/>
+      <w:numFmt w:val="decimal"/>
+      <w:lvlText w:val="%4."/>
+      <w:lvlJc w:val="left"/>
+      <w:pPr>
+        <w:tabs>
+          <w:tab w:val="num" w:pos="2880"/>
+        </w:tabs>
+        <w:ind w:left="2880" w:hanging="360"/>
+      </w:pPr>
+    </w:lvl>
+    <w:lvl w:ilvl="4" w:tentative="1">
+      <w:start w:val="1"/>
+      <w:numFmt w:val="decimal"/>
+      <w:lvlText w:val="%5."/>
+      <w:lvlJc w:val="left"/>
+      <w:pPr>
+        <w:tabs>
+          <w:tab w:val="num" w:pos="3600"/>
+        </w:tabs>
+        <w:ind w:left="3600" w:hanging="360"/>
+      </w:pPr>
+    </w:lvl>
+    <w:lvl w:ilvl="5" w:tentative="1">
+      <w:start w:val="1"/>
+      <w:numFmt w:val="decimal"/>
+      <w:lvlText w:val="%6."/>
+      <w:lvlJc w:val="left"/>
+      <w:pPr>
+        <w:tabs>
+          <w:tab w:val="num" w:pos="4320"/>
+        </w:tabs>
+        <w:ind w:left="4320" w:hanging="360"/>
+      </w:pPr>
+    </w:lvl>
+    <w:lvl w:ilvl="6" w:tentative="1">
+      <w:start w:val="1"/>
+      <w:numFmt w:val="decimal"/>
+      <w:lvlText w:val="%7."/>
+      <w:lvlJc w:val="left"/>
+      <w:pPr>
+        <w:tabs>
+          <w:tab w:val="num" w:pos="5040"/>
+        </w:tabs>
+        <w:ind w:left="5040" w:hanging="360"/>
+      </w:pPr>
+    </w:lvl>
+    <w:lvl w:ilvl="7" w:tentative="1">
+      <w:start w:val="1"/>
+      <w:numFmt w:val="decimal"/>
+      <w:lvlText w:val="%8."/>
+      <w:lvlJc w:val="left"/>
+      <w:pPr>
+        <w:tabs>
+          <w:tab w:val="num" w:pos="5760"/>
+        </w:tabs>
+        <w:ind w:left="5760" w:hanging="360"/>
+      </w:pPr>
+    </w:lvl>
+    <w:lvl w:ilvl="8" w:tentative="1">
+      <w:start w:val="1"/>
+      <w:numFmt w:val="decimal"/>
+      <w:lvlText w:val="%9."/>
+      <w:lvlJc w:val="left"/>
+      <w:pPr>
+        <w:tabs>
+          <w:tab w:val="num" w:pos="6480"/>
+        </w:tabs>
+        <w:ind w:left="6480" w:hanging="360"/>
+      </w:pPr>
+    </w:lvl>
+  </w:abstractNum>
+  <w:abstractNum w:abstractNumId="17" w15:restartNumberingAfterBreak="0">
+    <w:nsid w:val="6AFA5416"/>
+    <w:multiLevelType w:val="multilevel"/>
+    <w:tmpl w:val="2ED29C64"/>
+    <w:lvl w:ilvl="0">
+      <w:start w:val="1"/>
+      <w:numFmt w:val="bullet"/>
+      <w:lvlText w:val=""/>
+      <w:lvlJc w:val="left"/>
+      <w:pPr>
+        <w:tabs>
+          <w:tab w:val="num" w:pos="720"/>
+        </w:tabs>
+        <w:ind w:left="720" w:hanging="360"/>
+      </w:pPr>
+      <w:rPr>
+        <w:rFonts w:ascii="Symbol" w:hAnsi="Symbol" w:hint="default"/>
+        <w:sz w:val="20"/>
+      </w:rPr>
+    </w:lvl>
+    <w:lvl w:ilvl="1" w:tentative="1">
+      <w:start w:val="1"/>
+      <w:numFmt w:val="bullet"/>
+      <w:lvlText w:val="o"/>
+      <w:lvlJc w:val="left"/>
+      <w:pPr>
+        <w:tabs>
+          <w:tab w:val="num" w:pos="1440"/>
+        </w:tabs>
+        <w:ind w:left="1440" w:hanging="360"/>
+      </w:pPr>
+      <w:rPr>
+        <w:rFonts w:ascii="Courier New" w:hAnsi="Courier New" w:hint="default"/>
+        <w:sz w:val="20"/>
+      </w:rPr>
+    </w:lvl>
+    <w:lvl w:ilvl="2" w:tentative="1">
+      <w:start w:val="1"/>
+      <w:numFmt w:val="bullet"/>
+      <w:lvlText w:val=""/>
+      <w:lvlJc w:val="left"/>
+      <w:pPr>
+        <w:tabs>
+          <w:tab w:val="num" w:pos="2160"/>
+        </w:tabs>
+        <w:ind w:left="2160" w:hanging="360"/>
+      </w:pPr>
+      <w:rPr>
+        <w:rFonts w:ascii="Wingdings" w:hAnsi="Wingdings" w:hint="default"/>
+        <w:sz w:val="20"/>
+      </w:rPr>
+    </w:lvl>
+    <w:lvl w:ilvl="3" w:tentative="1">
+      <w:start w:val="1"/>
+      <w:numFmt w:val="bullet"/>
+      <w:lvlText w:val=""/>
+      <w:lvlJc w:val="left"/>
+      <w:pPr>
+        <w:tabs>
+          <w:tab w:val="num" w:pos="2880"/>
+        </w:tabs>
+        <w:ind w:left="2880" w:hanging="360"/>
+      </w:pPr>
+      <w:rPr>
+        <w:rFonts w:ascii="Wingdings" w:hAnsi="Wingdings" w:hint="default"/>
+        <w:sz w:val="20"/>
+      </w:rPr>
+    </w:lvl>
+    <w:lvl w:ilvl="4" w:tentative="1">
+      <w:start w:val="1"/>
+      <w:numFmt w:val="bullet"/>
+      <w:lvlText w:val=""/>
+      <w:lvlJc w:val="left"/>
+      <w:pPr>
+        <w:tabs>
+          <w:tab w:val="num" w:pos="3600"/>
+        </w:tabs>
+        <w:ind w:left="3600" w:hanging="360"/>
+      </w:pPr>
+      <w:rPr>
+        <w:rFonts w:ascii="Wingdings" w:hAnsi="Wingdings" w:hint="default"/>
+        <w:sz w:val="20"/>
+      </w:rPr>
+    </w:lvl>
+    <w:lvl w:ilvl="5" w:tentative="1">
+      <w:start w:val="1"/>
+      <w:numFmt w:val="bullet"/>
+      <w:lvlText w:val=""/>
+      <w:lvlJc w:val="left"/>
+      <w:pPr>
+        <w:tabs>
+          <w:tab w:val="num" w:pos="4320"/>
+        </w:tabs>
+        <w:ind w:left="4320" w:hanging="360"/>
+      </w:pPr>
+      <w:rPr>
+        <w:rFonts w:ascii="Wingdings" w:hAnsi="Wingdings" w:hint="default"/>
+        <w:sz w:val="20"/>
+      </w:rPr>
+    </w:lvl>
+    <w:lvl w:ilvl="6" w:tentative="1">
+      <w:start w:val="1"/>
+      <w:numFmt w:val="bullet"/>
+      <w:lvlText w:val=""/>
+      <w:lvlJc w:val="left"/>
+      <w:pPr>
+        <w:tabs>
+          <w:tab w:val="num" w:pos="5040"/>
+        </w:tabs>
+        <w:ind w:left="5040" w:hanging="360"/>
+      </w:pPr>
+      <w:rPr>
+        <w:rFonts w:ascii="Wingdings" w:hAnsi="Wingdings" w:hint="default"/>
+        <w:sz w:val="20"/>
+      </w:rPr>
+    </w:lvl>
+    <w:lvl w:ilvl="7" w:tentative="1">
+      <w:start w:val="1"/>
+      <w:numFmt w:val="bullet"/>
+      <w:lvlText w:val=""/>
+      <w:lvlJc w:val="left"/>
+      <w:pPr>
+        <w:tabs>
+          <w:tab w:val="num" w:pos="5760"/>
+        </w:tabs>
+        <w:ind w:left="5760" w:hanging="360"/>
+      </w:pPr>
+      <w:rPr>
+        <w:rFonts w:ascii="Wingdings" w:hAnsi="Wingdings" w:hint="default"/>
+        <w:sz w:val="20"/>
+      </w:rPr>
+    </w:lvl>
+    <w:lvl w:ilvl="8" w:tentative="1">
+      <w:start w:val="1"/>
+      <w:numFmt w:val="bullet"/>
+      <w:lvlText w:val=""/>
+      <w:lvlJc w:val="left"/>
+      <w:pPr>
+        <w:tabs>
+          <w:tab w:val="num" w:pos="6480"/>
+        </w:tabs>
+        <w:ind w:left="6480" w:hanging="360"/>
+      </w:pPr>
+      <w:rPr>
+        <w:rFonts w:ascii="Wingdings" w:hAnsi="Wingdings" w:hint="default"/>
+        <w:sz w:val="20"/>
+      </w:rPr>
+    </w:lvl>
+  </w:abstractNum>
+  <w:abstractNum w:abstractNumId="18" w15:restartNumberingAfterBreak="0">
+    <w:nsid w:val="6F9D2791"/>
+    <w:multiLevelType w:val="multilevel"/>
+    <w:tmpl w:val="6324E8B8"/>
+    <w:lvl w:ilvl="0">
+      <w:start w:val="1"/>
+      <w:numFmt w:val="decimal"/>
+      <w:lvlText w:val="%1."/>
+      <w:lvlJc w:val="left"/>
+      <w:pPr>
+        <w:tabs>
+          <w:tab w:val="num" w:pos="720"/>
+        </w:tabs>
+        <w:ind w:left="720" w:hanging="360"/>
+      </w:pPr>
+    </w:lvl>
+    <w:lvl w:ilvl="1" w:tentative="1">
+      <w:start w:val="1"/>
+      <w:numFmt w:val="decimal"/>
+      <w:lvlText w:val="%2."/>
+      <w:lvlJc w:val="left"/>
+      <w:pPr>
+        <w:tabs>
+          <w:tab w:val="num" w:pos="1440"/>
+        </w:tabs>
+        <w:ind w:left="1440" w:hanging="360"/>
+      </w:pPr>
+    </w:lvl>
+    <w:lvl w:ilvl="2" w:tentative="1">
+      <w:start w:val="1"/>
+      <w:numFmt w:val="decimal"/>
+      <w:lvlText w:val="%3."/>
+      <w:lvlJc w:val="left"/>
+      <w:pPr>
+        <w:tabs>
+          <w:tab w:val="num" w:pos="2160"/>
+        </w:tabs>
+        <w:ind w:left="2160" w:hanging="360"/>
+      </w:pPr>
+    </w:lvl>
+    <w:lvl w:ilvl="3" w:tentative="1">
+      <w:start w:val="1"/>
+      <w:numFmt w:val="decimal"/>
+      <w:lvlText w:val="%4."/>
+      <w:lvlJc w:val="left"/>
+      <w:pPr>
+        <w:tabs>
+          <w:tab w:val="num" w:pos="2880"/>
+        </w:tabs>
+        <w:ind w:left="2880" w:hanging="360"/>
+      </w:pPr>
+    </w:lvl>
+    <w:lvl w:ilvl="4" w:tentative="1">
+      <w:start w:val="1"/>
+      <w:numFmt w:val="decimal"/>
+      <w:lvlText w:val="%5."/>
+      <w:lvlJc w:val="left"/>
+      <w:pPr>
+        <w:tabs>
+          <w:tab w:val="num" w:pos="3600"/>
+        </w:tabs>
+        <w:ind w:left="3600" w:hanging="360"/>
+      </w:pPr>
+    </w:lvl>
+    <w:lvl w:ilvl="5" w:tentative="1">
+      <w:start w:val="1"/>
+      <w:numFmt w:val="decimal"/>
+      <w:lvlText w:val="%6."/>
+      <w:lvlJc w:val="left"/>
+      <w:pPr>
+        <w:tabs>
+          <w:tab w:val="num" w:pos="4320"/>
+        </w:tabs>
+        <w:ind w:left="4320" w:hanging="360"/>
+      </w:pPr>
+    </w:lvl>
+    <w:lvl w:ilvl="6" w:tentative="1">
+      <w:start w:val="1"/>
+      <w:numFmt w:val="decimal"/>
+      <w:lvlText w:val="%7."/>
+      <w:lvlJc w:val="left"/>
+      <w:pPr>
+        <w:tabs>
+          <w:tab w:val="num" w:pos="5040"/>
+        </w:tabs>
+        <w:ind w:left="5040" w:hanging="360"/>
+      </w:pPr>
+    </w:lvl>
+    <w:lvl w:ilvl="7" w:tentative="1">
+      <w:start w:val="1"/>
+      <w:numFmt w:val="decimal"/>
+      <w:lvlText w:val="%8."/>
+      <w:lvlJc w:val="left"/>
+      <w:pPr>
+        <w:tabs>
+          <w:tab w:val="num" w:pos="5760"/>
+        </w:tabs>
+        <w:ind w:left="5760" w:hanging="360"/>
+      </w:pPr>
+    </w:lvl>
+    <w:lvl w:ilvl="8" w:tentative="1">
+      <w:start w:val="1"/>
+      <w:numFmt w:val="decimal"/>
+      <w:lvlText w:val="%9."/>
+      <w:lvlJc w:val="left"/>
+      <w:pPr>
+        <w:tabs>
+          <w:tab w:val="num" w:pos="6480"/>
+        </w:tabs>
+        <w:ind w:left="6480" w:hanging="360"/>
+      </w:pPr>
+    </w:lvl>
+  </w:abstractNum>
+  <w:abstractNum w:abstractNumId="19" w15:restartNumberingAfterBreak="0">
+    <w:nsid w:val="72EE6633"/>
+    <w:multiLevelType w:val="multilevel"/>
+    <w:tmpl w:val="1D72E784"/>
+    <w:lvl w:ilvl="0">
+      <w:start w:val="1"/>
+      <w:numFmt w:val="bullet"/>
+      <w:lvlText w:val=""/>
+      <w:lvlJc w:val="left"/>
+      <w:pPr>
+        <w:tabs>
+          <w:tab w:val="num" w:pos="720"/>
+        </w:tabs>
+        <w:ind w:left="720" w:hanging="360"/>
+      </w:pPr>
+      <w:rPr>
+        <w:rFonts w:ascii="Symbol" w:hAnsi="Symbol" w:hint="default"/>
+        <w:sz w:val="20"/>
+      </w:rPr>
+    </w:lvl>
+    <w:lvl w:ilvl="1" w:tentative="1">
+      <w:start w:val="1"/>
+      <w:numFmt w:val="bullet"/>
+      <w:lvlText w:val="o"/>
+      <w:lvlJc w:val="left"/>
+      <w:pPr>
+        <w:tabs>
+          <w:tab w:val="num" w:pos="1440"/>
+        </w:tabs>
+        <w:ind w:left="1440" w:hanging="360"/>
+      </w:pPr>
+      <w:rPr>
+        <w:rFonts w:ascii="Courier New" w:hAnsi="Courier New" w:hint="default"/>
+        <w:sz w:val="20"/>
+      </w:rPr>
+    </w:lvl>
+    <w:lvl w:ilvl="2" w:tentative="1">
+      <w:start w:val="1"/>
+      <w:numFmt w:val="bullet"/>
+      <w:lvlText w:val=""/>
+      <w:lvlJc w:val="left"/>
+      <w:pPr>
+        <w:tabs>
+          <w:tab w:val="num" w:pos="2160"/>
+        </w:tabs>
+        <w:ind w:left="2160" w:hanging="360"/>
+      </w:pPr>
+      <w:rPr>
+        <w:rFonts w:ascii="Wingdings" w:hAnsi="Wingdings" w:hint="default"/>
+        <w:sz w:val="20"/>
+      </w:rPr>
+    </w:lvl>
+    <w:lvl w:ilvl="3" w:tentative="1">
+      <w:start w:val="1"/>
+      <w:numFmt w:val="bullet"/>
+      <w:lvlText w:val=""/>
+      <w:lvlJc w:val="left"/>
+      <w:pPr>
+        <w:tabs>
+          <w:tab w:val="num" w:pos="2880"/>
+        </w:tabs>
+        <w:ind w:left="2880" w:hanging="360"/>
+      </w:pPr>
+      <w:rPr>
+        <w:rFonts w:ascii="Wingdings" w:hAnsi="Wingdings" w:hint="default"/>
+        <w:sz w:val="20"/>
+      </w:rPr>
+    </w:lvl>
+    <w:lvl w:ilvl="4" w:tentative="1">
+      <w:start w:val="1"/>
+      <w:numFmt w:val="bullet"/>
+      <w:lvlText w:val=""/>
+      <w:lvlJc w:val="left"/>
+      <w:pPr>
+        <w:tabs>
+          <w:tab w:val="num" w:pos="3600"/>
+        </w:tabs>
+        <w:ind w:left="3600" w:hanging="360"/>
+      </w:pPr>
+      <w:rPr>
+        <w:rFonts w:ascii="Wingdings" w:hAnsi="Wingdings" w:hint="default"/>
+        <w:sz w:val="20"/>
+      </w:rPr>
+    </w:lvl>
+    <w:lvl w:ilvl="5" w:tentative="1">
+      <w:start w:val="1"/>
+      <w:numFmt w:val="bullet"/>
+      <w:lvlText w:val=""/>
+      <w:lvlJc w:val="left"/>
+      <w:pPr>
+        <w:tabs>
+          <w:tab w:val="num" w:pos="4320"/>
+        </w:tabs>
+        <w:ind w:left="4320" w:hanging="360"/>
+      </w:pPr>
+      <w:rPr>
+        <w:rFonts w:ascii="Wingdings" w:hAnsi="Wingdings" w:hint="default"/>
+        <w:sz w:val="20"/>
+      </w:rPr>
+    </w:lvl>
+    <w:lvl w:ilvl="6" w:tentative="1">
+      <w:start w:val="1"/>
+      <w:numFmt w:val="bullet"/>
+      <w:lvlText w:val=""/>
+      <w:lvlJc w:val="left"/>
+      <w:pPr>
+        <w:tabs>
+          <w:tab w:val="num" w:pos="5040"/>
+        </w:tabs>
+        <w:ind w:left="5040" w:hanging="360"/>
+      </w:pPr>
+      <w:rPr>
+        <w:rFonts w:ascii="Wingdings" w:hAnsi="Wingdings" w:hint="default"/>
+        <w:sz w:val="20"/>
+      </w:rPr>
+    </w:lvl>
+    <w:lvl w:ilvl="7" w:tentative="1">
+      <w:start w:val="1"/>
+      <w:numFmt w:val="bullet"/>
+      <w:lvlText w:val=""/>
+      <w:lvlJc w:val="left"/>
+      <w:pPr>
+        <w:tabs>
+          <w:tab w:val="num" w:pos="5760"/>
+        </w:tabs>
+        <w:ind w:left="5760" w:hanging="360"/>
+      </w:pPr>
+      <w:rPr>
+        <w:rFonts w:ascii="Wingdings" w:hAnsi="Wingdings" w:hint="default"/>
+        <w:sz w:val="20"/>
+      </w:rPr>
+    </w:lvl>
+    <w:lvl w:ilvl="8" w:tentative="1">
+      <w:start w:val="1"/>
+      <w:numFmt w:val="bullet"/>
+      <w:lvlText w:val=""/>
+      <w:lvlJc w:val="left"/>
+      <w:pPr>
+        <w:tabs>
+          <w:tab w:val="num" w:pos="6480"/>
+        </w:tabs>
+        <w:ind w:left="6480" w:hanging="360"/>
+      </w:pPr>
+      <w:rPr>
+        <w:rFonts w:ascii="Wingdings" w:hAnsi="Wingdings" w:hint="default"/>
+        <w:sz w:val="20"/>
+      </w:rPr>
+    </w:lvl>
+  </w:abstractNum>
   <w:num w:numId="1" w16cid:durableId="1669360938">
+    <w:abstractNumId w:val="1"/>
+  </w:num>
+  <w:num w:numId="2" w16cid:durableId="1694380023">
+    <w:abstractNumId w:val="6"/>
+  </w:num>
+  <w:num w:numId="3" w16cid:durableId="1269243214">
+    <w:abstractNumId w:val="7"/>
+  </w:num>
+  <w:num w:numId="4" w16cid:durableId="106774834">
+    <w:abstractNumId w:val="10"/>
+  </w:num>
+  <w:num w:numId="5" w16cid:durableId="629095989">
+    <w:abstractNumId w:val="15"/>
+  </w:num>
+  <w:num w:numId="6" w16cid:durableId="1402943171">
+    <w:abstractNumId w:val="8"/>
+  </w:num>
+  <w:num w:numId="7" w16cid:durableId="1374496015">
     <w:abstractNumId w:val="0"/>
   </w:num>
-  <w:num w:numId="2" w16cid:durableId="1694380023">
-    <w:abstractNumId w:val="1"/>
+  <w:num w:numId="8" w16cid:durableId="1460341414">
+    <w:abstractNumId w:val="13"/>
   </w:num>
-  <w:num w:numId="3" w16cid:durableId="1269243214">
+  <w:num w:numId="9" w16cid:durableId="497619354">
+    <w:abstractNumId w:val="3"/>
+  </w:num>
+  <w:num w:numId="10" w16cid:durableId="199973752">
+    <w:abstractNumId w:val="17"/>
+  </w:num>
+  <w:num w:numId="11" w16cid:durableId="459079738">
+    <w:abstractNumId w:val="12"/>
+  </w:num>
+  <w:num w:numId="12" w16cid:durableId="1870754772">
+    <w:abstractNumId w:val="14"/>
+  </w:num>
+  <w:num w:numId="13" w16cid:durableId="919096570">
+    <w:abstractNumId w:val="16"/>
+  </w:num>
+  <w:num w:numId="14" w16cid:durableId="262226505">
+    <w:abstractNumId w:val="9"/>
+  </w:num>
+  <w:num w:numId="15" w16cid:durableId="831140989">
+    <w:abstractNumId w:val="18"/>
+  </w:num>
+  <w:num w:numId="16" w16cid:durableId="1057432735">
+    <w:abstractNumId w:val="11"/>
+  </w:num>
+  <w:num w:numId="17" w16cid:durableId="2054377188">
     <w:abstractNumId w:val="2"/>
+  </w:num>
+  <w:num w:numId="18" w16cid:durableId="1049306345">
+    <w:abstractNumId w:val="5"/>
+  </w:num>
+  <w:num w:numId="19" w16cid:durableId="308247689">
+    <w:abstractNumId w:val="4"/>
+  </w:num>
+  <w:num w:numId="20" w16cid:durableId="941105642">
+    <w:abstractNumId w:val="19"/>
   </w:num>
 </w:numbering>
 </file>
@@ -1831,6 +5704,73 @@
       <w:spacing w:val="5"/>
     </w:rPr>
   </w:style>
+  <w:style w:type="character" w:styleId="Hyperlink">
+    <w:name w:val="Hyperlink"/>
+    <w:basedOn w:val="DefaultParagraphFont"/>
+    <w:uiPriority w:val="99"/>
+    <w:unhideWhenUsed/>
+    <w:rsid w:val="00221911"/>
+    <w:rPr>
+      <w:color w:val="467886" w:themeColor="hyperlink"/>
+      <w:u w:val="single"/>
+    </w:rPr>
+  </w:style>
+  <w:style w:type="character" w:styleId="UnresolvedMention">
+    <w:name w:val="Unresolved Mention"/>
+    <w:basedOn w:val="DefaultParagraphFont"/>
+    <w:uiPriority w:val="99"/>
+    <w:semiHidden/>
+    <w:unhideWhenUsed/>
+    <w:rsid w:val="00221911"/>
+    <w:rPr>
+      <w:color w:val="605E5C"/>
+      <w:shd w:val="clear" w:color="auto" w:fill="E1DFDD"/>
+    </w:rPr>
+  </w:style>
+  <w:style w:type="paragraph" w:styleId="Header">
+    <w:name w:val="header"/>
+    <w:basedOn w:val="Normal"/>
+    <w:link w:val="HeaderChar"/>
+    <w:uiPriority w:val="99"/>
+    <w:unhideWhenUsed/>
+    <w:rsid w:val="00086694"/>
+    <w:pPr>
+      <w:tabs>
+        <w:tab w:val="center" w:pos="4680"/>
+        <w:tab w:val="right" w:pos="9360"/>
+      </w:tabs>
+      <w:spacing w:after="0" w:line="240" w:lineRule="auto"/>
+    </w:pPr>
+  </w:style>
+  <w:style w:type="character" w:customStyle="1" w:styleId="HeaderChar">
+    <w:name w:val="Header Char"/>
+    <w:basedOn w:val="DefaultParagraphFont"/>
+    <w:link w:val="Header"/>
+    <w:uiPriority w:val="99"/>
+    <w:rsid w:val="00086694"/>
+  </w:style>
+  <w:style w:type="paragraph" w:styleId="Footer">
+    <w:name w:val="footer"/>
+    <w:basedOn w:val="Normal"/>
+    <w:link w:val="FooterChar"/>
+    <w:uiPriority w:val="99"/>
+    <w:unhideWhenUsed/>
+    <w:rsid w:val="00086694"/>
+    <w:pPr>
+      <w:tabs>
+        <w:tab w:val="center" w:pos="4680"/>
+        <w:tab w:val="right" w:pos="9360"/>
+      </w:tabs>
+      <w:spacing w:after="0" w:line="240" w:lineRule="auto"/>
+    </w:pPr>
+  </w:style>
+  <w:style w:type="character" w:customStyle="1" w:styleId="FooterChar">
+    <w:name w:val="Footer Char"/>
+    <w:basedOn w:val="DefaultParagraphFont"/>
+    <w:link w:val="Footer"/>
+    <w:uiPriority w:val="99"/>
+    <w:rsid w:val="00086694"/>
+  </w:style>
 </w:styles>
 </file>
 

</xml_diff>